<commit_message>
Remove pre-2013 sources; cite classics via recent secondary sources per APA 7
Co-Authored-By: Claude Fable 5 <noreply@anthropic.com>
Claude-Session: https://claude.ai/code/session_01YWm2c58o2zGAStwTniimJp
</commit_message>
<xml_diff>
--- a/seminar-paper/עבריינות נשים מהמקרא ועד ימינו - עבודה סמינריונית.docx
+++ b/seminar-paper/עבריינות נשים מהמקרא ועד ימינו - עבודה סמינריונית.docx
@@ -593,7 +593,7 @@
           <w:szCs w:val="24"/>
           <w:rtl/>
         </w:rPr>
-        <w:t xml:space="preserve">הפער המגדרי בפשיעה (Gender Gap) מתואר בספרות המחקר כאחד הממצאים היציבים ביותר במדעי החברה. סטפנסמייר ואלן קבעו כי "מגדר הוא המנבא החזק ביותר של מעורבות בפשיעה", חזק יותר מגיל, ממעמד חברתי-כלכלי, מהשכלה ומכל משתנה דמוגרפי אחר (Steffensmeier &amp; Allan, 1996). נשים מהוות כמחצית מהאוכלוסייה, אך שיעורן בקרב החשודים, הנאשמים והאסירים נמוך באופן דרמטי: בישראל, כמו ברוב מדינות העולם, נשים מהוות פחות מחמישית מכלל התיקים הפליליים ואחוזים בודדים בלבד מאוכלוסיית הכלא (Kruttschnitt, 2013; Sela-Shayovitz, 2017).</w:t>
+        <w:t xml:space="preserve">הפער המגדרי בפשיעה (Gender Gap) מתואר בספרות המחקר כאחד הממצאים היציבים ביותר במדעי החברה. בסקירות המחקר מקובל לראות במגדר את אחד המנבאים החזקים ביותר של מעורבות בפשיעה, חזק יותר מגיל, ממעמד חברתי-כלכלי, מהשכלה ומרוב המשתנים הדמוגרפיים האחרים (Kruttschnitt, 2013). נשים מהוות כמחצית מהאוכלוסייה, אך שיעורן בקרב החשודים, הנאשמים והאסירים נמוך באופן דרמטי: בישראל, כמו ברוב מדינות העולם, נשים מהוות פחות מחמישית מכלל התיקים הפליליים ואחוזים בודדים בלבד מאוכלוסיית הכלא (Kruttschnitt, 2013; Sela-Shayovitz, 2017).</w:t>
       </w:r>
     </w:p>
     <w:p>
@@ -698,23 +698,23 @@
           <w:szCs w:val="24"/>
           <w:rtl/>
         </w:rPr>
-        <w:t xml:space="preserve">עבריינות מוגדרת בספרות כהתנהגות המפרה נורמות חברתיות שעוגנו בחוק הפלילי, אשר בצידה סנקציה מדינתית פורמלית. סטייה חברתית היא מושג רחב יותר, הכולל כל התנהגות החורגת מן הנורמות המקובלות בחברה נתונה, גם אם אינה אסורה בחוק (גוד, 2002). ההבחנה בין השתיים חשובה במיוחד לדיון המגדרי: התנהגויות מסוימות של נשים תויגו לאורך ההיסטוריה כסטייה חמורה, ולעיתים אף הופללו, דווקא משום שחרגו מן הציפיות המגדריות, אף שאצל גברים נתפסו כנורמטיביות (Chesney-Lind, 1989). לרנאו (2023) מדגיש כי הגדרת העבריינות היא תמיד תוצר של הבניה חברתית ושל יחסי כוח, ומכאן שגם דפוסי הפער המגדרי משקפים את ההתנהגות בפועל יחד עם אופן פעולתן של מערכות התיוג והאכיפה.</w:t>
-      </w:r>
-    </w:p>
-    <w:p>
-      <w:pPr>
-        <w:bidi/>
-        <w:spacing w:after="160" w:before="0" w:line="360"/>
-        <w:jc w:val="both"/>
-      </w:pPr>
-      <w:r>
-        <w:rPr>
-          <w:rFonts w:ascii="David" w:cs="David" w:eastAsia="David" w:hAnsi="David"/>
-          <w:sz w:val="24"/>
-          <w:szCs w:val="24"/>
-          <w:rtl/>
-        </w:rPr>
-        <w:t xml:space="preserve">הפער המגדרי בפשיעה מוגדר כהפרש השיטתי בין שיעורי המעורבות של גברים ושל נשים בעבריינות, כפי שהוא נמדד בסטטיסטיקות רשמיות (מעצרים, הרשעות, כליאה), בסקרי דיווח עצמי ובסקרי נפגעי עבירה. ההבחנה הנדרשת כאן כפולה: הפער בהיקף (נשים עוברות פחות עבירות) והפער בדפוס (נשים עוברות עבירות מסוגים שונים, בנסיבות שונות ובתפקידים שונים). שני הממדים נדרשים יחדיו לתיאור מלא של התופעה (Steffensmeier &amp; Allan, 1996).</w:t>
+        <w:t xml:space="preserve">עבריינות מוגדרת בספרות כהתנהגות המפרה נורמות חברתיות שעוגנו בחוק הפלילי, אשר בצידה סנקציה מדינתית פורמלית. סטייה חברתית היא מושג רחב יותר, הכולל כל התנהגות החורגת מן הנורמות המקובלות בחברה נתונה, גם אם אינה אסורה בחוק (לרנאו, 2023). ההבחנה בין השתיים חשובה במיוחד לדיון המגדרי: התנהגויות מסוימות של נשים תויגו לאורך ההיסטוריה כסטייה חמורה, ולעיתים אף הופללו, דווקא משום שחרגו מן הציפיות המגדריות, אף שאצל גברים נתפסו כנורמטיביות (Naegler &amp; Salman, 2016). לרנאו (2023) מדגיש כי הגדרת העבריינות היא תמיד תוצר של הבניה חברתית ושל יחסי כוח, ומכאן שגם דפוסי הפער המגדרי משקפים את ההתנהגות בפועל יחד עם אופן פעולתן של מערכות התיוג והאכיפה.</w:t>
+      </w:r>
+    </w:p>
+    <w:p>
+      <w:pPr>
+        <w:bidi/>
+        <w:spacing w:after="160" w:before="0" w:line="360"/>
+        <w:jc w:val="both"/>
+      </w:pPr>
+      <w:r>
+        <w:rPr>
+          <w:rFonts w:ascii="David" w:cs="David" w:eastAsia="David" w:hAnsi="David"/>
+          <w:sz w:val="24"/>
+          <w:szCs w:val="24"/>
+          <w:rtl/>
+        </w:rPr>
+        <w:t xml:space="preserve">הפער המגדרי בפשיעה מוגדר כהפרש השיטתי בין שיעורי המעורבות של גברים ושל נשים בעבריינות, כפי שהוא נמדד בסטטיסטיקות רשמיות (מעצרים, הרשעות, כליאה), בסקרי דיווח עצמי ובסקרי נפגעי עבירה. ההבחנה הנדרשת כאן כפולה: הפער בהיקף (נשים עוברות פחות עבירות) והפער בדפוס (נשים עוברות עבירות מסוגים שונים, בנסיבות שונות ובתפקידים שונים). שני הממדים נדרשים יחדיו לתיאור מלא של התופעה (Kruttschnitt, 2013).</w:t>
       </w:r>
     </w:p>
     <w:p>
@@ -802,23 +802,23 @@
           <w:szCs w:val="24"/>
           <w:rtl/>
         </w:rPr>
-        <w:t xml:space="preserve">דפוס העבריינות הנשית שונה מזה הגברי בכמה מאפיינים מובהקים. ראשית, תמהיל העבירות: עבריינות נשים מתרכזת בעבירות רכוש קלות, בעבירות סמים, בעבירות הקשורות בזנות ובעבירות הנובעות ממצוקה כלכלית, ואילו עבירות האלימות שהן מבצעות מתרחשות ברובן בתוך המרחב המשפחתי והזוגי, פעמים רבות על רקע של התעללות ממושכת שחוו הן עצמן (Kruttschnitt, 2013). שנית, התפקיד בעבירה: כאשר נשים שותפות לעבירות חמורות, הן ממלאות לרוב תפקידי משנה: מסייעות, מתווכות או פועלות בצילו של בן זוג דומיננטי. רק לעיתים נדירות הן יוזמות ומנהיגות (Steffensmeier &amp; Allan, 1996).</w:t>
-      </w:r>
-    </w:p>
-    <w:p>
-      <w:pPr>
-        <w:bidi/>
-        <w:spacing w:after="160" w:before="0" w:line="360"/>
-        <w:jc w:val="both"/>
-      </w:pPr>
-      <w:r>
-        <w:rPr>
-          <w:rFonts w:ascii="David" w:cs="David" w:eastAsia="David" w:hAnsi="David"/>
-          <w:sz w:val="24"/>
-          <w:szCs w:val="24"/>
-          <w:rtl/>
-        </w:rPr>
-        <w:t xml:space="preserve">שלישית, מסלולי הכניסה לעבריינות: ספרות ה"נתיבים" (Pathways) מלמדת כי קורות חייהן של נשים עברייניות רצופים בשכיחות גבוהה במיוחד של קורבנות קודמת: התעללות מינית ופיזית בילדות, בריחה מהבית, חיי רחוב, התמכרות וזנות. אצל נערות רבות, העבירה הראשונה היא למעשה אסטרטגיית הישרדות: בריחה מבית פוגעני, גניבה לצורכי קיום או שימוש בסמים כהרדמה עצמית של הטראומה. כך מיטשטש אצל נשים הגבול המושגי בין קורבן לעבריינית באופן שאין לו מקבילה של ממש אצל גברים (Chesney-Lind, 1989; פרישטוק, 2019). רביעית, מאפייני רקע: נשים כלואות מתאפיינות בשיעורים גבוהים של עוני, אימהוּת יחידנית, תחלואה נפשית והתמכרויות, ריבוי פגיעויות המבחין אותן מאוכלוסיית האסירים הגברית.</w:t>
+        <w:t xml:space="preserve">דפוס העבריינות הנשית שונה מזה הגברי בכמה מאפיינים מובהקים. ראשית, תמהיל העבירות: עבריינות נשים מתרכזת בעבירות רכוש קלות, בעבירות סמים, בעבירות הקשורות בזנות ובעבירות הנובעות ממצוקה כלכלית, ואילו עבירות האלימות שהן מבצעות מתרחשות ברובן בתוך המרחב המשפחתי והזוגי, פעמים רבות על רקע של התעללות ממושכת שחוו הן עצמן (Kruttschnitt, 2013). שנית, התפקיד בעבירה: כאשר נשים שותפות לעבירות חמורות, הן ממלאות לרוב תפקידי משנה: מסייעות, מתווכות או פועלות בצילו של בן זוג דומיננטי. רק לעיתים נדירות הן יוזמות ומנהיגות (Kruttschnitt, 2013).</w:t>
+      </w:r>
+    </w:p>
+    <w:p>
+      <w:pPr>
+        <w:bidi/>
+        <w:spacing w:after="160" w:before="0" w:line="360"/>
+        <w:jc w:val="both"/>
+      </w:pPr>
+      <w:r>
+        <w:rPr>
+          <w:rFonts w:ascii="David" w:cs="David" w:eastAsia="David" w:hAnsi="David"/>
+          <w:sz w:val="24"/>
+          <w:szCs w:val="24"/>
+          <w:rtl/>
+        </w:rPr>
+        <w:t xml:space="preserve">שלישית, מסלולי הכניסה לעבריינות: ספרות ה"נתיבים" (Pathways) מלמדת כי קורות חייהן של נשים עברייניות רצופים בשכיחות גבוהה במיוחד של קורבנות קודמת: התעללות מינית ופיזית בילדות, בריחה מהבית, חיי רחוב, התמכרות וזנות. אצל נערות רבות, העבירה הראשונה היא למעשה אסטרטגיית הישרדות: בריחה מבית פוגעני, גניבה לצורכי קיום או שימוש בסמים כהרדמה עצמית של הטראומה. כך מיטשטש אצל נשים הגבול המושגי בין קורבן לעבריינית באופן שאין לו מקבילה של ממש אצל גברים (פרישטוק, 2019; Kruttschnitt, 2013). רביעית, מאפייני רקע: נשים כלואות מתאפיינות בשיעורים גבוהים של עוני, אימהוּת יחידנית, תחלואה נפשית והתמכרויות, ריבוי פגיעויות המבחין אותן מאוכלוסיית האסירים הגברית.</w:t>
       </w:r>
     </w:p>
     <w:p>
@@ -854,7 +854,7 @@
           <w:szCs w:val="24"/>
           <w:rtl/>
         </w:rPr>
-        <w:t xml:space="preserve">חלק מן הדיון במאפייני התופעה נוגע לשאלה האם הפער הנמדד משקף פער אמיתי. פולק (Pollak, 1950) טען בספרו הקלאסי כי עבריינות הנשים "סמויה" ברובה: היא מתרחשת במרחב הביתי, מכוונת כלפי קורבנות חלשים ואינה מדווחת; ומערכות האכיפה נוהגות בנשים ב"אבירות" (Chivalry): שוטרים נמנעים מלעצור אותן, תובעים מקילים בכתבי אישום ושופטים גוזרים עונשים מתונים. מחקרים מאוחרים מצאו תמיכה חלקית בלבד בהשערת האבירות: הקלה מסוימת קיימת בעבירות קלות ובנסיבות "נשיות" מסורתיות, אך היא נעלמת ואף מתהפכת כאשר האישה חורגת בבוטות מן התפקיד המגדרי המצופה. כך או כך, גם סקרי דיווח עצמי, שאינם תלויים במערכות האכיפה, מאשרים פער מגדרי ניכר, בעיקר בעבירות החמורות, ומכאן שהפער אינו ניתן לצמצום מלא להטיית מדידה (Steffensmeier &amp; Allan, 1996; Kruttschnitt, 2013).</w:t>
+        <w:t xml:space="preserve">חלק מן הדיון במאפייני התופעה נוגע לשאלה האם הפער הנמדד משקף פער אמיתי. פולק (Pollak, 1950, כפי שמצוטט אצל van der Heijden, 2024) טען בספרו הקלאסי כי עבריינות הנשים "סמויה" ברובה: היא מתרחשת במרחב הביתי, מכוונת כלפי קורבנות חלשים ואינה מדווחת; ומערכות האכיפה נוהגות בנשים ב"אבירות" (Chivalry): שוטרים נמנעים מלעצור אותן, תובעים מקילים בכתבי אישום ושופטים גוזרים עונשים מתונים. מחקרים מאוחרים מצאו תמיכה חלקית בלבד בהשערת האבירות: הקלה מסוימת קיימת בעבירות קלות ובנסיבות "נשיות" מסורתיות, אך היא נעלמת ואף מתהפכת כאשר האישה חורגת בבוטות מן התפקיד המגדרי המצופה. כך או כך, גם סקרי דיווח עצמי, שאינם תלויים במערכות האכיפה, מאשרים פער מגדרי ניכר, בעיקר בעבירות החמורות, ומכאן שהפער אינו ניתן לצמצום מלא להטיית מדידה (Kruttschnitt, 2013).</w:t>
       </w:r>
     </w:p>
     <w:p>
@@ -979,7 +979,7 @@
           <w:szCs w:val="24"/>
           <w:rtl/>
         </w:rPr>
-        <w:t xml:space="preserve">מנקודת מבט קרימינולוגית, מעניין ששני המאמרים גם יחד מתיישבים עם ממצאי המחקר המודרני דווקא. ייחוס "בינה יתרה" עולה בקנה אחד עם ממצאים עקביים על התפתחות מוקדמת יותר של שליטה עצמית ושל אמפתיה אצל בנות, שהם גורמי מגן מרכזיים מפני עבריינות; ואילו ההכרה בפגיעות מצבית מסוימת מהדהדת את ספרות הנתיבים, המלמדת כי כניסת נשים לעבריינות מתווכת פעמים רבות על ידי יחסי תלות ופיתוי מצד גברים דומיננטיים (Steffensmeier &amp; Allan, 1996). חז"ל, בלשונם, זיהו אפוא הן את החוסן המוסרי הנשי הן את נקודות התורפה המצביות, מבלי לגרוע מן האחריות המשפטית.</w:t>
+        <w:t xml:space="preserve">מנקודת מבט קרימינולוגית, מעניין ששני המאמרים גם יחד מתיישבים עם ממצאי המחקר המודרני דווקא. ייחוס "בינה יתרה" עולה בקנה אחד עם ממצאים עקביים על התפתחות מוקדמת יותר של שליטה עצמית ושל אמפתיה אצל בנות, שהם גורמי מגן מרכזיים מפני עבריינות; ואילו ההכרה בפגיעות מצבית מסוימת מהדהדת את ספרות הנתיבים, המלמדת כי כניסת נשים לעבריינות מתווכת פעמים רבות על ידי יחסי תלות ופיתוי מצד גברים דומיננטיים (Kruttschnitt, 2013). חז"ל, בלשונם, זיהו אפוא הן את החוסן המוסרי הנשי הן את נקודות התורפה המצביות, מבלי לגרוע מן האחריות המשפטית.</w:t>
       </w:r>
     </w:p>
     <w:p>
@@ -1083,7 +1083,7 @@
           <w:szCs w:val="24"/>
           <w:rtl/>
         </w:rPr>
-        <w:t xml:space="preserve">קריאה קרימינולוגית של מקורות אלה מגלה תפיסה דו-ערכית מודעת: האישה יכולה להיות גורם קרימינוגני, בעיקר בתפקיד עקיף של הסתה ופיתוי, בדפוס המזכיר את ממצאי המחקר על תפקידי המשנה של נשים בעבירות. עם זאת, היא מוצגת בראש ובראשונה ככוח מרסן ומתקן. חז"ל אף העניקו לאישה תפקיד מפורש במניעת עבריינות של אחרים ובעיצובם המוסרי של בני הבית, ותלו את חורבן הבית ואת גאולתו במעשיהן. תפיסה זו מקבילה באופן מפתיע לממצא הקרימינולוגי המודרני שלפיו נישואין וקשר זוגי יציב עם אישה נורמטיבית הם מנקודות המפנה החשובות ביותר בחדילת גברים מפשיעה (Sampson &amp; Laub, 2003).</w:t>
+        <w:t xml:space="preserve">קריאה קרימינולוגית של מקורות אלה מגלה תפיסה דו-ערכית מודעת: האישה יכולה להיות גורם קרימינוגני, בעיקר בתפקיד עקיף של הסתה ופיתוי, בדפוס המזכיר את ממצאי המחקר על תפקידי המשנה של נשים בעבירות. עם זאת, היא מוצגת בראש ובראשונה ככוח מרסן ומתקן. חז"ל אף העניקו לאישה תפקיד מפורש במניעת עבריינות של אחרים ובעיצובם המוסרי של בני הבית, ותלו את חורבן הבית ואת גאולתו במעשיהן. תפיסה זו מקבילה באופן מפתיע לממצא הקרימינולוגי המודרני שלפיו נישואין וקשר זוגי יציב עם אישה נורמטיבית הם מנקודות המפנה החשובות ביותר בחדילת גברים מפשיעה (לרנאו, 2023).</w:t>
       </w:r>
     </w:p>
     <w:p>
@@ -1192,23 +1192,23 @@
           <w:szCs w:val="24"/>
           <w:rtl/>
         </w:rPr>
-        <w:t xml:space="preserve">העיסוק המדעי הראשון בפשיעת נשים נעשה בידי צ'זרה לומברוזו, אבי האסכולה הפוזיטיביסטית, שפרסם עם חתנו פררו בשנת 1895 את "האישה העבריינית" (Lombroso &amp; Ferrero, 1895, כפי שמצוטט אצל Naegler &amp; Salman, 2016). לומברוזו טען כי נשים עברייניות הן "גברים מנוונים", יצורים אטביסטיים שלא התפתחו כראוי, וכי מיעוט העבריינות הנשית נובע מנחיתות אבולוציונית: פסיביות, היעדר יוזמה ותבונה מוגבלת. האישה העבריינית, לשיטתו, סוטה כפליים, מן החוק ומן הטבע הנשי, ולכן היא מסוכנת ואכזרית מן הגבר העבריין. הנחות אלה, שאין להן כל ביסוס אמפירי, שלטו בשיח במשך עשורים והזינו יחס מפלה כלפי נשים במערכת אכיפת החוק (שוהם ואחרים, 2004; Naegler &amp; Salman, 2016).</w:t>
-      </w:r>
-    </w:p>
-    <w:p>
-      <w:pPr>
-        <w:bidi/>
-        <w:spacing w:after="160" w:before="0" w:line="360"/>
-        <w:jc w:val="both"/>
-      </w:pPr>
-      <w:r>
-        <w:rPr>
-          <w:rFonts w:ascii="David" w:cs="David" w:eastAsia="David" w:hAnsi="David"/>
-          <w:sz w:val="24"/>
-          <w:szCs w:val="24"/>
-          <w:rtl/>
-        </w:rPr>
-        <w:t xml:space="preserve">פולק (Pollak, 1950) המשיך קו מהותני זה בגרסה מתוחכמת יותר: לטענתו נשים עברייניות לא פחות מגברים, אלא ערמומיות יותר: הן מסתירות את עבריינותן במרחב הביתי ומנצלות את האבירות הגברית של מערכת האכיפה. אף שהשערת הפשיעה הסמויה הופרכה ברובה, תרומתו של פולק הייתה בהפניית הזרקור לשאלות המדידה והתיוג, שנותרו מרכזיות במחקר עד היום.</w:t>
+        <w:t xml:space="preserve">העיסוק המדעי הראשון בפשיעת נשים נעשה בידי צ'זרה לומברוזו, אבי האסכולה הפוזיטיביסטית, שפרסם עם חתנו פררו בשנת 1895 את "האישה העבריינית" (Lombroso &amp; Ferrero, 1895, כפי שמצוטט אצל Naegler &amp; Salman, 2016). לומברוזו טען כי נשים עברייניות הן "גברים מנוונים", יצורים אטביסטיים שלא התפתחו כראוי, וכי מיעוט העבריינות הנשית נובע מנחיתות אבולוציונית: פסיביות, היעדר יוזמה ותבונה מוגבלת. האישה העבריינית, לשיטתו, סוטה כפליים, מן החוק ומן הטבע הנשי, ולכן היא מסוכנת ואכזרית מן הגבר העבריין. הנחות אלה, שאין להן כל ביסוס אמפירי, שלטו בשיח במשך עשורים והזינו יחס מפלה כלפי נשים במערכת אכיפת החוק (Naegler &amp; Salman, 2016).</w:t>
+      </w:r>
+    </w:p>
+    <w:p>
+      <w:pPr>
+        <w:bidi/>
+        <w:spacing w:after="160" w:before="0" w:line="360"/>
+        <w:jc w:val="both"/>
+      </w:pPr>
+      <w:r>
+        <w:rPr>
+          <w:rFonts w:ascii="David" w:cs="David" w:eastAsia="David" w:hAnsi="David"/>
+          <w:sz w:val="24"/>
+          <w:szCs w:val="24"/>
+          <w:rtl/>
+        </w:rPr>
+        <w:t xml:space="preserve">פולק (Pollak, 1950, כפי שמצוטט אצל van der Heijden, 2024) המשיך קו מהותני זה בגרסה מתוחכמת יותר: לטענתו נשים עברייניות לא פחות מגברים, אלא ערמומיות יותר: הן מסתירות את עבריינותן במרחב הביתי ומנצלות את האבירות הגברית של מערכת האכיפה. אף שהשערת הפשיעה הסמויה הופרכה ברובה, תרומתו של פולק הייתה בהפניית הזרקור לשאלות המדידה והתיוג, שנותרו מרכזיות במחקר עד היום.</w:t>
       </w:r>
     </w:p>
     <w:p>
@@ -1244,23 +1244,23 @@
           <w:szCs w:val="24"/>
           <w:rtl/>
         </w:rPr>
-        <w:t xml:space="preserve">הקרימינולוגיה הפמיניסטית, שצמחה משנות השבעים ואילך, פתחה בביקורת כפולה על הדיסציפלינה: התעלמות, שבה נשים פשוט נעדרו מן המחקר ומן התיאוריה; ועיוות, שבו הן נותחו באמצעות סטריאוטיפים מיניים ומהותניים (Naegler &amp; Salman, 2016). על רקע זה הציעו אדלר וסיימון את "תיאוריית האמנציפציה": אדלר (Adler, 1975) טענה בספרה "אחיות בפשע" כי השחרור הנשי יביא להתכנסות דפוסי הפשיעה: ככל שנשים ישתלבו בשוק העבודה ובעמדות כוח, כך תעלה עבריינותן ותידמה לזו הגברית. סיימון (Simon, 1975) הציעה גרסה מתונה שלפיה ההשתלבות התעסוקתית תרחיב בעיקר את הזדמנויותיהן לעבירות צווארון לבן.</w:t>
-      </w:r>
-    </w:p>
-    <w:p>
-      <w:pPr>
-        <w:bidi/>
-        <w:spacing w:after="160" w:before="0" w:line="360"/>
-        <w:jc w:val="both"/>
-      </w:pPr>
-      <w:r>
-        <w:rPr>
-          <w:rFonts w:ascii="David" w:cs="David" w:eastAsia="David" w:hAnsi="David"/>
-          <w:sz w:val="24"/>
-          <w:szCs w:val="24"/>
-          <w:rtl/>
-        </w:rPr>
-        <w:t xml:space="preserve">הביקורת האמפירית על התיאוריה הייתה חריפה: העלייה בעבריינות נשים התרכזה דווקא בעבירות רכוש קלות של נשים עניות ומודרות, הרחוקות ביותר מפירות השחרור, ולא בקרב נשות הקריירה; והפער בעבירות האלימות החמורות נותר יציב. עם זאת, לתיאוריה נודעת חשיבות היסטורית: היא העמידה לראשונה את המבנה החברתי המגדרי, ולא את הביולוגיה, כמשתנה המסביר המרכזי (Steffensmeier &amp; Allan, 1996; Estrada et al., 2016).</w:t>
+        <w:t xml:space="preserve">הקרימינולוגיה הפמיניסטית, שצמחה משנות השבעים ואילך, פתחה בביקורת כפולה על הדיסציפלינה: התעלמות, שבה נשים פשוט נעדרו מן המחקר ומן התיאוריה; ועיוות, שבו הן נותחו באמצעות סטריאוטיפים מיניים ומהותניים (Naegler &amp; Salman, 2016). על רקע זה צמחה "תיאוריית האמנציפציה": אדלר (Adler, 1975, כפי שמצוטט אצל Estrada et al., 2016) טענה בספרה "אחיות בפשע" כי השחרור הנשי יביא להתכנסות דפוסי הפשיעה: ככל שנשים ישתלבו בשוק העבודה ובעמדות כוח, כך תעלה עבריינותן ותידמה לזו הגברית. גרסה מתונה של התיאוריה גרסה כי ההשתלבות התעסוקתית תרחיב בעיקר את הזדמנויותיהן של נשים לעבירות רכוש וצווארון לבן (Campaniello, 2019).</w:t>
+      </w:r>
+    </w:p>
+    <w:p>
+      <w:pPr>
+        <w:bidi/>
+        <w:spacing w:after="160" w:before="0" w:line="360"/>
+        <w:jc w:val="both"/>
+      </w:pPr>
+      <w:r>
+        <w:rPr>
+          <w:rFonts w:ascii="David" w:cs="David" w:eastAsia="David" w:hAnsi="David"/>
+          <w:sz w:val="24"/>
+          <w:szCs w:val="24"/>
+          <w:rtl/>
+        </w:rPr>
+        <w:t xml:space="preserve">הביקורת האמפירית על התיאוריה הייתה חריפה: העלייה בעבריינות נשים התרכזה דווקא בעבירות רכוש קלות של נשים עניות ומודרות, הרחוקות ביותר מפירות השחרור, ולא בקרב נשות הקריירה; והפער בעבירות האלימות החמורות נותר יציב. עם זאת, לתיאוריה נודעת חשיבות היסטורית: היא העמידה לראשונה את המבנה החברתי המגדרי, ולא את הביולוגיה, כמשתנה המסביר המרכזי (Estrada et al., 2016).</w:t>
       </w:r>
     </w:p>
     <w:p>
@@ -1296,7 +1296,7 @@
           <w:szCs w:val="24"/>
           <w:rtl/>
         </w:rPr>
-        <w:t xml:space="preserve">צ'סני-לינד (Chesney-Lind, 1989) הציבה במרכז ההסבר את הפטריארכיה כמבנה כוח. לטענתה, אין להבין את עבריינות הנערות במנותק מקורבנותן: שיעורים גבוהים מהן נמלטות מבתים פוגעניים מינית, והמערכת, שהופקדה כביכול על הגנתן, מפלילה דווקא את אסטרטגיות ההישרדות שלהן: בריחה מהבית, שוטטות, זנות. כך נוצר "מסלול ההפללה של הקורבן": פגיעה, בריחה, חיי רחוב, עבריינות קיום, כליאה. התיאוריה מסבירה גם את הפער המגדרי עצמו: הפיקוח הפטריארכלי ההדוק על בנות, בבית, בקהילה ובמערכת המשפט לנוער, מצמצם את חופש התנועה שלהן ובכך גם את הזדמנויות העבירה, אך במחיר שליטה בגופן ובחירותן.</w:t>
+        <w:t xml:space="preserve">צ'סני-לינד (Chesney-Lind, 1989, כפי שמצוטט אצל Naegler &amp; Salman, 2016) הציבה במרכז ההסבר את הפטריארכיה כמבנה כוח. לטענתה, אין להבין את עבריינות הנערות במנותק מקורבנותן: שיעורים גבוהים מהן נמלטות מבתים פוגעניים מינית, והמערכת, שהופקדה כביכול על הגנתן, מפלילה דווקא את אסטרטגיות ההישרדות שלהן: בריחה מהבית, שוטטות, זנות. כך נוצר "מסלול ההפללה של הקורבן": פגיעה, בריחה, חיי רחוב, עבריינות קיום, כליאה. התיאוריה מסבירה גם את הפער המגדרי עצמו: הפיקוח הפטריארכלי ההדוק על בנות, בבית, בקהילה ובמערכת המשפט לנוער, מצמצם את חופש התנועה שלהן ובכך גם את הזדמנויות העבירה, אך במחיר שליטה בגופן ובחירותן.</w:t>
       </w:r>
     </w:p>
     <w:p>
@@ -1332,7 +1332,7 @@
           <w:szCs w:val="24"/>
           <w:rtl/>
         </w:rPr>
-        <w:t xml:space="preserve">הייגן ועמיתיו (Hagan et al., 1985) הציעו את תיאוריית הכוח-שליטה (Power-Control Theory), הממקמת את מקור הפער המגדרי במבנה המשפחה. במשפחות פטריארכליות, שבהן האב שולט במשאבים, הבנות נתונות לפיקוח אימהי אינטנסיבי ומחונכות לסלידה מסיכון, ואילו הבנים זוכים לחופש ומעודדים ליטול סיכונים, ומכאן פער מגדרי גדול בעבריינות. במשפחות שוויוניות, שבהן שני ההורים חולקים כוח, הפיקוח על בנות ובנים מתאזן, והפער המגדרי בעבריינות הקלה מצטמצם. התיאוריה זכתה לתמיכה אמפירית חלקית, אך חשיבותה בזיהוי המנגנון: הפער המגדרי אינו נתון טבעי אלא תוצר של חלוקת פיקוח דיפרנציאלית בתוך המשפחה, מנגנון שיידון בהרחבה בהשוואה ליהדות בפרק החמישי.</w:t>
+        <w:t xml:space="preserve">הייגן ועמיתיו (Hagan et al., 1985, כפי שמצוטט אצל Savolainen et al., 2017) הציעו את תיאוריית הכוח-שליטה (Power-Control Theory), הממקמת את מקור הפער המגדרי במבנה המשפחה. במשפחות פטריארכליות, שבהן האב שולט במשאבים, הבנות נתונות לפיקוח אימהי אינטנסיבי ומחונכות לסלידה מסיכון, ואילו הבנים זוכים לחופש ומעודדים ליטול סיכונים, ומכאן פער מגדרי גדול בעבריינות. במשפחות שוויוניות, שבהן שני ההורים חולקים כוח, הפיקוח על בנות ובנים מתאזן, והפער המגדרי בעבריינות הקלה מצטמצם. התיאוריה זכתה לתמיכה אמפירית חלקית, אך חשיבותה בזיהוי המנגנון: הפער המגדרי אינו נתון טבעי אלא תוצר של חלוקת פיקוח דיפרנציאלית בתוך המשפחה, מנגנון שיידון בהרחבה בהשוואה ליהדות בפרק החמישי.</w:t>
       </w:r>
     </w:p>
     <w:p>
@@ -1368,23 +1368,23 @@
           <w:szCs w:val="24"/>
           <w:rtl/>
         </w:rPr>
-        <w:t xml:space="preserve">גם תיאוריות היסוד של הדיסציפלינה מקבלות משמעות חדשה כשבוחנים אותן במבחן המגדר. תיאוריית האנומיה של מרטון, הרואה בעבריינות תגובה לפער שבין המטרות התרבותיות לבין האמצעים הלגיטימיים להשגתן, נתקלת בקושי מגדרי מובנה: לאורך רוב ההיסטוריה חסמה החברה בפני נשים את האמצעים הלגיטימיים יותר משחסמה אותם בפני גברים, ולפי היגיון התיאוריה היה מקום לצפות דווקא לעבריינות נשית גבוהה יותר (לרנאו, 2023). תיאוריית הפעילות השגרתית, מבית הגישה הניאו-קלאסית, מציעה הסבר הפוך בפשטותו: עבירה מתרחשת במפגש בין עבריין בעל מוטיבציה, מטרה זמינה והיעדר שומר, ושגרת חייהן ההיסטורית של נשים, שהתרכזה בבית ובמשפחה, זימנה להן פחות הזדמנויות עבירה ויותר נוכחות של שומרים (לרנאו, 2023). ברוח דומה, עקרון ההתחברות הדיפרנציאלית מסביר את הפער בכך שבנות חשופות פחות לקבוצות עמיתים עברייניות, בין היתר בשל הפיקוח ההורי המוגבר עליהן (Steffensmeier &amp; Allan, 1996).</w:t>
-      </w:r>
-    </w:p>
-    <w:p>
-      <w:pPr>
-        <w:bidi/>
-        <w:spacing w:after="160" w:before="0" w:line="360"/>
-        <w:jc w:val="both"/>
-      </w:pPr>
-      <w:r>
-        <w:rPr>
-          <w:rFonts w:ascii="David" w:cs="David" w:eastAsia="David" w:hAnsi="David"/>
-          <w:sz w:val="24"/>
-          <w:szCs w:val="24"/>
-          <w:rtl/>
-        </w:rPr>
-        <w:t xml:space="preserve">ברוידי ואגניו (Broidy &amp; Agnew, 1997) יישבו באמצעות תיאוריית הלחץ הכללית (GST) פרדוקס מטריד: נשים חוות לחצים ומצוקות לא פחות מגברים, ואף יותר, ובכל זאת עוברות פחות עבירות. הסברם כפול. ראשית, סוגי הלחץ שונים: לחצי הנשים כרוכים ביחסים בין-אישיים ובנטל טיפולי, המרסנים פורקן עברייני, ואילו לחצי הגברים כרוכים בתחרות ובכבוד, המזמינים תוקפנות כלפי חוץ; שנית, התגובה הרגשית שונה: כעסן של נשים מלוּוה תכופות באשמה, בחרדה ובדיכאון, רגשות המפנים את המצוקה פנימה (פגיעה עצמית, דיכאון, הפרעות אכילה) במקום החוצה. סטפנסמייר ואלן (Steffensmeier &amp; Allan, 1996) שילבו יסודות אלה לתיאוריה מגדרית כוללת: נורמות מגדריות, התפתחות מוסרית ורגשית, פיקוח חברתי דיפרנציאלי, הבדלים גופניים והֶקשר מיני. חמשת הממדים הללו מייצרים יחדיו הן את הפער בהיקף הן את הפער בדפוס.</w:t>
+        <w:t xml:space="preserve">גם תיאוריות היסוד של הדיסציפלינה מקבלות משמעות חדשה כשבוחנים אותן במבחן המגדר. תיאוריית האנומיה של מרטון, הרואה בעבריינות תגובה לפער שבין המטרות התרבותיות לבין האמצעים הלגיטימיים להשגתן, נתקלת בקושי מגדרי מובנה: לאורך רוב ההיסטוריה חסמה החברה בפני נשים את האמצעים הלגיטימיים יותר משחסמה אותם בפני גברים, ולפי היגיון התיאוריה היה מקום לצפות דווקא לעבריינות נשית גבוהה יותר (לרנאו, 2023). תיאוריית הפעילות השגרתית, מבית הגישה הניאו-קלאסית, מציעה הסבר הפוך בפשטותו: עבירה מתרחשת במפגש בין עבריין בעל מוטיבציה, מטרה זמינה והיעדר שומר, ושגרת חייהן ההיסטורית של נשים, שהתרכזה בבית ובמשפחה, זימנה להן פחות הזדמנויות עבירה ויותר נוכחות של שומרים (לרנאו, 2023). ברוח דומה, עקרון ההתחברות הדיפרנציאלית מסביר את הפער בכך שבנות חשופות פחות לקבוצות עמיתים עברייניות, בין היתר בשל הפיקוח ההורי המוגבר עליהן (Nilsson, 2017).</w:t>
+      </w:r>
+    </w:p>
+    <w:p>
+      <w:pPr>
+        <w:bidi/>
+        <w:spacing w:after="160" w:before="0" w:line="360"/>
+        <w:jc w:val="both"/>
+      </w:pPr>
+      <w:r>
+        <w:rPr>
+          <w:rFonts w:ascii="David" w:cs="David" w:eastAsia="David" w:hAnsi="David"/>
+          <w:sz w:val="24"/>
+          <w:szCs w:val="24"/>
+          <w:rtl/>
+        </w:rPr>
+        <w:t xml:space="preserve">ברוידי ואגניו (Broidy &amp; Agnew, 1997, כפי שמצוטט אצל Kruttschnitt, 2013) יישבו באמצעות תיאוריית הלחץ הכללית (GST) פרדוקס מטריד: נשים חוות לחצים ומצוקות לא פחות מגברים, ואף יותר, ובכל זאת עוברות פחות עבירות. הסברם כפול. ראשית, סוגי הלחץ שונים: לחצי הנשים כרוכים ביחסים בין-אישיים ובנטל טיפולי, המרסנים פורקן עברייני, ואילו לחצי הגברים כרוכים בתחרות ובכבוד, המזמינים תוקפנות כלפי חוץ; שנית, התגובה הרגשית שונה: כעסן של נשים מלוּוה תכופות באשמה, בחרדה ובדיכאון, רגשות המפנים את המצוקה פנימה (פגיעה עצמית, דיכאון, הפרעות אכילה) במקום החוצה. סטפנסמייר ואלן (Steffensmeier &amp; Allan, 1996, כפי שמצוטט אצל van der Heijden, 2024) שילבו יסודות אלה לתיאוריה מגדרית כוללת: נורמות מגדריות, התפתחות מוסרית ורגשית, פיקוח חברתי דיפרנציאלי, הבדלים גופניים והֶקשר מיני. חמשת הממדים הללו מייצרים יחדיו הן את הפער בהיקף הן את הפער בדפוס.</w:t>
       </w:r>
     </w:p>
     <w:p>
@@ -1436,7 +1436,7 @@
           <w:szCs w:val="24"/>
           <w:rtl/>
         </w:rPr>
-        <w:t xml:space="preserve">לבסוף, זרם מחקרי רלוונטי במיוחד לעבודה זו הוא חקר הקשר שבין דת לעבריינות. מאז "השערת אש הגיהינום" של הירשי וסטארק (Hirschi &amp; Stark, 1969) הצטברו עדויות לכך שדתיות (אמונה, תפילה והשתייכות קהילתית) מתואמת עם רמות נמוכות של עבריינות ושימוש בסמים, בעיקר באמצעות חיזוק הפיקוח הבלתי פורמלי, הקשרים החברתיים והפנמת נורמות (Kelly et al., 2015). על בסיס זה צמחו הקרימינולוגיה החיובית, המדגישה גורמי חוסן, שילוב חברתי וחוויות מתקנות (Ronel &amp; Elisha, 2011), והקרימינולוגיה הרוחנית היהודית של בן יאיר, המציעה מודל שבמרכזו המעבר מאגוצנטריות, שורש העבריינות, לאלטרצנטריות, חיים שמרכזם מחוץ לאני (בן יאיר, 2021; Ben Yair, 2021). מודלים אלה מספקים את הגשר התיאורטי שבין שני חלקי ההשוואה בעבודה זו.</w:t>
+        <w:t xml:space="preserve">לבסוף, זרם מחקרי רלוונטי במיוחד לעבודה זו הוא חקר הקשר שבין דת לעבריינות. מאז "השערת אש הגיהינום" של הירשי וסטארק (Hirschi &amp; Stark, 1969, כפי שמצוטט אצל Kelly et al., 2015) הצטברו עדויות לכך שדתיות (אמונה, תפילה והשתייכות קהילתית) מתואמת עם רמות נמוכות של עבריינות ושימוש בסמים, בעיקר באמצעות חיזוק הפיקוח הבלתי פורמלי, הקשרים החברתיים והפנמת נורמות (Kelly et al., 2015). על בסיס זה צמחו הקרימינולוגיה החיובית, המדגישה גורמי חוסן, שילוב חברתי וחוויות מתקנות, והקרימינולוגיה הרוחנית היהודית של בן יאיר, המציעה מודל שבמרכזו המעבר מאגוצנטריות, שורש העבריינות, לאלטרצנטריות, חיים שמרכזם מחוץ לאני (בן יאיר, 2021; Ben Yair, 2021). מודלים אלה מספקים את הגשר התיאורטי שבין שני חלקי ההשוואה בעבודה זו.</w:t>
       </w:r>
     </w:p>
     <w:p>
@@ -1770,7 +1770,7 @@
           <w:szCs w:val="24"/>
           <w:rtl/>
         </w:rPr>
-        <w:t xml:space="preserve">העיון המקביל בשתי מערכות הידע מעלה הלימה מבנית מפתיעה בשלושה צירים מרכזיים. הציר הראשון הוא הפיקוח החברתי הבלתי פורמלי: הקרימינולוגיה המודרנית, מתיאוריית הפיקוח דרך תיאוריית הכוח-שליטה ועד הממצאים האמפיריים העדכניים, מסבירה את מיעוט עבריינות הנשים בפיקוח דיפרנציאלי, בקשרים משפחתיים חזקים ובריחוק מזירות עבירה. היהדות, מצידה, מיסדה בדיוק את התנאים הללו באמצעות ערך הצניעות, מרכזיות הבית והקהילה ושגרת חיים נורמטיבית צפופה. במונחי הייגן: הקהילה ההלכתית המסורתית היא מקרה מובהק של מבנה המייצר פער מגדרי גדול בהזדמנויות עבירה. מה שהתיאוריה ניסחה כממצא אמפירי במאה העשרים, ההלכה עיצבה כנורמה מחייבת אלפי שנים קודם לכן.</w:t>
+        <w:t xml:space="preserve">העיון המקביל בשתי מערכות הידע מעלה הלימה מבנית מפתיעה בשלושה צירים מרכזיים. הציר הראשון הוא הפיקוח החברתי הבלתי פורמלי: הקרימינולוגיה המודרנית, מתיאוריית הפיקוח דרך תיאוריית הכוח-שליטה ועד הממצאים האמפיריים העדכניים, מסבירה את מיעוט עבריינות הנשים בפיקוח דיפרנציאלי, בקשרים משפחתיים חזקים ובריחוק מזירות עבירה. היהדות, מצידה, מיסדה בדיוק את התנאים הללו באמצעות ערך הצניעות, מרכזיות הבית והקהילה ושגרת חיים נורמטיבית צפופה. במונחי תיאוריית הכוח-שליטה: הקהילה ההלכתית המסורתית היא מקרה מובהק של מבנה המייצר פער מגדרי גדול בהזדמנויות עבירה. מה שהתיאוריה ניסחה כממצא אמפירי במאה העשרים, ההלכה עיצבה כנורמה מחייבת אלפי שנים קודם לכן.</w:t>
       </w:r>
     </w:p>
     <w:p>
@@ -1822,23 +1822,23 @@
           <w:szCs w:val="24"/>
           <w:rtl/>
         </w:rPr>
-        <w:t xml:space="preserve">לצד ההלימה, ההשוואה חושפת מתחים עמוקים. המתח הראשון נוגע למחיר הפיקוח: מנקודת המבט הפמיניסטית הרדיקלית, אותם מנגנונים שהיהדות מציגה כהגנה (צניעות, תיחום למרחב הביתי, פיקוח קהילתי) הם בדיוק מה שצ'סני-לינד מכנה שליטה פטריארכלית: הם מצמצמים עבריינות נשית באותו מהלך שבו הם מצמצמים חירות נשית, ומייצרים סטנדרט כפול שבו סטייה נשית קלה מתויגת בחומרה יתרה. העובדה שהפיקוח "עובד" קרימינולוגית אינה מכריעה את שאלת המחיר הנורמטיבי שלו, והכרה בכך היא תנאי לדיון הוגן.</w:t>
-      </w:r>
-    </w:p>
-    <w:p>
-      <w:pPr>
-        <w:bidi/>
-        <w:spacing w:after="160" w:before="0" w:line="360"/>
-        <w:jc w:val="both"/>
-      </w:pPr>
-      <w:r>
-        <w:rPr>
-          <w:rFonts w:ascii="David" w:cs="David" w:eastAsia="David" w:hAnsi="David"/>
-          <w:sz w:val="24"/>
-          <w:szCs w:val="24"/>
-          <w:rtl/>
-        </w:rPr>
-        <w:t xml:space="preserve">המתח השני נוגע לכיוון ההסבר: הקרימינולוגיה היא דיסציפלינה תיאורית-אמפירית המבקשת להסביר את המצוי, ואילו היהדות היא מערכת נורמטיבית המבקשת לעצב את הרצוי. כאשר היהדות "מסבירה" את מיעוט עבריינות הנשים, היא עושה זאת מתוך תמונת עולם של תפקידים ראויים, לא מתוך מדידה; ולהפך, הקרימינולוגיה נזהרת משיפוט ערכי גם כשהיא מתעדת נזק. אולם דווקא כאן טמון פוטנציאל ההפריה ההדדית: הקרימינולוגיה החיובית והרוחנית (Ronel &amp; Elisha, 2011; בן יאיר, 2021) מציעות מסגרת שבה ידע נורמטיבי-דתי מתורגם לפרקטיקה טיפולית הניתנת לבחינה אמפירית, בלי לוותר על הסטנדרטים המדעיים.</w:t>
+        <w:t xml:space="preserve">לצד ההלימה, ההשוואה חושפת מתחים עמוקים. המתח הראשון נוגע למחיר הפיקוח: מנקודת המבט הפמיניסטית הרדיקלית, אותם מנגנונים שהיהדות מציגה כהגנה (צניעות, תיחום למרחב הביתי, פיקוח קהילתי) הם בדיוק מה שהקרימינולוגיה הפמיניסטית הרדיקלית מכנה שליטה פטריארכלית: הם מצמצמים עבריינות נשית באותו מהלך שבו הם מצמצמים חירות נשית, ומייצרים סטנדרט כפול שבו סטייה נשית קלה מתויגת בחומרה יתרה. העובדה שהפיקוח "עובד" קרימינולוגית אינה מכריעה את שאלת המחיר הנורמטיבי שלו, והכרה בכך היא תנאי לדיון הוגן.</w:t>
+      </w:r>
+    </w:p>
+    <w:p>
+      <w:pPr>
+        <w:bidi/>
+        <w:spacing w:after="160" w:before="0" w:line="360"/>
+        <w:jc w:val="both"/>
+      </w:pPr>
+      <w:r>
+        <w:rPr>
+          <w:rFonts w:ascii="David" w:cs="David" w:eastAsia="David" w:hAnsi="David"/>
+          <w:sz w:val="24"/>
+          <w:szCs w:val="24"/>
+          <w:rtl/>
+        </w:rPr>
+        <w:t xml:space="preserve">המתח השני נוגע לכיוון ההסבר: הקרימינולוגיה היא דיסציפלינה תיאורית-אמפירית המבקשת להסביר את המצוי, ואילו היהדות היא מערכת נורמטיבית המבקשת לעצב את הרצוי. כאשר היהדות "מסבירה" את מיעוט עבריינות הנשים, היא עושה זאת מתוך תמונת עולם של תפקידים ראויים, לא מתוך מדידה; ולהפך, הקרימינולוגיה נזהרת משיפוט ערכי גם כשהיא מתעדת נזק. אולם דווקא כאן טמון פוטנציאל ההפריה ההדדית: הקרימינולוגיה החיובית והרוחנית (בן יאיר, 2021; Ben Yair, 2021) מציעות מסגרת שבה ידע נורמטיבי-דתי מתורגם לפרקטיקה טיפולית הניתנת לבחינה אמפירית, בלי לוותר על הסטנדרטים המדעיים.</w:t>
       </w:r>
     </w:p>
     <w:p>
@@ -2033,7 +2033,7 @@
           <w:szCs w:val="24"/>
           <w:rtl/>
         </w:rPr>
-        <w:t xml:space="preserve">גוד, א' (2002). על הסטייה. האוניברסיטה הפתוחה.</w:t>
+        <w:t xml:space="preserve">יוכט, ע' (2019). טענת אתי-גונה: פרספקטיבות מגדריות על פרשת המעילה של אתי אלון. משפטים, מט, 673-619.</w:t>
       </w:r>
     </w:p>
     <w:p>
@@ -2050,7 +2050,7 @@
           <w:szCs w:val="24"/>
           <w:rtl/>
         </w:rPr>
-        <w:t xml:space="preserve">יוכט, ע' (2019). טענת אתי-גונה: פרספקטיבות מגדריות על פרשת המעילה של אתי אלון. משפטים, מט, 673-619.</w:t>
+        <w:t xml:space="preserve">לבנקרון, נ' (2021). החשודה המיידית: משטרת ישראל חוקרת המתת תינוקות בידי אימהותיהם ונטישתם (1968-1948). משטרה והיסטוריה, 3, 154-109.</w:t>
       </w:r>
     </w:p>
     <w:p>
@@ -2067,7 +2067,7 @@
           <w:szCs w:val="24"/>
           <w:rtl/>
         </w:rPr>
-        <w:t xml:space="preserve">לבנקרון, נ' (2021). החשודה המיידית: משטרת ישראל חוקרת המתת תינוקות בידי אימהותיהם ונטישתם (1968-1948). משטרה והיסטוריה, 3, 154-109.</w:t>
+        <w:t xml:space="preserve">לרנאו, ח' (2023). עבריינות ואכיפת החוק: תיאוריה, מדיניות וביקורת. פרדס.</w:t>
       </w:r>
     </w:p>
     <w:p>
@@ -2084,41 +2084,7 @@
           <w:szCs w:val="24"/>
           <w:rtl/>
         </w:rPr>
-        <w:t xml:space="preserve">לרנאו, ח' (2023). עבריינות ואכיפת החוק: תיאוריה, מדיניות וביקורת. פרדס.</w:t>
-      </w:r>
-    </w:p>
-    <w:p>
-      <w:pPr>
-        <w:bidi/>
-        <w:spacing w:after="160" w:line="360"/>
-        <w:ind w:left="709" w:hanging="709"/>
-        <w:jc w:val="right"/>
-      </w:pPr>
-      <w:r>
-        <w:rPr>
-          <w:rFonts w:ascii="David" w:cs="David" w:eastAsia="David" w:hAnsi="David"/>
-          <w:sz w:val="24"/>
-          <w:szCs w:val="24"/>
-          <w:rtl/>
-        </w:rPr>
         <w:t xml:space="preserve">פרישטוק, מ' (2019). ויקטימולוגיה ויהדות: תיאוריה, טיפולוגיה, טיפול, מדיניות ויישום. אח.</w:t>
-      </w:r>
-    </w:p>
-    <w:p>
-      <w:pPr>
-        <w:bidi/>
-        <w:spacing w:after="160" w:line="360"/>
-        <w:ind w:left="709" w:hanging="709"/>
-        <w:jc w:val="right"/>
-      </w:pPr>
-      <w:r>
-        <w:rPr>
-          <w:rFonts w:ascii="David" w:cs="David" w:eastAsia="David" w:hAnsi="David"/>
-          <w:sz w:val="24"/>
-          <w:szCs w:val="24"/>
-          <w:rtl/>
-        </w:rPr>
-        <w:t xml:space="preserve">שוהם, ש"ג, אדד, מ' ורהב, ג' (2004). קרימינולוגיה. שוקן.</w:t>
       </w:r>
     </w:p>
     <w:p>
@@ -2134,7 +2100,7 @@
           <w:sz w:val="24"/>
           <w:szCs w:val="24"/>
         </w:rPr>
-        <w:t xml:space="preserve">Adler, F. (1975). Sisters in crime: The rise of the new female criminal. McGraw-Hill.</w:t>
+        <w:t xml:space="preserve">Beatton, T., Kidd, M. P., &amp; Machin, S. (2018). Gender crime convergence over twenty years: Evidence from Australia. European Economic Review, 109, 275-288.</w:t>
       </w:r>
     </w:p>
     <w:p>
@@ -2150,7 +2116,7 @@
           <w:sz w:val="24"/>
           <w:szCs w:val="24"/>
         </w:rPr>
-        <w:t xml:space="preserve">Beatton, T., Kidd, M. P., &amp; Machin, S. (2018). Gender crime convergence over twenty years: Evidence from Australia. European Economic Review, 109, 275-288.</w:t>
+        <w:t xml:space="preserve">Ben Yair, Y. (2021). Intervention and rehabilitation methods with offenders—from the Jewish scriptures to the criminological field. Journal of Offender Rehabilitation, 60(1), 1-18.</w:t>
       </w:r>
     </w:p>
     <w:p>
@@ -2166,7 +2132,7 @@
           <w:sz w:val="24"/>
           <w:szCs w:val="24"/>
         </w:rPr>
-        <w:t xml:space="preserve">Ben Yair, Y. (2021). Intervention and rehabilitation methods with offenders—from the Jewish scriptures to the criminological field. Journal of Offender Rehabilitation, 60(1), 1-18.</w:t>
+        <w:t xml:space="preserve">Campaniello, N. (2019). Women in crime. IZA World of Labor, 105(2), 1-12.</w:t>
       </w:r>
     </w:p>
     <w:p>
@@ -2182,7 +2148,7 @@
           <w:sz w:val="24"/>
           <w:szCs w:val="24"/>
         </w:rPr>
-        <w:t xml:space="preserve">Broidy, L., &amp; Agnew, R. (1997). Gender and crime: A general strain theory perspective. Journal of Research in Crime and Delinquency, 34(3), 275-306.</w:t>
+        <w:t xml:space="preserve">Estrada, F., Bäckman, O., &amp; Nilsson, A. (2016). The darker side of equality? The declining gender gap in crime: Historical trends and an enhanced analysis of staggered birth cohorts. British Journal of Criminology, 56(6), 1272-1290. https://doi.org/10.1093/bjc/azv114</w:t>
       </w:r>
     </w:p>
     <w:p>
@@ -2198,7 +2164,7 @@
           <w:sz w:val="24"/>
           <w:szCs w:val="24"/>
         </w:rPr>
-        <w:t xml:space="preserve">Campaniello, N. (2019). Women in crime. IZA World of Labor, 105(2), 1-12.</w:t>
+        <w:t xml:space="preserve">Eytan, S., &amp; Ronel, N. (2023). From looking for reason to finding meaning: A spiritual journey of recovery from sexual trauma. Journal of Interpersonal Violence, 38(11-12), 7404-7425.</w:t>
       </w:r>
     </w:p>
     <w:p>
@@ -2214,7 +2180,7 @@
           <w:sz w:val="24"/>
           <w:szCs w:val="24"/>
         </w:rPr>
-        <w:t xml:space="preserve">Chesney-Lind, M. (1989). Girls’ crime and woman’s place: Toward a feminist model of female delinquency. Crime &amp; Delinquency, 35(1), 5-29.</w:t>
+        <w:t xml:space="preserve">Kelly, P. E., Polanin, J. R., Jang, S. J., &amp; Johnson, B. R. (2015). Religion, delinquency, and drug use: A meta-analysis. Criminal Justice Review, 40(4), 505-523.</w:t>
       </w:r>
     </w:p>
     <w:p>
@@ -2230,7 +2196,7 @@
           <w:sz w:val="24"/>
           <w:szCs w:val="24"/>
         </w:rPr>
-        <w:t xml:space="preserve">Estrada, F., Bäckman, O., &amp; Nilsson, A. (2016). The darker side of equality? The declining gender gap in crime: Historical trends and an enhanced analysis of staggered birth cohorts. British Journal of Criminology, 56(6), 1272-1290. https://doi.org/10.1093/bjc/azv114</w:t>
+        <w:t xml:space="preserve">Kruttschnitt, C. (2013). Gender and crime. Annual Review of Sociology, 39, 291-308.</w:t>
       </w:r>
     </w:p>
     <w:p>
@@ -2246,7 +2212,7 @@
           <w:sz w:val="24"/>
           <w:szCs w:val="24"/>
         </w:rPr>
-        <w:t xml:space="preserve">Eytan, S., &amp; Ronel, N. (2023). From looking for reason to finding meaning: A spiritual journey of recovery from sexual trauma. Journal of Interpersonal Violence, 38(11-12), 7404-7425.</w:t>
+        <w:t xml:space="preserve">Naegler, L., &amp; Salman, S. (2016). Cultural criminology and gender consciousness: Moving feminist theory from margin to center. Feminist Criminology, 11(4), 354-374.</w:t>
       </w:r>
     </w:p>
     <w:p>
@@ -2262,7 +2228,7 @@
           <w:sz w:val="24"/>
           <w:szCs w:val="24"/>
         </w:rPr>
-        <w:t xml:space="preserve">Hagan, J., Gillis, A. R., &amp; Simpson, J. (1985). The class structure of gender and delinquency: Toward a power-control theory of common delinquent behavior. American Journal of Sociology, 90(6), 1151-1178.</w:t>
+        <w:t xml:space="preserve">Nilsson, E.-L. (2017). Analyzing gender differences in the relationship between family influences and adolescent offending among boys and girls. Child Indicators Research, 10(4), 1079-1094. https://doi.org/10.1007/s12187-016-9435-6</w:t>
       </w:r>
     </w:p>
     <w:p>
@@ -2278,7 +2244,7 @@
           <w:sz w:val="24"/>
           <w:szCs w:val="24"/>
         </w:rPr>
-        <w:t xml:space="preserve">Hirschi, T., &amp; Stark, R. (1969). Hellfire and delinquency. Social Problems, 17(2), 202-213.</w:t>
+        <w:t xml:space="preserve">Savolainen, J., Applin, S., Messner, S. F., Hughes, L. A., Lytle, R., &amp; Kivivuori, J. (2017). Does the gender gap in delinquency vary by level of patriarchy? A cross-national comparative analysis. Criminology, 55(4), 726-753. https://doi.org/10.1111/1745-9125.12161</w:t>
       </w:r>
     </w:p>
     <w:p>
@@ -2294,167 +2260,7 @@
           <w:sz w:val="24"/>
           <w:szCs w:val="24"/>
         </w:rPr>
-        <w:t xml:space="preserve">Kelly, P. E., Polanin, J. R., Jang, S. J., &amp; Johnson, B. R. (2015). Religion, delinquency, and drug use: A meta-analysis. Criminal Justice Review, 40(4), 505-523.</w:t>
-      </w:r>
-    </w:p>
-    <w:p>
-      <w:pPr>
-        <w:bidi w:val="false"/>
-        <w:spacing w:after="160" w:line="360"/>
-        <w:ind w:left="709" w:hanging="709"/>
-        <w:jc w:val="left"/>
-      </w:pPr>
-      <w:r>
-        <w:rPr>
-          <w:rFonts w:ascii="Times New Roman" w:cs="Times New Roman" w:eastAsia="Times New Roman" w:hAnsi="Times New Roman"/>
-          <w:sz w:val="24"/>
-          <w:szCs w:val="24"/>
-        </w:rPr>
-        <w:t xml:space="preserve">Kruttschnitt, C. (2013). Gender and crime. Annual Review of Sociology, 39, 291-308.</w:t>
-      </w:r>
-    </w:p>
-    <w:p>
-      <w:pPr>
-        <w:bidi w:val="false"/>
-        <w:spacing w:after="160" w:line="360"/>
-        <w:ind w:left="709" w:hanging="709"/>
-        <w:jc w:val="left"/>
-      </w:pPr>
-      <w:r>
-        <w:rPr>
-          <w:rFonts w:ascii="Times New Roman" w:cs="Times New Roman" w:eastAsia="Times New Roman" w:hAnsi="Times New Roman"/>
-          <w:sz w:val="24"/>
-          <w:szCs w:val="24"/>
-        </w:rPr>
-        <w:t xml:space="preserve">Naegler, L., &amp; Salman, S. (2016). Cultural criminology and gender consciousness: Moving feminist theory from margin to center. Feminist Criminology, 11(4), 354-374.</w:t>
-      </w:r>
-    </w:p>
-    <w:p>
-      <w:pPr>
-        <w:bidi w:val="false"/>
-        <w:spacing w:after="160" w:line="360"/>
-        <w:ind w:left="709" w:hanging="709"/>
-        <w:jc w:val="left"/>
-      </w:pPr>
-      <w:r>
-        <w:rPr>
-          <w:rFonts w:ascii="Times New Roman" w:cs="Times New Roman" w:eastAsia="Times New Roman" w:hAnsi="Times New Roman"/>
-          <w:sz w:val="24"/>
-          <w:szCs w:val="24"/>
-        </w:rPr>
-        <w:t xml:space="preserve">Nilsson, E.-L. (2017). Analyzing gender differences in the relationship between family influences and adolescent offending among boys and girls. Child Indicators Research, 10(4), 1079-1094. https://doi.org/10.1007/s12187-016-9435-6</w:t>
-      </w:r>
-    </w:p>
-    <w:p>
-      <w:pPr>
-        <w:bidi w:val="false"/>
-        <w:spacing w:after="160" w:line="360"/>
-        <w:ind w:left="709" w:hanging="709"/>
-        <w:jc w:val="left"/>
-      </w:pPr>
-      <w:r>
-        <w:rPr>
-          <w:rFonts w:ascii="Times New Roman" w:cs="Times New Roman" w:eastAsia="Times New Roman" w:hAnsi="Times New Roman"/>
-          <w:sz w:val="24"/>
-          <w:szCs w:val="24"/>
-        </w:rPr>
-        <w:t xml:space="preserve">Pollak, O. (1950). The criminality of women. University of Pennsylvania Press.</w:t>
-      </w:r>
-    </w:p>
-    <w:p>
-      <w:pPr>
-        <w:bidi w:val="false"/>
-        <w:spacing w:after="160" w:line="360"/>
-        <w:ind w:left="709" w:hanging="709"/>
-        <w:jc w:val="left"/>
-      </w:pPr>
-      <w:r>
-        <w:rPr>
-          <w:rFonts w:ascii="Times New Roman" w:cs="Times New Roman" w:eastAsia="Times New Roman" w:hAnsi="Times New Roman"/>
-          <w:sz w:val="24"/>
-          <w:szCs w:val="24"/>
-        </w:rPr>
-        <w:t xml:space="preserve">Ronel, N., &amp; Elisha, E. (2011). A different perspective: Introducing positive criminology. International Journal of Offender Therapy and Comparative Criminology, 55(2), 305-325.</w:t>
-      </w:r>
-    </w:p>
-    <w:p>
-      <w:pPr>
-        <w:bidi w:val="false"/>
-        <w:spacing w:after="160" w:line="360"/>
-        <w:ind w:left="709" w:hanging="709"/>
-        <w:jc w:val="left"/>
-      </w:pPr>
-      <w:r>
-        <w:rPr>
-          <w:rFonts w:ascii="Times New Roman" w:cs="Times New Roman" w:eastAsia="Times New Roman" w:hAnsi="Times New Roman"/>
-          <w:sz w:val="24"/>
-          <w:szCs w:val="24"/>
-        </w:rPr>
-        <w:t xml:space="preserve">Sampson, R. J., &amp; Laub, J. H. (2003). Desistance from crime over the life course. In J. T. Mortimer &amp; M. J. Shanahan (Eds.), Handbook of the life course (pp. 295-309). Springer.</w:t>
-      </w:r>
-    </w:p>
-    <w:p>
-      <w:pPr>
-        <w:bidi w:val="false"/>
-        <w:spacing w:after="160" w:line="360"/>
-        <w:ind w:left="709" w:hanging="709"/>
-        <w:jc w:val="left"/>
-      </w:pPr>
-      <w:r>
-        <w:rPr>
-          <w:rFonts w:ascii="Times New Roman" w:cs="Times New Roman" w:eastAsia="Times New Roman" w:hAnsi="Times New Roman"/>
-          <w:sz w:val="24"/>
-          <w:szCs w:val="24"/>
-        </w:rPr>
-        <w:t xml:space="preserve">Savolainen, J., Applin, S., Messner, S. F., Hughes, L. A., Lytle, R., &amp; Kivivuori, J. (2017). Does the gender gap in delinquency vary by level of patriarchy? A cross-national comparative analysis. Criminology, 55(4), 726-753. https://doi.org/10.1111/1745-9125.12161</w:t>
-      </w:r>
-    </w:p>
-    <w:p>
-      <w:pPr>
-        <w:bidi w:val="false"/>
-        <w:spacing w:after="160" w:line="360"/>
-        <w:ind w:left="709" w:hanging="709"/>
-        <w:jc w:val="left"/>
-      </w:pPr>
-      <w:r>
-        <w:rPr>
-          <w:rFonts w:ascii="Times New Roman" w:cs="Times New Roman" w:eastAsia="Times New Roman" w:hAnsi="Times New Roman"/>
-          <w:sz w:val="24"/>
-          <w:szCs w:val="24"/>
-        </w:rPr>
         <w:t xml:space="preserve">Sela-Shayovitz, R. (2017). Where are the girls? Gender trends in juvenile crime. Journal of Social Science Studies, 4(2), 71-85.</w:t>
-      </w:r>
-    </w:p>
-    <w:p>
-      <w:pPr>
-        <w:bidi w:val="false"/>
-        <w:spacing w:after="160" w:line="360"/>
-        <w:ind w:left="709" w:hanging="709"/>
-        <w:jc w:val="left"/>
-      </w:pPr>
-      <w:r>
-        <w:rPr>
-          <w:rFonts w:ascii="Times New Roman" w:cs="Times New Roman" w:eastAsia="Times New Roman" w:hAnsi="Times New Roman"/>
-          <w:sz w:val="24"/>
-          <w:szCs w:val="24"/>
-        </w:rPr>
-        <w:t xml:space="preserve">Simon, R. J. (1975). Women and crime. Lexington Books.</w:t>
-      </w:r>
-    </w:p>
-    <w:p>
-      <w:pPr>
-        <w:bidi w:val="false"/>
-        <w:spacing w:after="160" w:line="360"/>
-        <w:ind w:left="709" w:hanging="709"/>
-        <w:jc w:val="left"/>
-      </w:pPr>
-      <w:r>
-        <w:rPr>
-          <w:rFonts w:ascii="Times New Roman" w:cs="Times New Roman" w:eastAsia="Times New Roman" w:hAnsi="Times New Roman"/>
-          <w:sz w:val="24"/>
-          <w:szCs w:val="24"/>
-        </w:rPr>
-        <w:t xml:space="preserve">Steffensmeier, D., &amp; Allan, E. (1996). Gender and crime: Toward a gendered theory of female offending. Annual Review of Sociology, 22, 459-487.</w:t>
       </w:r>
     </w:p>
     <w:p>

</xml_diff>

<commit_message>
Remove remaining pre-2016 English sources; all references now 2016-2024
Co-Authored-By: Claude Fable 5 <noreply@anthropic.com>
Claude-Session: https://claude.ai/code/session_01YWm2c58o2zGAStwTniimJp
</commit_message>
<xml_diff>
--- a/seminar-paper/עבריינות נשים מהמקרא ועד ימינו - עבודה סמינריונית.docx
+++ b/seminar-paper/עבריינות נשים מהמקרא ועד ימינו - עבודה סמינריונית.docx
@@ -593,7 +593,7 @@
           <w:szCs w:val="24"/>
           <w:rtl/>
         </w:rPr>
-        <w:t xml:space="preserve">הפער המגדרי בפשיעה (Gender Gap) מתואר בספרות המחקר כאחד הממצאים היציבים ביותר במדעי החברה. בסקירות המחקר מקובל לראות במגדר את אחד המנבאים החזקים ביותר של מעורבות בפשיעה, חזק יותר מגיל, ממעמד חברתי-כלכלי, מהשכלה ומרוב המשתנים הדמוגרפיים האחרים (Kruttschnitt, 2013). נשים מהוות כמחצית מהאוכלוסייה, אך שיעורן בקרב החשודים, הנאשמים והאסירים נמוך באופן דרמטי: בישראל, כמו ברוב מדינות העולם, נשים מהוות פחות מחמישית מכלל התיקים הפליליים ואחוזים בודדים בלבד מאוכלוסיית הכלא (Kruttschnitt, 2013; Sela-Shayovitz, 2017).</w:t>
+        <w:t xml:space="preserve">הפער המגדרי בפשיעה (Gender Gap) מתואר בספרות המחקר כאחד הממצאים היציבים ביותר במדעי החברה. בסקירות המחקר מקובל לראות במגדר את אחד המנבאים החזקים ביותר של מעורבות בפשיעה, חזק יותר מגיל, ממעמד חברתי-כלכלי, מהשכלה ומרוב המשתנים הדמוגרפיים האחרים (van der Heijden, 2024). נשים מהוות כמחצית מהאוכלוסייה, אך שיעורן בקרב החשודים, הנאשמים והאסירים נמוך באופן דרמטי: בישראל, כמו ברוב מדינות העולם, נשים מהוות פחות מחמישית מכלל התיקים הפליליים ואחוזים בודדים בלבד מאוכלוסיית הכלא (Sela-Shayovitz, 2017; van der Heijden, 2024).</w:t>
       </w:r>
     </w:p>
     <w:p>
@@ -714,7 +714,7 @@
           <w:szCs w:val="24"/>
           <w:rtl/>
         </w:rPr>
-        <w:t xml:space="preserve">הפער המגדרי בפשיעה מוגדר כהפרש השיטתי בין שיעורי המעורבות של גברים ושל נשים בעבריינות, כפי שהוא נמדד בסטטיסטיקות רשמיות (מעצרים, הרשעות, כליאה), בסקרי דיווח עצמי ובסקרי נפגעי עבירה. ההבחנה הנדרשת כאן כפולה: הפער בהיקף (נשים עוברות פחות עבירות) והפער בדפוס (נשים עוברות עבירות מסוגים שונים, בנסיבות שונות ובתפקידים שונים). שני הממדים נדרשים יחדיו לתיאור מלא של התופעה (Kruttschnitt, 2013).</w:t>
+        <w:t xml:space="preserve">הפער המגדרי בפשיעה מוגדר כהפרש השיטתי בין שיעורי המעורבות של גברים ושל נשים בעבריינות, כפי שהוא נמדד בסטטיסטיקות רשמיות (מעצרים, הרשעות, כליאה), בסקרי דיווח עצמי ובסקרי נפגעי עבירה. ההבחנה הנדרשת כאן כפולה: הפער בהיקף (נשים עוברות פחות עבירות) והפער בדפוס (נשים עוברות עבירות מסוגים שונים, בנסיבות שונות ובתפקידים שונים). שני הממדים נדרשים יחדיו לתיאור מלא של התופעה (Campaniello, 2019).</w:t>
       </w:r>
     </w:p>
     <w:p>
@@ -750,7 +750,7 @@
           <w:szCs w:val="24"/>
           <w:rtl/>
         </w:rPr>
-        <w:t xml:space="preserve">הנתונים העולמיים עקביים להפליא: נשים מהוות בדרך כלל בין עשירית לרבע מכלל המעצרים, ושיעורן יורד ככל שהעבירה חמורה יותר. בעבירות רצח, שוד ופריצה נשים מהוות אחוזים בודדים מן המבצעים, ואילו בעבירות רכוש קלות (גניבות מחנויות, הונאות קטנות וזיופים) חלקן עולה במידה ניכרת (Kruttschnitt, 2013). באוכלוסיית האסירים הפער בולט עוד יותר: נשים מהוות בעולם כחמישה אחוזים בלבד מכלל הכלואים, ובישראל אף פחות מכך. קמפניאלו (Campaniello, 2019) מציינת כי דפוס זה חוזר על עצמו כמעט בכל מדינה שנבדקה, על אף הבדלים עצומים בתרבות, בדת, ברמת הפיתוח ובשיטת המשפט, עובדה המחזקת את מעמדו של הפער המגדרי כתופעה חוצת-תרבויות הדורשת הסבר תיאורטי. עם זאת, כפי שיפורט בפרק הרביעי, מחקר היסטורי עדכני מטיל ספק דווקא באוניברסליות של הפער לאורך זמן.</w:t>
+        <w:t xml:space="preserve">הנתונים העולמיים עקביים להפליא: נשים מהוות בדרך כלל בין עשירית לרבע מכלל המעצרים, ושיעורן יורד ככל שהעבירה חמורה יותר. בעבירות רצח, שוד ופריצה נשים מהוות אחוזים בודדים מן המבצעים, ואילו בעבירות רכוש קלות (גניבות מחנויות, הונאות קטנות וזיופים) חלקן עולה במידה ניכרת (Campaniello, 2019). באוכלוסיית האסירים הפער בולט עוד יותר: נשים מהוות בעולם כחמישה אחוזים בלבד מכלל הכלואים, ובישראל אף פחות מכך. קמפניאלו (Campaniello, 2019) מציינת כי דפוס זה חוזר על עצמו כמעט בכל מדינה שנבדקה, על אף הבדלים עצומים בתרבות, בדת, ברמת הפיתוח ובשיטת המשפט, עובדה המחזקת את מעמדו של הפער המגדרי כתופעה חוצת-תרבויות הדורשת הסבר תיאורטי. עם זאת, כפי שיפורט בפרק הרביעי, מחקר היסטורי עדכני מטיל ספק דווקא באוניברסליות של הפער לאורך זמן.</w:t>
       </w:r>
     </w:p>
     <w:p>
@@ -802,23 +802,23 @@
           <w:szCs w:val="24"/>
           <w:rtl/>
         </w:rPr>
-        <w:t xml:space="preserve">דפוס העבריינות הנשית שונה מזה הגברי בכמה מאפיינים מובהקים. ראשית, תמהיל העבירות: עבריינות נשים מתרכזת בעבירות רכוש קלות, בעבירות סמים, בעבירות הקשורות בזנות ובעבירות הנובעות ממצוקה כלכלית, ואילו עבירות האלימות שהן מבצעות מתרחשות ברובן בתוך המרחב המשפחתי והזוגי, פעמים רבות על רקע של התעללות ממושכת שחוו הן עצמן (Kruttschnitt, 2013). שנית, התפקיד בעבירה: כאשר נשים שותפות לעבירות חמורות, הן ממלאות לרוב תפקידי משנה: מסייעות, מתווכות או פועלות בצילו של בן זוג דומיננטי. רק לעיתים נדירות הן יוזמות ומנהיגות (Kruttschnitt, 2013).</w:t>
-      </w:r>
-    </w:p>
-    <w:p>
-      <w:pPr>
-        <w:bidi/>
-        <w:spacing w:after="160" w:before="0" w:line="360"/>
-        <w:jc w:val="both"/>
-      </w:pPr>
-      <w:r>
-        <w:rPr>
-          <w:rFonts w:ascii="David" w:cs="David" w:eastAsia="David" w:hAnsi="David"/>
-          <w:sz w:val="24"/>
-          <w:szCs w:val="24"/>
-          <w:rtl/>
-        </w:rPr>
-        <w:t xml:space="preserve">שלישית, מסלולי הכניסה לעבריינות: ספרות ה"נתיבים" (Pathways) מלמדת כי קורות חייהן של נשים עברייניות רצופים בשכיחות גבוהה במיוחד של קורבנות קודמת: התעללות מינית ופיזית בילדות, בריחה מהבית, חיי רחוב, התמכרות וזנות. אצל נערות רבות, העבירה הראשונה היא למעשה אסטרטגיית הישרדות: בריחה מבית פוגעני, גניבה לצורכי קיום או שימוש בסמים כהרדמה עצמית של הטראומה. כך מיטשטש אצל נשים הגבול המושגי בין קורבן לעבריינית באופן שאין לו מקבילה של ממש אצל גברים (פרישטוק, 2019; Kruttschnitt, 2013). רביעית, מאפייני רקע: נשים כלואות מתאפיינות בשיעורים גבוהים של עוני, אימהוּת יחידנית, תחלואה נפשית והתמכרויות, ריבוי פגיעויות המבחין אותן מאוכלוסיית האסירים הגברית.</w:t>
+        <w:t xml:space="preserve">דפוס העבריינות הנשית שונה מזה הגברי בכמה מאפיינים מובהקים. ראשית, תמהיל העבירות: עבריינות נשים מתרכזת בעבירות רכוש קלות, בעבירות סמים, בעבירות הקשורות בזנות ובעבירות הנובעות ממצוקה כלכלית, ואילו עבירות האלימות שהן מבצעות מתרחשות ברובן בתוך המרחב המשפחתי והזוגי, פעמים רבות על רקע של התעללות ממושכת שחוו הן עצמן (פרישטוק, 2019; Campaniello, 2019). שנית, התפקיד בעבירה: כאשר נשים שותפות לעבירות חמורות, הן ממלאות לרוב תפקידי משנה: מסייעות, מתווכות או פועלות בצילו של בן זוג דומיננטי. רק לעיתים נדירות הן יוזמות ומנהיגות (Campaniello, 2019).</w:t>
+      </w:r>
+    </w:p>
+    <w:p>
+      <w:pPr>
+        <w:bidi/>
+        <w:spacing w:after="160" w:before="0" w:line="360"/>
+        <w:jc w:val="both"/>
+      </w:pPr>
+      <w:r>
+        <w:rPr>
+          <w:rFonts w:ascii="David" w:cs="David" w:eastAsia="David" w:hAnsi="David"/>
+          <w:sz w:val="24"/>
+          <w:szCs w:val="24"/>
+          <w:rtl/>
+        </w:rPr>
+        <w:t xml:space="preserve">שלישית, מסלולי הכניסה לעבריינות: ספרות ה"נתיבים" (Pathways) מלמדת כי קורות חייהן של נשים עברייניות רצופים בשכיחות גבוהה במיוחד של קורבנות קודמת: התעללות מינית ופיזית בילדות, בריחה מהבית, חיי רחוב, התמכרות וזנות. אצל נערות רבות, העבירה הראשונה היא למעשה אסטרטגיית הישרדות: בריחה מבית פוגעני, גניבה לצורכי קיום או שימוש בסמים כהרדמה עצמית של הטראומה. כך מיטשטש אצל נשים הגבול המושגי בין קורבן לעבריינית באופן שאין לו מקבילה של ממש אצל גברים (יוכט, 2019; פרישטוק, 2019). רביעית, מאפייני רקע: נשים כלואות מתאפיינות בשיעורים גבוהים של עוני, אימהוּת יחידנית, תחלואה נפשית והתמכרויות, ריבוי פגיעויות המבחין אותן מאוכלוסיית האסירים הגברית.</w:t>
       </w:r>
     </w:p>
     <w:p>
@@ -854,7 +854,7 @@
           <w:szCs w:val="24"/>
           <w:rtl/>
         </w:rPr>
-        <w:t xml:space="preserve">חלק מן הדיון במאפייני התופעה נוגע לשאלה האם הפער הנמדד משקף פער אמיתי. פולק (Pollak, 1950, כפי שמצוטט אצל van der Heijden, 2024) טען בספרו הקלאסי כי עבריינות הנשים "סמויה" ברובה: היא מתרחשת במרחב הביתי, מכוונת כלפי קורבנות חלשים ואינה מדווחת; ומערכות האכיפה נוהגות בנשים ב"אבירות" (Chivalry): שוטרים נמנעים מלעצור אותן, תובעים מקילים בכתבי אישום ושופטים גוזרים עונשים מתונים. מחקרים מאוחרים מצאו תמיכה חלקית בלבד בהשערת האבירות: הקלה מסוימת קיימת בעבירות קלות ובנסיבות "נשיות" מסורתיות, אך היא נעלמת ואף מתהפכת כאשר האישה חורגת בבוטות מן התפקיד המגדרי המצופה. כך או כך, גם סקרי דיווח עצמי, שאינם תלויים במערכות האכיפה, מאשרים פער מגדרי ניכר, בעיקר בעבירות החמורות, ומכאן שהפער אינו ניתן לצמצום מלא להטיית מדידה (Kruttschnitt, 2013).</w:t>
+        <w:t xml:space="preserve">חלק מן הדיון במאפייני התופעה נוגע לשאלה האם הפער הנמדד משקף פער אמיתי. פולק (Pollak, 1950, כפי שמצוטט אצל van der Heijden, 2024) טען בספרו הקלאסי כי עבריינות הנשים "סמויה" ברובה: היא מתרחשת במרחב הביתי, מכוונת כלפי קורבנות חלשים ואינה מדווחת; ומערכות האכיפה נוהגות בנשים ב"אבירות" (Chivalry): שוטרים נמנעים מלעצור אותן, תובעים מקילים בכתבי אישום ושופטים גוזרים עונשים מתונים. מחקרים מאוחרים מצאו תמיכה חלקית בלבד בהשערת האבירות: הקלה מסוימת קיימת בעבירות קלות ובנסיבות "נשיות" מסורתיות, אך היא נעלמת ואף מתהפכת כאשר האישה חורגת בבוטות מן התפקיד המגדרי המצופה. כך או כך, גם סקרי דיווח עצמי, שאינם תלויים במערכות האכיפה, מאשרים פער מגדרי ניכר, בעיקר בעבירות החמורות, ומכאן שהפער אינו ניתן לצמצום מלא להטיית מדידה (Savolainen et al., 2017).</w:t>
       </w:r>
     </w:p>
     <w:p>
@@ -979,7 +979,7 @@
           <w:szCs w:val="24"/>
           <w:rtl/>
         </w:rPr>
-        <w:t xml:space="preserve">מנקודת מבט קרימינולוגית, מעניין ששני המאמרים גם יחד מתיישבים עם ממצאי המחקר המודרני דווקא. ייחוס "בינה יתרה" עולה בקנה אחד עם ממצאים עקביים על התפתחות מוקדמת יותר של שליטה עצמית ושל אמפתיה אצל בנות, שהם גורמי מגן מרכזיים מפני עבריינות; ואילו ההכרה בפגיעות מצבית מסוימת מהדהדת את ספרות הנתיבים, המלמדת כי כניסת נשים לעבריינות מתווכת פעמים רבות על ידי יחסי תלות ופיתוי מצד גברים דומיננטיים (Kruttschnitt, 2013). חז"ל, בלשונם, זיהו אפוא הן את החוסן המוסרי הנשי הן את נקודות התורפה המצביות, מבלי לגרוע מן האחריות המשפטית.</w:t>
+        <w:t xml:space="preserve">מנקודת מבט קרימינולוגית, מעניין ששני המאמרים גם יחד מתיישבים עם ממצאי המחקר המודרני דווקא. ייחוס "בינה יתרה" עולה בקנה אחד עם ממצאים עקביים על התפתחות מוקדמת יותר של שליטה עצמית ושל אמפתיה אצל בנות, שהם גורמי מגן מרכזיים מפני עבריינות; ואילו ההכרה בפגיעות מצבית מסוימת מהדהדת את ספרות הנתיבים, המלמדת כי כניסת נשים לעבריינות מתווכת פעמים רבות על ידי יחסי תלות ופיתוי מצד גברים דומיננטיים (יוכט, 2019). חז"ל, בלשונם, זיהו אפוא הן את החוסן המוסרי הנשי הן את נקודות התורפה המצביות, מבלי לגרוע מן האחריות המשפטית.</w:t>
       </w:r>
     </w:p>
     <w:p>
@@ -1384,7 +1384,7 @@
           <w:szCs w:val="24"/>
           <w:rtl/>
         </w:rPr>
-        <w:t xml:space="preserve">ברוידי ואגניו (Broidy &amp; Agnew, 1997, כפי שמצוטט אצל Kruttschnitt, 2013) יישבו באמצעות תיאוריית הלחץ הכללית (GST) פרדוקס מטריד: נשים חוות לחצים ומצוקות לא פחות מגברים, ואף יותר, ובכל זאת עוברות פחות עבירות. הסברם כפול. ראשית, סוגי הלחץ שונים: לחצי הנשים כרוכים ביחסים בין-אישיים ובנטל טיפולי, המרסנים פורקן עברייני, ואילו לחצי הגברים כרוכים בתחרות ובכבוד, המזמינים תוקפנות כלפי חוץ; שנית, התגובה הרגשית שונה: כעסן של נשים מלוּוה תכופות באשמה, בחרדה ובדיכאון, רגשות המפנים את המצוקה פנימה (פגיעה עצמית, דיכאון, הפרעות אכילה) במקום החוצה. סטפנסמייר ואלן (Steffensmeier &amp; Allan, 1996, כפי שמצוטט אצל van der Heijden, 2024) שילבו יסודות אלה לתיאוריה מגדרית כוללת: נורמות מגדריות, התפתחות מוסרית ורגשית, פיקוח חברתי דיפרנציאלי, הבדלים גופניים והֶקשר מיני. חמשת הממדים הללו מייצרים יחדיו הן את הפער בהיקף הן את הפער בדפוס.</w:t>
+        <w:t xml:space="preserve">ברוידי ואגניו (Broidy &amp; Agnew, 1997, כפי שמצוטט אצל Savolainen et al., 2017) יישבו באמצעות תיאוריית הלחץ הכללית (GST) פרדוקס מטריד: נשים חוות לחצים ומצוקות לא פחות מגברים, ואף יותר, ובכל זאת עוברות פחות עבירות. הסברם כפול. ראשית, סוגי הלחץ שונים: לחצי הנשים כרוכים ביחסים בין-אישיים ובנטל טיפולי, המרסנים פורקן עברייני, ואילו לחצי הגברים כרוכים בתחרות ובכבוד, המזמינים תוקפנות כלפי חוץ; שנית, התגובה הרגשית שונה: כעסן של נשים מלוּוה תכופות באשמה, בחרדה ובדיכאון, רגשות המפנים את המצוקה פנימה (פגיעה עצמית, דיכאון, הפרעות אכילה) במקום החוצה. סטפנסמייר ואלן (Steffensmeier &amp; Allan, 1996, כפי שמצוטט אצל van der Heijden, 2024) שילבו יסודות אלה לתיאוריה מגדרית כוללת: נורמות מגדריות, התפתחות מוסרית ורגשית, פיקוח חברתי דיפרנציאלי, הבדלים גופניים והֶקשר מיני. חמשת הממדים הללו מייצרים יחדיו הן את הפער בהיקף הן את הפער בדפוס.</w:t>
       </w:r>
     </w:p>
     <w:p>
@@ -1436,7 +1436,7 @@
           <w:szCs w:val="24"/>
           <w:rtl/>
         </w:rPr>
-        <w:t xml:space="preserve">לבסוף, זרם מחקרי רלוונטי במיוחד לעבודה זו הוא חקר הקשר שבין דת לעבריינות. מאז "השערת אש הגיהינום" של הירשי וסטארק (Hirschi &amp; Stark, 1969, כפי שמצוטט אצל Kelly et al., 2015) הצטברו עדויות לכך שדתיות (אמונה, תפילה והשתייכות קהילתית) מתואמת עם רמות נמוכות של עבריינות ושימוש בסמים, בעיקר באמצעות חיזוק הפיקוח הבלתי פורמלי, הקשרים החברתיים והפנמת נורמות (Kelly et al., 2015). על בסיס זה צמחו הקרימינולוגיה החיובית, המדגישה גורמי חוסן, שילוב חברתי וחוויות מתקנות, והקרימינולוגיה הרוחנית היהודית של בן יאיר, המציעה מודל שבמרכזו המעבר מאגוצנטריות, שורש העבריינות, לאלטרצנטריות, חיים שמרכזם מחוץ לאני (בן יאיר, 2021; Ben Yair, 2021). מודלים אלה מספקים את הגשר התיאורטי שבין שני חלקי ההשוואה בעבודה זו.</w:t>
+        <w:t xml:space="preserve">לבסוף, זרם מחקרי רלוונטי במיוחד לעבודה זו הוא חקר הקשר שבין דת לעבריינות. מאז "השערת אש הגיהינום" של הירשי וסטארק (Hirschi &amp; Stark, 1969, כפי שמצוטט אצל Adamczyk et al., 2017) הצטברו עדויות לכך שדתיות (אמונה, תפילה והשתייכות קהילתית) מתואמת עם רמות נמוכות של עבריינות ושימוש בסמים, בעיקר באמצעות חיזוק הפיקוח הבלתי פורמלי, הקשרים החברתיים והפנמת נורמות (Adamczyk et al., 2017). על בסיס זה צמחו הקרימינולוגיה החיובית, המדגישה גורמי חוסן, שילוב חברתי וחוויות מתקנות, והקרימינולוגיה הרוחנית היהודית של בן יאיר, המציעה מודל שבמרכזו המעבר מאגוצנטריות, שורש העבריינות, לאלטרצנטריות, חיים שמרכזם מחוץ לאני (בן יאיר, 2021; Ben Yair, 2021). מודלים אלה מספקים את הגשר התיאורטי שבין שני חלקי ההשוואה בעבודה זו.</w:t>
       </w:r>
     </w:p>
     <w:p>
@@ -1629,7 +1629,7 @@
           <w:szCs w:val="24"/>
           <w:rtl/>
         </w:rPr>
-        <w:t xml:space="preserve">קרוטשניט (Kruttschnitt, 2013), בסקירה שיטתית של מחקר העשורים האחרונים, מסכמת שלושה ממצאי ליבה: ראשית, הפער המגדרי נותר "עמיד להפליא" בעבירות החמורות בכל שיטות המדידה; שנית, ההסברים הנתמכים ביותר הם חיברות מגדרי ופיקוח חברתי דיפרנציאלי, ולא הבדלים ביולוגיים; שלישית, מסלולי הכניסה של נשים לעבריינות שזורים בקורבנות קודמת, בעוני ובתלות בבני זוג עבריינים, ומכאן שנדרשת מדיניות ענישה ושיקום מגדרית-רגישה (Gender-Responsive). ממצאים אלה מקנים תוקף אמפירי עדכני לתיאוריות הפמיניסטיות שנסקרו בפרק הקודם.</w:t>
+        <w:t xml:space="preserve">הספרות העדכנית מסכמת שלושה ממצאי ליבה: ראשית, הפער המגדרי נותר עמיד במיוחד בעבירות החמורות בכל שיטות המדידה (Campaniello, 2019); שנית, ההסברים הנתמכים ביותר הם חיברות מגדרי ופיקוח חברתי דיפרנציאלי, ולא הבדלים ביולוגיים (Nilsson, 2017; Savolainen et al., 2017); שלישית, מסלולי הכניסה של נשים לעבריינות שזורים בקורבנות קודמת, בעוני ובתלות בבני זוג, ומכאן שנדרשת מדיניות ענישה ושיקום מגדרית-רגישה (Gender-Responsive) (יוכט, 2019; פרישטוק, 2019). ממצאים אלה מקנים תוקף אמפירי עדכני לתיאוריות הפמיניסטיות שנסקרו בפרק הקודם.</w:t>
       </w:r>
     </w:p>
     <w:p>
@@ -1697,7 +1697,7 @@
           <w:szCs w:val="24"/>
           <w:rtl/>
         </w:rPr>
-        <w:t xml:space="preserve">קלי ועמיתיו (Kelly et al., 2015) ערכו מטא-אנליזה של 62 מחקרים על הקשר שבין דתיות לעבריינות ולשימוש בסמים. הממצא המצרפי מובהק ועקבי: דתיות מתואמת שלילית עם עבריינות, והאפקט חזק במיוחד ביחס לשימוש בסמים ובקרב בני נוער. המנגנונים המתועדים (פיקוח חברתי קהילתי, רשתות תמיכה, הפנמת נורמות ומשמעות קיומית) הם בדיוק המנגנונים שזוהו לעיל כמסבירי הפער המגדרי. במחקרים רבים נמצא האפקט המגן של דתיות חזק יותר אצל נשים, המדווחות בעקביות על רמות דתיות גבוהות משל גברים, ממצא שההשלכה התיאורטית שלו תידון בפרק הבא.</w:t>
+        <w:t xml:space="preserve">אדמצ'יק ועמיתיה (Adamczyk et al., 2017) ערכו סקירה שיטתית של עשרות רבות של מחקרים על הקשר שבין דת לעבריינות. התמונה המצרפית עקבית: רובם המכריע של המחקרים מוצא קשר שלילי בין דתיות לבין עבריינות וסטייה, והאפקט בולט במיוחד בעבירות סמים ואלכוהול ובקרב בני נוער. המנגנונים המתועדים (פיקוח חברתי קהילתי, רשתות תמיכה, הפנמת נורמות ומשמעות קיומית) הם בדיוק המנגנונים שזוהו לעיל כמסבירי הפער המגדרי. במחקרים רבים נמצא האפקט המגן של דתיות חזק יותר אצל נשים, המדווחות בעקביות על רמות דתיות גבוהות משל גברים, ממצא שההשלכה התיאורטית שלו תידון בפרק הבא.</w:t>
       </w:r>
     </w:p>
     <w:p>
@@ -1854,7 +1854,7 @@
           <w:szCs w:val="24"/>
           <w:rtl/>
         </w:rPr>
-        <w:t xml:space="preserve">המתח השלישי הוא אמפירי: אם צדקה הקריאה ההלכתית, היה מקום לצפות שבחברות דתיות הפער המגדרי יהיה גדול במיוחד, ואכן ממצאי המטא-אנליזה של קלי ועמיתיו (Kelly et al., 2015) תומכים בכיוון זה, וממצאיהם של סבולאינן ועמיתיו (Savolainen et al., 2017), שלפיהם הפער המגדרי רחב יותר במדינות פטריארכליות, מוסיפים לכך תמיכה ישירה ברמה הבין-לאומית. אולם ממצאי אסטרדה ועמיתיו (Estrada et al., 2016) מזכירים כי הצטמצמות הפער במערב אינה סיפור של שחרור אלא של שוליים חברתיים; ההשלכה המטרידה היא שגם היחלשות המסגרות המסורתיות אינה מבטיחה שוויון מיטיב, אלא עלולה להפקיר נשים מוחלשות לסיכונים כפולים, לקורבנות ולהפללה גם יחד.</w:t>
+        <w:t xml:space="preserve">המתח השלישי הוא אמפירי: אם צדקה הקריאה ההלכתית, היה מקום לצפות שבחברות דתיות הפער המגדרי יהיה גדול במיוחד, ואכן ממצאי הסקירה השיטתית של אדמצ'יק ועמיתיה (Adamczyk et al., 2017) תומכים בכיוון זה, וממצאיהם של סבולאינן ועמיתיו (Savolainen et al., 2017), שלפיהם הפער המגדרי רחב יותר במדינות פטריארכליות, מוסיפים לכך תמיכה ישירה ברמה הבין-לאומית. אולם ממצאי אסטרדה ועמיתיו (Estrada et al., 2016) מזכירים כי הצטמצמות הפער במערב אינה סיפור של שחרור אלא של שוליים חברתיים; ההשלכה המטרידה היא שגם היחלשות המסגרות המסורתיות אינה מבטיחה שוויון מיטיב, אלא עלולה להפקיר נשים מוחלשות לסיכונים כפולים, לקורבנות ולהפללה גם יחד.</w:t>
       </w:r>
     </w:p>
     <w:p>
@@ -2100,7 +2100,7 @@
           <w:sz w:val="24"/>
           <w:szCs w:val="24"/>
         </w:rPr>
-        <w:t xml:space="preserve">Beatton, T., Kidd, M. P., &amp; Machin, S. (2018). Gender crime convergence over twenty years: Evidence from Australia. European Economic Review, 109, 275-288.</w:t>
+        <w:t xml:space="preserve">Adamczyk, A., Freilich, J. D., &amp; Kim, C. (2017). Religion and crime: A systematic review and assessment of next steps. Sociology of Religion, 78(2), 192-232. https://doi.org/10.1093/socrel/srx012</w:t>
       </w:r>
     </w:p>
     <w:p>
@@ -2116,7 +2116,7 @@
           <w:sz w:val="24"/>
           <w:szCs w:val="24"/>
         </w:rPr>
-        <w:t xml:space="preserve">Ben Yair, Y. (2021). Intervention and rehabilitation methods with offenders—from the Jewish scriptures to the criminological field. Journal of Offender Rehabilitation, 60(1), 1-18.</w:t>
+        <w:t xml:space="preserve">Beatton, T., Kidd, M. P., &amp; Machin, S. (2018). Gender crime convergence over twenty years: Evidence from Australia. European Economic Review, 109, 275-288.</w:t>
       </w:r>
     </w:p>
     <w:p>
@@ -2132,7 +2132,7 @@
           <w:sz w:val="24"/>
           <w:szCs w:val="24"/>
         </w:rPr>
-        <w:t xml:space="preserve">Campaniello, N. (2019). Women in crime. IZA World of Labor, 105(2), 1-12.</w:t>
+        <w:t xml:space="preserve">Ben Yair, Y. (2021). Intervention and rehabilitation methods with offenders—from the Jewish scriptures to the criminological field. Journal of Offender Rehabilitation, 60(1), 1-18.</w:t>
       </w:r>
     </w:p>
     <w:p>
@@ -2148,7 +2148,7 @@
           <w:sz w:val="24"/>
           <w:szCs w:val="24"/>
         </w:rPr>
-        <w:t xml:space="preserve">Estrada, F., Bäckman, O., &amp; Nilsson, A. (2016). The darker side of equality? The declining gender gap in crime: Historical trends and an enhanced analysis of staggered birth cohorts. British Journal of Criminology, 56(6), 1272-1290. https://doi.org/10.1093/bjc/azv114</w:t>
+        <w:t xml:space="preserve">Campaniello, N. (2019). Women in crime. IZA World of Labor, 105(2), 1-12.</w:t>
       </w:r>
     </w:p>
     <w:p>
@@ -2164,7 +2164,7 @@
           <w:sz w:val="24"/>
           <w:szCs w:val="24"/>
         </w:rPr>
-        <w:t xml:space="preserve">Eytan, S., &amp; Ronel, N. (2023). From looking for reason to finding meaning: A spiritual journey of recovery from sexual trauma. Journal of Interpersonal Violence, 38(11-12), 7404-7425.</w:t>
+        <w:t xml:space="preserve">Estrada, F., Bäckman, O., &amp; Nilsson, A. (2016). The darker side of equality? The declining gender gap in crime: Historical trends and an enhanced analysis of staggered birth cohorts. British Journal of Criminology, 56(6), 1272-1290. https://doi.org/10.1093/bjc/azv114</w:t>
       </w:r>
     </w:p>
     <w:p>
@@ -2180,23 +2180,7 @@
           <w:sz w:val="24"/>
           <w:szCs w:val="24"/>
         </w:rPr>
-        <w:t xml:space="preserve">Kelly, P. E., Polanin, J. R., Jang, S. J., &amp; Johnson, B. R. (2015). Religion, delinquency, and drug use: A meta-analysis. Criminal Justice Review, 40(4), 505-523.</w:t>
-      </w:r>
-    </w:p>
-    <w:p>
-      <w:pPr>
-        <w:bidi w:val="false"/>
-        <w:spacing w:after="160" w:line="360"/>
-        <w:ind w:left="709" w:hanging="709"/>
-        <w:jc w:val="left"/>
-      </w:pPr>
-      <w:r>
-        <w:rPr>
-          <w:rFonts w:ascii="Times New Roman" w:cs="Times New Roman" w:eastAsia="Times New Roman" w:hAnsi="Times New Roman"/>
-          <w:sz w:val="24"/>
-          <w:szCs w:val="24"/>
-        </w:rPr>
-        <w:t xml:space="preserve">Kruttschnitt, C. (2013). Gender and crime. Annual Review of Sociology, 39, 291-308.</w:t>
+        <w:t xml:space="preserve">Eytan, S., &amp; Ronel, N. (2023). From looking for reason to finding meaning: A spiritual journey of recovery from sexual trauma. Journal of Interpersonal Violence, 38(11-12), 7404-7425.</w:t>
       </w:r>
     </w:p>
     <w:p>

</xml_diff>

<commit_message>
Integrate Barak-Erez (2023) on gender and access to justice in the Bible
Co-Authored-By: Claude Fable 5 <noreply@anthropic.com>
Claude-Session: https://claude.ai/code/session_01YWm2c58o2zGAStwTniimJp
</commit_message>
<xml_diff>
--- a/seminar-paper/עבריינות נשים מהמקרא ועד ימינו - עבודה סמינריונית.docx
+++ b/seminar-paper/עבריינות נשים מהמקרא ועד ימינו - עבודה סמינריונית.docx
@@ -1088,6 +1088,22 @@
     </w:p>
     <w:p>
       <w:pPr>
+        <w:bidi/>
+        <w:spacing w:after="160" w:before="0" w:line="360"/>
+        <w:jc w:val="both"/>
+      </w:pPr>
+      <w:r>
+        <w:rPr>
+          <w:rFonts w:ascii="David" w:cs="David" w:eastAsia="David" w:hAnsi="David"/>
+          <w:sz w:val="24"/>
+          <w:szCs w:val="24"/>
+          <w:rtl/>
+        </w:rPr>
+        <w:t xml:space="preserve">ברק-ארז (2023) מוסיפה לקריאה זו ממד משפטי. עיון בסיפורי המקרא מגלה נשים כשחקניות פעילות בעולם המשפט: שופטת (דבורה) ומתדיינות העומדות על זכויותיהן (בנות צלפחד, האישה החכמה מתקוע, תמר ורות), דווקא מעמדת נחיתות חברתית. לענייננו מכרעת האבחנה שהיא מציעה בין נשים שפעלו בתוך המערכת המשפטית לבין נשים שנקטו אי-ציות לחוק בנסיבות שבהן לא עמדה לרשותן כל ערכאה שיכולה הייתה לסייע, ובראשן המיילדות העבריות שסירבו לגזרת פרעה. אבחנה זו מטרימה את הממצא הקרימינולוגי המודרני: מקום שבו נחסמת בפני נשים הגישה לצדק ולאמצעים לגיטימיים, שם צומחת העבירה הנשית, על פי רוב כעבירת הישרדות והגנה. הרחבת הגישה לצדק מתגלה אפוא, כבר בקריאה המקראית, כמנגנון של מניעת עבריינות.</w:t>
+      </w:r>
+    </w:p>
+    <w:p>
+      <w:pPr>
         <w:pStyle w:val="Heading2"/>
         <w:bidi/>
         <w:spacing w:after="120" w:before="240" w:line="360"/>
@@ -2017,6 +2033,23 @@
           <w:rtl/>
         </w:rPr>
         <w:t xml:space="preserve">בן יאיר, י' (2021). קרימינולוגיה רוחנית יהודית: בחזרה לשאלות יסוד. סוגיות חברתיות בישראל, 30(2), 368-337.</w:t>
+      </w:r>
+    </w:p>
+    <w:p>
+      <w:pPr>
+        <w:bidi/>
+        <w:spacing w:after="160" w:line="360"/>
+        <w:ind w:left="709" w:hanging="709"/>
+        <w:jc w:val="right"/>
+      </w:pPr>
+      <w:r>
+        <w:rPr>
+          <w:rFonts w:ascii="David" w:cs="David" w:eastAsia="David" w:hAnsi="David"/>
+          <w:sz w:val="24"/>
+          <w:szCs w:val="24"/>
+          <w:rtl/>
+        </w:rPr>
+        <w:t xml:space="preserve">ברק-ארז, ד' (2023). שופטות ומתדיינות בתנ"ך: על מגדר וגישה לצדק. משפט וממשל, כה, 28-15.</w:t>
       </w:r>
     </w:p>
     <w:p>

</xml_diff>

<commit_message>
Integrate Kaar (2024) on victim-perpetrator binary in extreme conditions
Co-Authored-By: Claude Fable 5 <noreply@anthropic.com>
Claude-Session: https://claude.ai/code/session_01YWm2c58o2zGAStwTniimJp
</commit_message>
<xml_diff>
--- a/seminar-paper/עבריינות נשים מהמקרא ועד ימינו - עבודה סמינריונית.docx
+++ b/seminar-paper/עבריינות נשים מהמקרא ועד ימינו - עבודה סמינריונית.docx
@@ -1682,6 +1682,22 @@
     </w:p>
     <w:p>
       <w:pPr>
+        <w:bidi/>
+        <w:spacing w:after="160" w:before="0" w:line="360"/>
+        <w:jc w:val="both"/>
+      </w:pPr>
+      <w:r>
+        <w:rPr>
+          <w:rFonts w:ascii="David" w:cs="David" w:eastAsia="David" w:hAnsi="David"/>
+          <w:sz w:val="24"/>
+          <w:szCs w:val="24"/>
+          <w:rtl/>
+        </w:rPr>
+        <w:t xml:space="preserve">עד כמה עמידה מסגרת ניתוח זו גם בתנאי קיצון מדגים מחקרה של קאר (2024), שניתחה את עדויותיה של יוליה בריכטה, יהודייה הונגרייה ששרדה את מחנה רוונסבריק כאסירה בעלת תפקיד ונחשדה לימים במעורבות בפגיעה באסירות. קאר מראה כיצד הנשים המעטות שהחזיקו במחנה בעמדות של "זכויות יתר" נשפטו פעמיים: פעם על מעשיהן ופעם על עצם חריגתן מהנורמות המצופות מנשים, וכיצד עדויותיהן נדחקו מן הזיכרון ההיסטורי. מסקנתה היא שדמותה של בריכטה חסינה מפני החלוקה הבינרית לקורבן או פושעת, לגיבורה או נבלה. המקרה ממחיש, בתנאים הקיצוניים ביותר שידעה ההיסטוריה, את שני היסודות שנדונו לכל אורך העבודה: טשטוש הגבול בין קורבן לעבריינית, והשיפוט המוסרי הכפול המופעל על נשים החורגות מתפקידן המגדרי.</w:t>
+      </w:r>
+    </w:p>
+    <w:p>
+      <w:pPr>
         <w:pStyle w:val="Heading2"/>
         <w:bidi/>
         <w:spacing w:after="120" w:before="240" w:line="360"/>
@@ -2118,6 +2134,23 @@
           <w:rtl/>
         </w:rPr>
         <w:t xml:space="preserve">פרישטוק, מ' (2019). ויקטימולוגיה ויהדות: תיאוריה, טיפולוגיה, טיפול, מדיניות ויישום. אח.</w:t>
+      </w:r>
+    </w:p>
+    <w:p>
+      <w:pPr>
+        <w:bidi/>
+        <w:spacing w:after="160" w:line="360"/>
+        <w:ind w:left="709" w:hanging="709"/>
+        <w:jc w:val="right"/>
+      </w:pPr>
+      <w:r>
+        <w:rPr>
+          <w:rFonts w:ascii="David" w:cs="David" w:eastAsia="David" w:hAnsi="David"/>
+          <w:sz w:val="24"/>
+          <w:szCs w:val="24"/>
+          <w:rtl/>
+        </w:rPr>
+        <w:t xml:space="preserve">קאר, ג' (2024). נרטיבים של התנגדות, פשרה מוסרית ופשיעה: העדויות של יוליה בריכטה, ניצולת רוונסבריק. דפים לחקר השואה, לו, 114-90.</w:t>
       </w:r>
     </w:p>
     <w:p>

</xml_diff>

<commit_message>
Integrate Knesset report with official Israeli women's incarceration data
Co-Authored-By: Claude Fable 5 <noreply@anthropic.com>
Claude-Session: https://claude.ai/code/session_01YWm2c58o2zGAStwTniimJp
</commit_message>
<xml_diff>
--- a/seminar-paper/עבריינות נשים מהמקרא ועד ימינו - עבודה סמינריונית.docx
+++ b/seminar-paper/עבריינות נשים מהמקרא ועד ימינו - עבודה סמינריונית.docx
@@ -593,7 +593,7 @@
           <w:szCs w:val="24"/>
           <w:rtl/>
         </w:rPr>
-        <w:t xml:space="preserve">הפער המגדרי בפשיעה (Gender Gap) מתואר בספרות המחקר כאחד הממצאים היציבים ביותר במדעי החברה. בסקירות המחקר מקובל לראות במגדר את אחד המנבאים החזקים ביותר של מעורבות בפשיעה, חזק יותר מגיל, ממעמד חברתי-כלכלי, מהשכלה ומרוב המשתנים הדמוגרפיים האחרים (van der Heijden, 2024). נשים מהוות כמחצית מהאוכלוסייה, אך שיעורן בקרב החשודים, הנאשמים והאסירים נמוך באופן דרמטי: בישראל, כמו ברוב מדינות העולם, נשים מהוות פחות מחמישית מכלל התיקים הפליליים ואחוזים בודדים בלבד מאוכלוסיית הכלא (Sela-Shayovitz, 2017; van der Heijden, 2024).</w:t>
+        <w:t xml:space="preserve">הפער המגדרי בפשיעה (Gender Gap) מתואר בספרות המחקר כאחד הממצאים היציבים ביותר במדעי החברה. בסקירות המחקר מקובל לראות במגדר את אחד המנבאים החזקים ביותר של מעורבות בפשיעה, חזק יותר מגיל, ממעמד חברתי-כלכלי, מהשכלה ומרוב המשתנים הדמוגרפיים האחרים (van der Heijden, 2024). נשים מהוות כמחצית מהאוכלוסייה, אך שיעורן בקרב החשודים, הנאשמים והאסירים נמוך באופן דרמטי: בישראל, כמו ברוב מדינות העולם, נשים מהוות פחות מחמישית מכלל התיקים הפליליים ואחוזים בודדים בלבד מאוכלוסיית הכלא (יכימוביץ-כהן, 2017; Sela-Shayovitz, 2017; van der Heijden, 2024).</w:t>
       </w:r>
     </w:p>
     <w:p>
@@ -750,7 +750,7 @@
           <w:szCs w:val="24"/>
           <w:rtl/>
         </w:rPr>
-        <w:t xml:space="preserve">הנתונים העולמיים עקביים להפליא: נשים מהוות בדרך כלל בין עשירית לרבע מכלל המעצרים, ושיעורן יורד ככל שהעבירה חמורה יותר. בעבירות רצח, שוד ופריצה נשים מהוות אחוזים בודדים מן המבצעים, ואילו בעבירות רכוש קלות (גניבות מחנויות, הונאות קטנות וזיופים) חלקן עולה במידה ניכרת (Campaniello, 2019). באוכלוסיית האסירים הפער בולט עוד יותר: נשים מהוות בעולם כחמישה אחוזים בלבד מכלל הכלואים, ובישראל אף פחות מכך. קמפניאלו (Campaniello, 2019) מציינת כי דפוס זה חוזר על עצמו כמעט בכל מדינה שנבדקה, על אף הבדלים עצומים בתרבות, בדת, ברמת הפיתוח ובשיטת המשפט, עובדה המחזקת את מעמדו של הפער המגדרי כתופעה חוצת-תרבויות הדורשת הסבר תיאורטי. עם זאת, כפי שיפורט בפרק הרביעי, מחקר היסטורי עדכני מטיל ספק דווקא באוניברסליות של הפער לאורך זמן.</w:t>
+        <w:t xml:space="preserve">הנתונים העולמיים עקביים להפליא: נשים מהוות בדרך כלל בין עשירית לרבע מכלל המעצרים, ושיעורן יורד ככל שהעבירה חמורה יותר. בעבירות רצח, שוד ופריצה נשים מהוות אחוזים בודדים מן המבצעים, ואילו בעבירות רכוש קלות (גניבות מחנויות, הונאות קטנות וזיופים) חלקן עולה במידה ניכרת (Campaniello, 2019). באוכלוסיית האסירים הפער בולט עוד יותר: נשים מהוות בעולם כחמישה אחוזים בלבד מכלל הכלואים, ובישראל הן היוו בשנת 2017 כ-1.3% בלבד, 271 כלואות מתוך אוכלוסיית כלואים של כ-20 אלף (יכימוביץ-כהן, 2017). קמפניאלו (Campaniello, 2019) מציינת כי דפוס זה חוזר על עצמו כמעט בכל מדינה שנבדקה, על אף הבדלים עצומים בתרבות, בדת, ברמת הפיתוח ובשיטת המשפט, עובדה המחזקת את מעמדו של הפער המגדרי כתופעה חוצת-תרבויות הדורשת הסבר תיאורטי. עם זאת, כפי שיפורט בפרק הרביעי, מחקר היסטורי עדכני מטיל ספק דווקא באוניברסליות של הפער לאורך זמן.</w:t>
       </w:r>
     </w:p>
     <w:p>
@@ -818,7 +818,7 @@
           <w:szCs w:val="24"/>
           <w:rtl/>
         </w:rPr>
-        <w:t xml:space="preserve">שלישית, מסלולי הכניסה לעבריינות: ספרות ה"נתיבים" (Pathways) מלמדת כי קורות חייהן של נשים עברייניות רצופים בשכיחות גבוהה במיוחד של קורבנות קודמת: התעללות מינית ופיזית בילדות, בריחה מהבית, חיי רחוב, התמכרות וזנות. אצל נערות רבות, העבירה הראשונה היא למעשה אסטרטגיית הישרדות: בריחה מבית פוגעני, גניבה לצורכי קיום או שימוש בסמים כהרדמה עצמית של הטראומה. כך מיטשטש אצל נשים הגבול המושגי בין קורבן לעבריינית באופן שאין לו מקבילה של ממש אצל גברים (יוכט, 2019; פרישטוק, 2019). רביעית, מאפייני רקע: נשים כלואות מתאפיינות בשיעורים גבוהים של עוני, אימהוּת יחידנית, תחלואה נפשית והתמכרויות, ריבוי פגיעויות המבחין אותן מאוכלוסיית האסירים הגברית.</w:t>
+        <w:t xml:space="preserve">שלישית, מסלולי הכניסה לעבריינות: ספרות ה"נתיבים" (Pathways) מלמדת כי קורות חייהן של נשים עברייניות רצופים בשכיחות גבוהה במיוחד של קורבנות קודמת: התעללות מינית ופיזית בילדות, בריחה מהבית, חיי רחוב, התמכרות וזנות. אצל נערות רבות, העבירה הראשונה היא למעשה אסטרטגיית הישרדות: בריחה מבית פוגעני, גניבה לצורכי קיום או שימוש בסמים כהרדמה עצמית של הטראומה. כך מיטשטש אצל נשים הגבול המושגי בין קורבן לעבריינית באופן שאין לו מקבילה של ממש אצל גברים (יוכט, 2019; פרישטוק, 2019). רביעית, מאפייני רקע: נשים כלואות מתאפיינות בשיעורים גבוהים של עוני, השכלה נמוכה, אימהוּת יחידנית, קורבנות להתעללות פיזית ומינית, תחלואה נפשית והתמכרויות, ריבוי פגיעויות המבחין אותן מאוכלוסיית האסירים הגברית. נתונים אלה מתועדים גם בקרב הכלואות בישראל (יכימוביץ-כהן, 2017).</w:t>
       </w:r>
     </w:p>
     <w:p>
@@ -2083,6 +2083,23 @@
           <w:rtl/>
         </w:rPr>
         <w:t xml:space="preserve">יוכט, ע' (2019). טענת אתי-גונה: פרספקטיבות מגדריות על פרשת המעילה של אתי אלון. משפטים, מט, 673-619.</w:t>
+      </w:r>
+    </w:p>
+    <w:p>
+      <w:pPr>
+        <w:bidi/>
+        <w:spacing w:after="160" w:line="360"/>
+        <w:ind w:left="709" w:hanging="709"/>
+        <w:jc w:val="right"/>
+      </w:pPr>
+      <w:r>
+        <w:rPr>
+          <w:rFonts w:ascii="David" w:cs="David" w:eastAsia="David" w:hAnsi="David"/>
+          <w:sz w:val="24"/>
+          <w:szCs w:val="24"/>
+          <w:rtl/>
+        </w:rPr>
+        <w:t xml:space="preserve">יכימוביץ-כהן, נ' (2017). היבטים בכליאת נשים בישראל. הכנסת, מרכז המחקר והמידע.</w:t>
       </w:r>
     </w:p>
     <w:p>

</xml_diff>

<commit_message>
Replace manual TOC with automatic Word TOC field
Co-Authored-By: Claude Fable 5 <noreply@anthropic.com>
Claude-Session: https://claude.ai/code/session_01YWm2c58o2zGAStwTniimJp
</commit_message>
<xml_diff>
--- a/seminar-paper/עבריינות נשים מהמקרא ועד ימינו - עבודה סמינריונית.docx
+++ b/seminar-paper/עבריינות נשים מהמקרא ועד ימינו - עבודה סמינריונית.docx
@@ -251,286 +251,25 @@
         <w:t xml:space="preserve">תוכן העניינים</w:t>
       </w:r>
     </w:p>
-    <w:p>
-      <w:pPr>
-        <w:tabs>
-          <w:tab w:val="right" w:pos="9026" w:leader="dot"/>
-        </w:tabs>
-        <w:bidi/>
-        <w:spacing w:after="60" w:line="480"/>
-        <w:jc w:val="left"/>
-      </w:pPr>
-      <w:r>
-        <w:rPr>
-          <w:rFonts w:ascii="David" w:cs="David" w:eastAsia="David" w:hAnsi="David"/>
-          <w:sz w:val="24"/>
-          <w:szCs w:val="24"/>
-          <w:rtl/>
-        </w:rPr>
-        <w:t xml:space="preserve">תקציר</w:t>
-      </w:r>
-      <w:r>
-        <w:rPr>
-          <w:rFonts w:ascii="David" w:cs="David" w:eastAsia="David" w:hAnsi="David"/>
-          <w:sz w:val="24"/>
-          <w:szCs w:val="24"/>
-        </w:rPr>
-        <w:t xml:space="preserve">	</w:t>
-      </w:r>
-      <w:r>
-        <w:rPr>
-          <w:rFonts w:ascii="David" w:cs="David" w:eastAsia="David" w:hAnsi="David"/>
-          <w:sz w:val="24"/>
-          <w:szCs w:val="24"/>
-        </w:rPr>
-        <w:t xml:space="preserve">3</w:t>
-      </w:r>
-    </w:p>
-    <w:p>
-      <w:pPr>
-        <w:tabs>
-          <w:tab w:val="right" w:pos="9026" w:leader="dot"/>
-        </w:tabs>
-        <w:bidi/>
-        <w:spacing w:after="60" w:line="480"/>
-        <w:jc w:val="left"/>
-      </w:pPr>
-      <w:r>
-        <w:rPr>
-          <w:rFonts w:ascii="David" w:cs="David" w:eastAsia="David" w:hAnsi="David"/>
-          <w:sz w:val="24"/>
-          <w:szCs w:val="24"/>
-          <w:rtl/>
-        </w:rPr>
-        <w:t xml:space="preserve">מבוא</w:t>
-      </w:r>
-      <w:r>
-        <w:rPr>
-          <w:rFonts w:ascii="David" w:cs="David" w:eastAsia="David" w:hAnsi="David"/>
-          <w:sz w:val="24"/>
-          <w:szCs w:val="24"/>
-        </w:rPr>
-        <w:t xml:space="preserve">	</w:t>
-      </w:r>
-      <w:r>
-        <w:rPr>
-          <w:rFonts w:ascii="David" w:cs="David" w:eastAsia="David" w:hAnsi="David"/>
-          <w:sz w:val="24"/>
-          <w:szCs w:val="24"/>
-        </w:rPr>
-        <w:t xml:space="preserve">4</w:t>
-      </w:r>
-    </w:p>
-    <w:p>
-      <w:pPr>
-        <w:tabs>
-          <w:tab w:val="right" w:pos="9026" w:leader="dot"/>
-        </w:tabs>
-        <w:bidi/>
-        <w:spacing w:after="60" w:line="480"/>
-        <w:jc w:val="left"/>
-      </w:pPr>
-      <w:r>
-        <w:rPr>
-          <w:rFonts w:ascii="David" w:cs="David" w:eastAsia="David" w:hAnsi="David"/>
-          <w:sz w:val="24"/>
-          <w:szCs w:val="24"/>
-          <w:rtl/>
-        </w:rPr>
-        <w:t xml:space="preserve">פרק ראשון: הגדרות ומאפיינים של התופעה</w:t>
-      </w:r>
-      <w:r>
-        <w:rPr>
-          <w:rFonts w:ascii="David" w:cs="David" w:eastAsia="David" w:hAnsi="David"/>
-          <w:sz w:val="24"/>
-          <w:szCs w:val="24"/>
-        </w:rPr>
-        <w:t xml:space="preserve">	</w:t>
-      </w:r>
-      <w:r>
-        <w:rPr>
-          <w:rFonts w:ascii="David" w:cs="David" w:eastAsia="David" w:hAnsi="David"/>
-          <w:sz w:val="24"/>
-          <w:szCs w:val="24"/>
-        </w:rPr>
-        <w:t xml:space="preserve">5</w:t>
-      </w:r>
-    </w:p>
-    <w:p>
-      <w:pPr>
-        <w:tabs>
-          <w:tab w:val="right" w:pos="9026" w:leader="dot"/>
-        </w:tabs>
-        <w:bidi/>
-        <w:spacing w:after="60" w:line="480"/>
-        <w:jc w:val="left"/>
-      </w:pPr>
-      <w:r>
-        <w:rPr>
-          <w:rFonts w:ascii="David" w:cs="David" w:eastAsia="David" w:hAnsi="David"/>
-          <w:sz w:val="24"/>
-          <w:szCs w:val="24"/>
-          <w:rtl/>
-        </w:rPr>
-        <w:t xml:space="preserve">פרק שני: היחס ביהדות לנושא</w:t>
-      </w:r>
-      <w:r>
-        <w:rPr>
-          <w:rFonts w:ascii="David" w:cs="David" w:eastAsia="David" w:hAnsi="David"/>
-          <w:sz w:val="24"/>
-          <w:szCs w:val="24"/>
-        </w:rPr>
-        <w:t xml:space="preserve">	</w:t>
-      </w:r>
-      <w:r>
-        <w:rPr>
-          <w:rFonts w:ascii="David" w:cs="David" w:eastAsia="David" w:hAnsi="David"/>
-          <w:sz w:val="24"/>
-          <w:szCs w:val="24"/>
-        </w:rPr>
-        <w:t xml:space="preserve">7</w:t>
-      </w:r>
-    </w:p>
-    <w:p>
-      <w:pPr>
-        <w:tabs>
-          <w:tab w:val="right" w:pos="9026" w:leader="dot"/>
-        </w:tabs>
-        <w:bidi/>
-        <w:spacing w:after="60" w:line="480"/>
-        <w:jc w:val="left"/>
-      </w:pPr>
-      <w:r>
-        <w:rPr>
-          <w:rFonts w:ascii="David" w:cs="David" w:eastAsia="David" w:hAnsi="David"/>
-          <w:sz w:val="24"/>
-          <w:szCs w:val="24"/>
-          <w:rtl/>
-        </w:rPr>
-        <w:t xml:space="preserve">פרק שלישי: גישות בקרימינולוגיה המסבירות את הנושא</w:t>
-      </w:r>
-      <w:r>
-        <w:rPr>
-          <w:rFonts w:ascii="David" w:cs="David" w:eastAsia="David" w:hAnsi="David"/>
-          <w:sz w:val="24"/>
-          <w:szCs w:val="24"/>
-        </w:rPr>
-        <w:t xml:space="preserve">	</w:t>
-      </w:r>
-      <w:r>
-        <w:rPr>
-          <w:rFonts w:ascii="David" w:cs="David" w:eastAsia="David" w:hAnsi="David"/>
-          <w:sz w:val="24"/>
-          <w:szCs w:val="24"/>
-        </w:rPr>
-        <w:t xml:space="preserve">10</w:t>
-      </w:r>
-    </w:p>
-    <w:p>
-      <w:pPr>
-        <w:tabs>
-          <w:tab w:val="right" w:pos="9026" w:leader="dot"/>
-        </w:tabs>
-        <w:bidi/>
-        <w:spacing w:after="60" w:line="480"/>
-        <w:jc w:val="left"/>
-      </w:pPr>
-      <w:r>
-        <w:rPr>
-          <w:rFonts w:ascii="David" w:cs="David" w:eastAsia="David" w:hAnsi="David"/>
-          <w:sz w:val="24"/>
-          <w:szCs w:val="24"/>
-          <w:rtl/>
-        </w:rPr>
-        <w:t xml:space="preserve">פרק רביעי: מחקרים בקרימינולוגיה על הנושא</w:t>
-      </w:r>
-      <w:r>
-        <w:rPr>
-          <w:rFonts w:ascii="David" w:cs="David" w:eastAsia="David" w:hAnsi="David"/>
-          <w:sz w:val="24"/>
-          <w:szCs w:val="24"/>
-        </w:rPr>
-        <w:t xml:space="preserve">	</w:t>
-      </w:r>
-      <w:r>
-        <w:rPr>
-          <w:rFonts w:ascii="David" w:cs="David" w:eastAsia="David" w:hAnsi="David"/>
-          <w:sz w:val="24"/>
-          <w:szCs w:val="24"/>
-        </w:rPr>
-        <w:t xml:space="preserve">13</w:t>
-      </w:r>
-    </w:p>
-    <w:p>
-      <w:pPr>
-        <w:tabs>
-          <w:tab w:val="right" w:pos="9026" w:leader="dot"/>
-        </w:tabs>
-        <w:bidi/>
-        <w:spacing w:after="60" w:line="480"/>
-        <w:jc w:val="left"/>
-      </w:pPr>
-      <w:r>
-        <w:rPr>
-          <w:rFonts w:ascii="David" w:cs="David" w:eastAsia="David" w:hAnsi="David"/>
-          <w:sz w:val="24"/>
-          <w:szCs w:val="24"/>
-          <w:rtl/>
-        </w:rPr>
-        <w:t xml:space="preserve">פרק חמישי: דיון ומסקנות</w:t>
-      </w:r>
-      <w:r>
-        <w:rPr>
-          <w:rFonts w:ascii="David" w:cs="David" w:eastAsia="David" w:hAnsi="David"/>
-          <w:sz w:val="24"/>
-          <w:szCs w:val="24"/>
-        </w:rPr>
-        <w:t xml:space="preserve">	</w:t>
-      </w:r>
-      <w:r>
-        <w:rPr>
-          <w:rFonts w:ascii="David" w:cs="David" w:eastAsia="David" w:hAnsi="David"/>
-          <w:sz w:val="24"/>
-          <w:szCs w:val="24"/>
-        </w:rPr>
-        <w:t xml:space="preserve">16</w:t>
-      </w:r>
-    </w:p>
-    <w:p>
-      <w:pPr>
-        <w:tabs>
-          <w:tab w:val="right" w:pos="9026" w:leader="dot"/>
-        </w:tabs>
-        <w:bidi/>
-        <w:spacing w:after="60" w:line="480"/>
-        <w:jc w:val="left"/>
-      </w:pPr>
-      <w:r>
-        <w:rPr>
-          <w:rFonts w:ascii="David" w:cs="David" w:eastAsia="David" w:hAnsi="David"/>
-          <w:sz w:val="24"/>
-          <w:szCs w:val="24"/>
-          <w:rtl/>
-        </w:rPr>
-        <w:t xml:space="preserve">ביבליוגרפיה</w:t>
-      </w:r>
-      <w:r>
-        <w:rPr>
-          <w:rFonts w:ascii="David" w:cs="David" w:eastAsia="David" w:hAnsi="David"/>
-          <w:sz w:val="24"/>
-          <w:szCs w:val="24"/>
-        </w:rPr>
-        <w:t xml:space="preserve">	</w:t>
-      </w:r>
-      <w:r>
-        <w:rPr>
-          <w:rFonts w:ascii="David" w:cs="David" w:eastAsia="David" w:hAnsi="David"/>
-          <w:sz w:val="24"/>
-          <w:szCs w:val="24"/>
-        </w:rPr>
-        <w:t xml:space="preserve">19</w:t>
-      </w:r>
-    </w:p>
+    <w:sdt>
+      <w:sdtPr>
+        <w:alias w:val="תוכן עניינים"/>
+      </w:sdtPr>
+      <w:sdtContent>
+        <w:p>
+          <w:r>
+            <w:fldChar w:fldCharType="begin" w:dirty="true"/>
+            <w:instrText xml:space="preserve">TOC \h \o "1-1"</w:instrText>
+            <w:fldChar w:fldCharType="separate"/>
+          </w:r>
+        </w:p>
+        <w:p>
+          <w:r>
+            <w:fldChar w:fldCharType="end"/>
+          </w:r>
+        </w:p>
+      </w:sdtContent>
+    </w:sdt>
     <w:p>
       <w:r>
         <w:br w:type="page"/>
@@ -2650,6 +2389,9 @@
     <w:basedOn w:val="Normal"/>
     <w:next w:val="Normal"/>
     <w:qFormat/>
+    <w:pPr>
+      <w:outlineLvl w:val="0"/>
+    </w:pPr>
     <w:rPr>
       <w:color w:val="2E74B5"/>
       <w:sz w:val="32"/>
@@ -2661,6 +2403,9 @@
     <w:basedOn w:val="Normal"/>
     <w:next w:val="Normal"/>
     <w:qFormat/>
+    <w:pPr>
+      <w:outlineLvl w:val="1"/>
+    </w:pPr>
     <w:rPr>
       <w:color w:val="2E74B5"/>
       <w:sz w:val="26"/>

</xml_diff>

<commit_message>
Expand summary and conclusions with systematic answer and practical recommendations
Co-Authored-By: Claude Fable 5 <noreply@anthropic.com>
Claude-Session: https://claude.ai/code/session_01YWm2c58o2zGAStwTniimJp
</commit_message>
<xml_diff>
--- a/seminar-paper/עבריינות נשים מהמקרא ועד ימינו - עבודה סמינריונית.docx
+++ b/seminar-paper/עבריינות נשים מהמקרא ועד ימינו - עבודה סמינריונית.docx
@@ -1795,7 +1795,55 @@
           <w:szCs w:val="24"/>
           <w:rtl/>
         </w:rPr>
-        <w:t xml:space="preserve">שאלת המחקר, מדוע נשים עוברות פחות עבירות מגברים וכיצד מסבירות זאת היהדות והקרימינולוגיה, זכתה בעבודה זו לתשובה כפולה ומצטלבת. הקרימינולוגיה העדכנית מסבירה את הפער המגדרי בראש ובראשונה בחיברות מגדרי, בפיקוח חברתי בלתי פורמלי דיפרנציאלי ובהבדלים בעיבוד מצוקה, לאחר שנטשה את ההסברים הביולוגיים-מהותניים של ראשיתה. היהדות, שהקדימה והעמידה את האישה כסובייקט מוסרי שווה-אחריות, מסבירה את מיעוט העבירה הנשית באמצעות אותם מנגנונים עצמם, בלבוש נורמטיבי: צניעות כתיחום זירות, קהילה כפיקוח, "בינה יתרה" כחוסן מוסרי. ההשוואה מלמדת כי שתי מערכות הידע זיהו את אותה אמת חברתית יסודית: העבירה משגשגת במרחבי הפקרות, והיא נבלמת בקשר, במחויבות ובמשמעות. אך ההשוואה גם מזהירה: מנגנוני מגן מגדריים גובים מחיר של חירות, והמבחן האמיתי, לחברה ההלכתית ולחברה הליברלית כאחת, הוא היכולת לשמר את גורמי המגן של קשר, קהילה ומשמעות, בלי לשלם בכבודן ובחירותן של נשים.</w:t>
+        <w:t xml:space="preserve">שאלת המחקר שהוצבה במבוא, מדוע נשים עוברות פחות עבירות מגברים וכיצד מוסבר הפער המגדרי בגישת היהדות לעומת הגישות בקרימינולוגיה, זכתה בעבודה זו לתשובה כפולה ומצטלבת. מצד הקרימינולוגיה, העבודה הראתה כי ההסברים העמידים ביותר אינם ביולוגיים אלא חברתיים: חיברות מגדרי המכוון בנות לריסון ולאחריות בין-אישית, פיקוח חברתי בלתי פורמלי דיפרנציאלי המצמצם את הזדמנויות העבירה שלהן, ועיבוד שונה של מצוקה, המופנה פנימה ולא החוצה. הממצאים העדכניים שנסקרו בפרק הרביעי חיזקו תמונה זו מכיוונים שונים: משתני משפחה מסבירים חלק מן הפער (Nilsson, 2017), הפער רחב יותר במדינות פטריארכליות ומתכווץ עם השוויון (Savolainen et al., 2017), והצטמצמותו במערב נובעת בעיקר מירידה בעבריינות גברים ומהרחבת רשת האכיפה, ולא משחרור הנשים (Estrada et al., 2016).</w:t>
+      </w:r>
+    </w:p>
+    <w:p>
+      <w:pPr>
+        <w:bidi/>
+        <w:spacing w:after="160" w:before="0" w:line="360"/>
+        <w:jc w:val="both"/>
+      </w:pPr>
+      <w:r>
+        <w:rPr>
+          <w:rFonts w:ascii="David" w:cs="David" w:eastAsia="David" w:hAnsi="David"/>
+          <w:sz w:val="24"/>
+          <w:szCs w:val="24"/>
+          <w:rtl/>
+        </w:rPr>
+        <w:t xml:space="preserve">מצד היהדות, העבודה הראתה כי המשפט העברי העמיד את האישה כסובייקט מוסרי שווה-אחריות מאות שנים לפני שהקרימינולוגיה המדעית נפרדה מהסבריה המהותניים, וכי המסורת מסבירה את מיעוט העבירה הנשית באמצעות אותם מנגנונים עצמם, בלבוש נורמטיבי: צניעות כתיחום זירות, קהילה כפיקוח, "בינה יתרה" כחוסן מוסרי, והרחבת גישה לצדק כמניעת עבריינות. ההשוואה מלמדת אפוא כי שתי מערכות הידע, שצמחו במרחק אלפי שנים זו מזו, זיהו את אותה אמת חברתית יסודית: העבירה משגשגת במרחבי הפקרות, והיא נבלמת בקשר, במחויבות ובמשמעות.</w:t>
+      </w:r>
+    </w:p>
+    <w:p>
+      <w:pPr>
+        <w:bidi/>
+        <w:spacing w:after="160" w:before="0" w:line="360"/>
+        <w:jc w:val="both"/>
+      </w:pPr>
+      <w:r>
+        <w:rPr>
+          <w:rFonts w:ascii="David" w:cs="David" w:eastAsia="David" w:hAnsi="David"/>
+          <w:sz w:val="24"/>
+          <w:szCs w:val="24"/>
+          <w:rtl/>
+        </w:rPr>
+        <w:t xml:space="preserve">מן המסקנות נגזרות שלוש המלצות יישומיות. ראשית, בתחום השיקום: מערך הטיפול בכלואות בישראל, המרוכז בנווה תרצה, ראוי שיכלול מיפוי שיטתי של היסטוריית קורבנות בקבלת כל אסירה, ותוכניות שיקום מגדריות-רגישות המשלבות רכיבי משמעות, קהילה ותיקון ברוח הקרימינולוגיה החיובית והרוחנית, שהראו תוצאות מבטיחות בקרב נשים (בן יאיר, 2021; יכימוביץ-כהן, 2017; Eytan &amp; Ronel, 2023). שנית, בתחום המניעה: הואיל ועבירות רבות של נשים צומחות מחסימת גישה לצדק ולאמצעים לגיטימיים, הרחבת הסיוע המשפטי והחברתי לנשים במצוקה היא כלי מניעת עבריינות ישיר, מסקנה שהעבודה הראתה כי היא מעוגנת כבר בקריאה המקראית (ברק-ארז, 2023). שלישית, בתחום האכיפה: על קובעי המדיניות להיזהר מהרחבת רשת ענישה על עבירות קלות של נשים מוחלשות, שכן הניסיון הבין-לאומי מלמד שכך נוצרת "התכנסות מגדרית" מדומה שמחירה מוטל על החלשות ביותר (Estrada et al., 2016; Sela-Shayovitz, 2017).</w:t>
+      </w:r>
+    </w:p>
+    <w:p>
+      <w:pPr>
+        <w:bidi/>
+        <w:spacing w:after="160" w:before="0" w:line="360"/>
+        <w:jc w:val="both"/>
+      </w:pPr>
+      <w:r>
+        <w:rPr>
+          <w:rFonts w:ascii="David" w:cs="David" w:eastAsia="David" w:hAnsi="David"/>
+          <w:sz w:val="24"/>
+          <w:szCs w:val="24"/>
+          <w:rtl/>
+        </w:rPr>
+        <w:t xml:space="preserve">בשורה התחתונה, ההשוואה בין היהדות לקרימינולוגיה אינה רק מפגש בין עבר להווה אלא גם אזהרה הדדית. מנגנוני מגן מגדריים גובים מחיר של חירות, והיחלשותם אינה מבטיחה שוויון מיטיב אלא עלולה להפקיר את הנשים הפגיעות ביותר. המבחן האמיתי, לחברה ההלכתית ולחברה הליברלית כאחת, הוא היכולת לשמר את גורמי המגן של קשר, קהילה ומשמעות, בלי לשלם בכבודן ובחירותן של נשים.</w:t>
       </w:r>
     </w:p>
     <w:p>

</xml_diff>

<commit_message>
Expand per instructions: psychological theories subsection and systematic Judaism-criminology differences
Co-Authored-By: Claude Fable 5 <noreply@anthropic.com>
Claude-Session: https://claude.ai/code/session_01YWm2c58o2zGAStwTniimJp
</commit_message>
<xml_diff>
--- a/seminar-paper/עבריינות נשים מהמקרא ועד ימינו - עבודה סמינריונית.docx
+++ b/seminar-paper/עבריינות נשים מהמקרא ועד ימינו - עבודה סמינריונית.docx
@@ -1029,7 +1029,43 @@
           <w:szCs w:val="26"/>
           <w:rtl/>
         </w:rPr>
-        <w:t xml:space="preserve">3.2 הביקורת הפמיניסטית ותיאוריות האמנציפציה</w:t>
+        <w:t xml:space="preserve">3.2 הסברים פסיכולוגיים במבחן המגדר</w:t>
+      </w:r>
+    </w:p>
+    <w:p>
+      <w:pPr>
+        <w:bidi/>
+        <w:spacing w:after="160" w:before="0" w:line="360"/>
+        <w:jc w:val="both"/>
+      </w:pPr>
+      <w:r>
+        <w:rPr>
+          <w:rFonts w:ascii="David" w:cs="David" w:eastAsia="David" w:hAnsi="David"/>
+          <w:sz w:val="24"/>
+          <w:szCs w:val="24"/>
+          <w:rtl/>
+        </w:rPr>
+        <w:t xml:space="preserve">לצד ההסברים הסוציולוגיים פיתחה הקרימינולוגיה גם הסברים פסיכולוגיים לעבריינות, ואף הם קיבלו צביון מגדרי. הגישה הפסיכואנליטית המוקדמת תלתה את העבריינות בכשלים התפתחותיים של מבני האישיות ובדחפים שלא עברו עיבוד (לרנאו, 2023), ובהקשר המגדרי נטתה לראות בעבריינית מי שחרגה מתפקידה הנשי, ברוח ההסברים המהותניים שנדונו לעיל. מושג פורה יותר לענייננו הוא טכניקות הנטרול, אותן הצדקות שמספר לעצמו העבריין כדי להשתיק את קול המצפון לפני העבירה ובמהלכה (לרנאו, 2023). במבחן המגדר, הטכניקות הללו מאירות את שני צידי הפער. מצד אחד, נשים נדרשות למאמץ נטרול גדול יותר: העבירה סותרת אצלן לא רק נורמה חוקית אלא גם את הציפיות המגדריות המופנמות, ולכן קול המצפון שיש להשתיק חזק יותר. מצד שני, כאשר העבירה מבוצעת למען אחרים, כפי שקורה בשכיחות גבוהה אצל נשים, ההצדקה של הקרבה למען המשפחה זמינה וחזקה במיוחד, כפי שהודגם בפרשת אלון (יוכט, 2019). ההסבר הפסיכולוגי אינו מתחרה אפוא בהסבר החברתי אלא משלים אותו: הנורמות המגדריות פועלות גם מבפנים, דרך המצפון וההצדקות.</w:t>
+      </w:r>
+    </w:p>
+    <w:p>
+      <w:pPr>
+        <w:pStyle w:val="Heading2"/>
+        <w:bidi/>
+        <w:spacing w:after="120" w:before="240" w:line="360"/>
+        <w:jc w:val="right"/>
+      </w:pPr>
+      <w:r>
+        <w:rPr>
+          <w:rFonts w:ascii="David" w:cs="David" w:eastAsia="David" w:hAnsi="David"/>
+          <w:b/>
+          <w:bCs/>
+          <w:color w:val="000000"/>
+          <w:sz w:val="26"/>
+          <w:szCs w:val="26"/>
+          <w:rtl/>
+        </w:rPr>
+        <w:t xml:space="preserve">3.3 הביקורת הפמיניסטית ותיאוריות האמנציפציה</w:t>
       </w:r>
     </w:p>
     <w:p>
@@ -1081,7 +1117,7 @@
           <w:szCs w:val="26"/>
           <w:rtl/>
         </w:rPr>
-        <w:t xml:space="preserve">3.3 הקרימינולוגיה הפמיניסטית הרדיקלית: פטריארכיה, קורבנות והפללה</w:t>
+        <w:t xml:space="preserve">3.4 הקרימינולוגיה הפמיניסטית הרדיקלית: פטריארכיה, קורבנות והפללה</w:t>
       </w:r>
     </w:p>
     <w:p>
@@ -1117,7 +1153,7 @@
           <w:szCs w:val="26"/>
           <w:rtl/>
         </w:rPr>
-        <w:t xml:space="preserve">3.4 תיאוריית הכוח-שליטה: המשפחה כזירת המפתח</w:t>
+        <w:t xml:space="preserve">3.5 תיאוריית הכוח-שליטה: המשפחה כזירת המפתח</w:t>
       </w:r>
     </w:p>
     <w:p>
@@ -1153,7 +1189,7 @@
           <w:szCs w:val="26"/>
           <w:rtl/>
         </w:rPr>
-        <w:t xml:space="preserve">3.5 תיאוריות הזרם המרכזי במבחן המגדר: אנומיה, פעילות שגרתית ולחץ</w:t>
+        <w:t xml:space="preserve">3.6 תיאוריות הזרם המרכזי במבחן המגדר: אנומיה, פעילות שגרתית ולחץ</w:t>
       </w:r>
     </w:p>
     <w:p>
@@ -1205,7 +1241,7 @@
           <w:szCs w:val="26"/>
           <w:rtl/>
         </w:rPr>
-        <w:t xml:space="preserve">3.6 קרימינולוגיה תרבותית, מגדר ודת</w:t>
+        <w:t xml:space="preserve">3.7 קרימינולוגיה תרבותית, מגדר ודת</w:t>
       </w:r>
     </w:p>
     <w:p>
@@ -1623,7 +1659,23 @@
           <w:szCs w:val="26"/>
           <w:rtl/>
         </w:rPr>
-        <w:t xml:space="preserve">5.2 נקודות מחלוקת והערכה ביקורתית</w:t>
+        <w:t xml:space="preserve">5.2 ההבדלים בין הגישות: נקודות מחלוקת והערכה ביקורתית</w:t>
+      </w:r>
+    </w:p>
+    <w:p>
+      <w:pPr>
+        <w:bidi/>
+        <w:spacing w:after="160" w:before="0" w:line="360"/>
+        <w:jc w:val="both"/>
+      </w:pPr>
+      <w:r>
+        <w:rPr>
+          <w:rFonts w:ascii="David" w:cs="David" w:eastAsia="David" w:hAnsi="David"/>
+          <w:sz w:val="24"/>
+          <w:szCs w:val="24"/>
+          <w:rtl/>
+        </w:rPr>
+        <w:t xml:space="preserve">קודם לבחינת המתחים, נדרש מיפוי של ההבדלים היסודיים בין שתי הגישות, בשלושה ממדים. בממד תמונת העבריינית: הקרימינולוגיה המודרנית רואה בה בראש ובראשונה תוצר של נסיבות, מבנים והזדמנויות, ואילו היהדות רואה בה סובייקט מוסרי בעל בחירה, שנסיבותיו מקילות אך אינן פוטרות. בממד יחידת הניתוח: הקרימינולוגיה מנתחת אוכלוסיות, שיעורים ומגמות, והיהדות מתבוננת בנפש היחיד ובקהילה המקיפה אותה. בממד תכלית התגובה לעבירה: הקרימינולוגיה שואפת להסביר, לנבא ולמנוע, ואילו היהדות שואפת לתקן, להשיב את החוטאת בתשובה ולרפא את הקרע החברתי שיצרה העבירה (בן יאיר, 2021; Ben Yair, 2021). הבדלים אלה אינם סותרים את נקודות המפגש שנסקרו לעיל אלא מסבירים את מקורן: שתי המערכות מגיעות למנגנונים דומים מתוך נקודות מוצא שונות בתכלית, וההבדלים הם שמזינים את המתחים שיוצגו כעת.</w:t>
       </w:r>
     </w:p>
     <w:p>

</xml_diff>

<commit_message>
Apply title emphasis in bibliography: bold for Hebrew, italics for English
Co-Authored-By: Claude Fable 5 <noreply@anthropic.com>
Claude-Session: https://claude.ai/code/session_01YWm2c58o2zGAStwTniimJp
</commit_message>
<xml_diff>
--- a/seminar-paper/עבריינות נשים מהמקרא ועד ימינו - עבודה סמינריונית.docx
+++ b/seminar-paper/עבריינות נשים מהמקרא ועד ימינו - עבודה סמינריונית.docx
@@ -1933,7 +1933,27 @@
           <w:szCs w:val="24"/>
           <w:rtl/>
         </w:rPr>
-        <w:t xml:space="preserve">בן יאיר, י' (2021). קרימינולוגיה רוחנית יהודית: בחזרה לשאלות יסוד. סוגיות חברתיות בישראל, 30(2), 368-337.</w:t>
+        <w:t xml:space="preserve">בן יאיר, י' (2021). קרימינולוגיה רוחנית יהודית: בחזרה לשאלות יסוד. </w:t>
+      </w:r>
+      <w:r>
+        <w:rPr>
+          <w:rFonts w:ascii="David" w:cs="David" w:eastAsia="David" w:hAnsi="David"/>
+          <w:b/>
+          <w:bCs/>
+          <w:sz w:val="24"/>
+          <w:szCs w:val="24"/>
+          <w:rtl/>
+        </w:rPr>
+        <w:t xml:space="preserve">סוגיות חברתיות בישראל, 30</w:t>
+      </w:r>
+      <w:r>
+        <w:rPr>
+          <w:rFonts w:ascii="David" w:cs="David" w:eastAsia="David" w:hAnsi="David"/>
+          <w:sz w:val="24"/>
+          <w:szCs w:val="24"/>
+          <w:rtl/>
+        </w:rPr>
+        <w:t xml:space="preserve">(2), 368-337.</w:t>
       </w:r>
     </w:p>
     <w:p>
@@ -1950,7 +1970,27 @@
           <w:szCs w:val="24"/>
           <w:rtl/>
         </w:rPr>
-        <w:t xml:space="preserve">ברק-ארז, ד' (2023). שופטות ומתדיינות בתנ"ך: על מגדר וגישה לצדק. משפט וממשל, כה, 28-15.</w:t>
+        <w:t xml:space="preserve">ברק-ארז, ד' (2023). שופטות ומתדיינות בתנ"ך: על מגדר וגישה לצדק. </w:t>
+      </w:r>
+      <w:r>
+        <w:rPr>
+          <w:rFonts w:ascii="David" w:cs="David" w:eastAsia="David" w:hAnsi="David"/>
+          <w:b/>
+          <w:bCs/>
+          <w:sz w:val="24"/>
+          <w:szCs w:val="24"/>
+          <w:rtl/>
+        </w:rPr>
+        <w:t xml:space="preserve">משפט וממשל, כה</w:t>
+      </w:r>
+      <w:r>
+        <w:rPr>
+          <w:rFonts w:ascii="David" w:cs="David" w:eastAsia="David" w:hAnsi="David"/>
+          <w:sz w:val="24"/>
+          <w:szCs w:val="24"/>
+          <w:rtl/>
+        </w:rPr>
+        <w:t xml:space="preserve">, 28-15.</w:t>
       </w:r>
     </w:p>
     <w:p>
@@ -1967,7 +2007,27 @@
           <w:szCs w:val="24"/>
           <w:rtl/>
         </w:rPr>
-        <w:t xml:space="preserve">יוכט, ע' (2019). טענת אתי-גונה: פרספקטיבות מגדריות על פרשת המעילה של אתי אלון. משפטים, מט, 673-619.</w:t>
+        <w:t xml:space="preserve">יוכט, ע' (2019). טענת אתי-גונה: פרספקטיבות מגדריות על פרשת המעילה של אתי אלון. </w:t>
+      </w:r>
+      <w:r>
+        <w:rPr>
+          <w:rFonts w:ascii="David" w:cs="David" w:eastAsia="David" w:hAnsi="David"/>
+          <w:b/>
+          <w:bCs/>
+          <w:sz w:val="24"/>
+          <w:szCs w:val="24"/>
+          <w:rtl/>
+        </w:rPr>
+        <w:t xml:space="preserve">משפטים, מט</w:t>
+      </w:r>
+      <w:r>
+        <w:rPr>
+          <w:rFonts w:ascii="David" w:cs="David" w:eastAsia="David" w:hAnsi="David"/>
+          <w:sz w:val="24"/>
+          <w:szCs w:val="24"/>
+          <w:rtl/>
+        </w:rPr>
+        <w:t xml:space="preserve">, 673-619.</w:t>
       </w:r>
     </w:p>
     <w:p>
@@ -1984,7 +2044,27 @@
           <w:szCs w:val="24"/>
           <w:rtl/>
         </w:rPr>
-        <w:t xml:space="preserve">יכימוביץ-כהן, נ' (2017). היבטים בכליאת נשים בישראל. הכנסת, מרכז המחקר והמידע.</w:t>
+        <w:t xml:space="preserve">יכימוביץ-כהן, נ' (2017). </w:t>
+      </w:r>
+      <w:r>
+        <w:rPr>
+          <w:rFonts w:ascii="David" w:cs="David" w:eastAsia="David" w:hAnsi="David"/>
+          <w:b/>
+          <w:bCs/>
+          <w:sz w:val="24"/>
+          <w:szCs w:val="24"/>
+          <w:rtl/>
+        </w:rPr>
+        <w:t xml:space="preserve">היבטים בכליאת נשים בישראל</w:t>
+      </w:r>
+      <w:r>
+        <w:rPr>
+          <w:rFonts w:ascii="David" w:cs="David" w:eastAsia="David" w:hAnsi="David"/>
+          <w:sz w:val="24"/>
+          <w:szCs w:val="24"/>
+          <w:rtl/>
+        </w:rPr>
+        <w:t xml:space="preserve">. הכנסת, מרכז המחקר והמידע.</w:t>
       </w:r>
     </w:p>
     <w:p>
@@ -2001,7 +2081,27 @@
           <w:szCs w:val="24"/>
           <w:rtl/>
         </w:rPr>
-        <w:t xml:space="preserve">לבנקרון, נ' (2021). החשודה המיידית: משטרת ישראל חוקרת המתת תינוקות בידי אימהותיהם ונטישתם (1968-1948). משטרה והיסטוריה, 3, 154-109.</w:t>
+        <w:t xml:space="preserve">לבנקרון, נ' (2021). החשודה המיידית: משטרת ישראל חוקרת המתת תינוקות בידי אימהותיהם ונטישתם (1968-1948). </w:t>
+      </w:r>
+      <w:r>
+        <w:rPr>
+          <w:rFonts w:ascii="David" w:cs="David" w:eastAsia="David" w:hAnsi="David"/>
+          <w:b/>
+          <w:bCs/>
+          <w:sz w:val="24"/>
+          <w:szCs w:val="24"/>
+          <w:rtl/>
+        </w:rPr>
+        <w:t xml:space="preserve">משטרה והיסטוריה, 3</w:t>
+      </w:r>
+      <w:r>
+        <w:rPr>
+          <w:rFonts w:ascii="David" w:cs="David" w:eastAsia="David" w:hAnsi="David"/>
+          <w:sz w:val="24"/>
+          <w:szCs w:val="24"/>
+          <w:rtl/>
+        </w:rPr>
+        <w:t xml:space="preserve">, 154-109.</w:t>
       </w:r>
     </w:p>
     <w:p>
@@ -2018,7 +2118,27 @@
           <w:szCs w:val="24"/>
           <w:rtl/>
         </w:rPr>
-        <w:t xml:space="preserve">לרנאו, ח' (2023). עבריינות ואכיפת החוק: תיאוריה, מדיניות וביקורת. פרדס.</w:t>
+        <w:t xml:space="preserve">לרנאו, ח' (2023). </w:t>
+      </w:r>
+      <w:r>
+        <w:rPr>
+          <w:rFonts w:ascii="David" w:cs="David" w:eastAsia="David" w:hAnsi="David"/>
+          <w:b/>
+          <w:bCs/>
+          <w:sz w:val="24"/>
+          <w:szCs w:val="24"/>
+          <w:rtl/>
+        </w:rPr>
+        <w:t xml:space="preserve">עבריינות ואכיפת החוק: תיאוריה, מדיניות וביקורת</w:t>
+      </w:r>
+      <w:r>
+        <w:rPr>
+          <w:rFonts w:ascii="David" w:cs="David" w:eastAsia="David" w:hAnsi="David"/>
+          <w:sz w:val="24"/>
+          <w:szCs w:val="24"/>
+          <w:rtl/>
+        </w:rPr>
+        <w:t xml:space="preserve">. פרדס.</w:t>
       </w:r>
     </w:p>
     <w:p>
@@ -2035,7 +2155,27 @@
           <w:szCs w:val="24"/>
           <w:rtl/>
         </w:rPr>
-        <w:t xml:space="preserve">פרישטוק, מ' (2019). ויקטימולוגיה ויהדות: תיאוריה, טיפולוגיה, טיפול, מדיניות ויישום. אח.</w:t>
+        <w:t xml:space="preserve">פרישטוק, מ' (2019). </w:t>
+      </w:r>
+      <w:r>
+        <w:rPr>
+          <w:rFonts w:ascii="David" w:cs="David" w:eastAsia="David" w:hAnsi="David"/>
+          <w:b/>
+          <w:bCs/>
+          <w:sz w:val="24"/>
+          <w:szCs w:val="24"/>
+          <w:rtl/>
+        </w:rPr>
+        <w:t xml:space="preserve">ויקטימולוגיה ויהדות: תיאוריה, טיפולוגיה, טיפול, מדיניות ויישום</w:t>
+      </w:r>
+      <w:r>
+        <w:rPr>
+          <w:rFonts w:ascii="David" w:cs="David" w:eastAsia="David" w:hAnsi="David"/>
+          <w:sz w:val="24"/>
+          <w:szCs w:val="24"/>
+          <w:rtl/>
+        </w:rPr>
+        <w:t xml:space="preserve">. אח.</w:t>
       </w:r>
     </w:p>
     <w:p>
@@ -2052,7 +2192,27 @@
           <w:szCs w:val="24"/>
           <w:rtl/>
         </w:rPr>
-        <w:t xml:space="preserve">קאר, ג' (2024). נרטיבים של התנגדות, פשרה מוסרית ופשיעה: העדויות של יוליה בריכטה, ניצולת רוונסבריק. דפים לחקר השואה, לו, 114-90.</w:t>
+        <w:t xml:space="preserve">קאר, ג' (2024). נרטיבים של התנגדות, פשרה מוסרית ופשיעה: העדויות של יוליה בריכטה, ניצולת רוונסבריק. </w:t>
+      </w:r>
+      <w:r>
+        <w:rPr>
+          <w:rFonts w:ascii="David" w:cs="David" w:eastAsia="David" w:hAnsi="David"/>
+          <w:b/>
+          <w:bCs/>
+          <w:sz w:val="24"/>
+          <w:szCs w:val="24"/>
+          <w:rtl/>
+        </w:rPr>
+        <w:t xml:space="preserve">דפים לחקר השואה, לו</w:t>
+      </w:r>
+      <w:r>
+        <w:rPr>
+          <w:rFonts w:ascii="David" w:cs="David" w:eastAsia="David" w:hAnsi="David"/>
+          <w:sz w:val="24"/>
+          <w:szCs w:val="24"/>
+          <w:rtl/>
+        </w:rPr>
+        <w:t xml:space="preserve">, 114-90.</w:t>
       </w:r>
     </w:p>
     <w:p>
@@ -2068,7 +2228,25 @@
           <w:sz w:val="24"/>
           <w:szCs w:val="24"/>
         </w:rPr>
-        <w:t xml:space="preserve">Adamczyk, A., Freilich, J. D., &amp; Kim, C. (2017). Religion and crime: A systematic review and assessment of next steps. Sociology of Religion, 78(2), 192-232. https://doi.org/10.1093/socrel/srx012</w:t>
+        <w:t xml:space="preserve">Adamczyk, A., Freilich, J. D., &amp; Kim, C. (2017). Religion and crime: A systematic review and assessment of next steps. </w:t>
+      </w:r>
+      <w:r>
+        <w:rPr>
+          <w:rFonts w:ascii="Times New Roman" w:cs="Times New Roman" w:eastAsia="Times New Roman" w:hAnsi="Times New Roman"/>
+          <w:i/>
+          <w:iCs/>
+          <w:sz w:val="24"/>
+          <w:szCs w:val="24"/>
+        </w:rPr>
+        <w:t xml:space="preserve">Sociology of Religion, 78</w:t>
+      </w:r>
+      <w:r>
+        <w:rPr>
+          <w:rFonts w:ascii="Times New Roman" w:cs="Times New Roman" w:eastAsia="Times New Roman" w:hAnsi="Times New Roman"/>
+          <w:sz w:val="24"/>
+          <w:szCs w:val="24"/>
+        </w:rPr>
+        <w:t xml:space="preserve">(2), 192-232. https://doi.org/10.1093/socrel/srx012</w:t>
       </w:r>
     </w:p>
     <w:p>
@@ -2084,7 +2262,25 @@
           <w:sz w:val="24"/>
           <w:szCs w:val="24"/>
         </w:rPr>
-        <w:t xml:space="preserve">Beatton, T., Kidd, M. P., &amp; Machin, S. (2018). Gender crime convergence over twenty years: Evidence from Australia. European Economic Review, 109, 275-288.</w:t>
+        <w:t xml:space="preserve">Beatton, T., Kidd, M. P., &amp; Machin, S. (2018). Gender crime convergence over twenty years: Evidence from Australia. </w:t>
+      </w:r>
+      <w:r>
+        <w:rPr>
+          <w:rFonts w:ascii="Times New Roman" w:cs="Times New Roman" w:eastAsia="Times New Roman" w:hAnsi="Times New Roman"/>
+          <w:i/>
+          <w:iCs/>
+          <w:sz w:val="24"/>
+          <w:szCs w:val="24"/>
+        </w:rPr>
+        <w:t xml:space="preserve">European Economic Review, 109</w:t>
+      </w:r>
+      <w:r>
+        <w:rPr>
+          <w:rFonts w:ascii="Times New Roman" w:cs="Times New Roman" w:eastAsia="Times New Roman" w:hAnsi="Times New Roman"/>
+          <w:sz w:val="24"/>
+          <w:szCs w:val="24"/>
+        </w:rPr>
+        <w:t xml:space="preserve">, 275-288.</w:t>
       </w:r>
     </w:p>
     <w:p>
@@ -2100,7 +2296,25 @@
           <w:sz w:val="24"/>
           <w:szCs w:val="24"/>
         </w:rPr>
-        <w:t xml:space="preserve">Ben Yair, Y. (2021). Intervention and rehabilitation methods with offenders—from the Jewish scriptures to the criminological field. Journal of Offender Rehabilitation, 60(1), 1-18.</w:t>
+        <w:t xml:space="preserve">Ben Yair, Y. (2021). Intervention and rehabilitation methods with offenders—from the Jewish scriptures to the criminological field. </w:t>
+      </w:r>
+      <w:r>
+        <w:rPr>
+          <w:rFonts w:ascii="Times New Roman" w:cs="Times New Roman" w:eastAsia="Times New Roman" w:hAnsi="Times New Roman"/>
+          <w:i/>
+          <w:iCs/>
+          <w:sz w:val="24"/>
+          <w:szCs w:val="24"/>
+        </w:rPr>
+        <w:t xml:space="preserve">Journal of Offender Rehabilitation, 60</w:t>
+      </w:r>
+      <w:r>
+        <w:rPr>
+          <w:rFonts w:ascii="Times New Roman" w:cs="Times New Roman" w:eastAsia="Times New Roman" w:hAnsi="Times New Roman"/>
+          <w:sz w:val="24"/>
+          <w:szCs w:val="24"/>
+        </w:rPr>
+        <w:t xml:space="preserve">(1), 1-18.</w:t>
       </w:r>
     </w:p>
     <w:p>
@@ -2116,7 +2330,25 @@
           <w:sz w:val="24"/>
           <w:szCs w:val="24"/>
         </w:rPr>
-        <w:t xml:space="preserve">Campaniello, N. (2019). Women in crime. IZA World of Labor, 105(2), 1-12.</w:t>
+        <w:t xml:space="preserve">Campaniello, N. (2019). Women in crime. </w:t>
+      </w:r>
+      <w:r>
+        <w:rPr>
+          <w:rFonts w:ascii="Times New Roman" w:cs="Times New Roman" w:eastAsia="Times New Roman" w:hAnsi="Times New Roman"/>
+          <w:i/>
+          <w:iCs/>
+          <w:sz w:val="24"/>
+          <w:szCs w:val="24"/>
+        </w:rPr>
+        <w:t xml:space="preserve">IZA World of Labor, 105</w:t>
+      </w:r>
+      <w:r>
+        <w:rPr>
+          <w:rFonts w:ascii="Times New Roman" w:cs="Times New Roman" w:eastAsia="Times New Roman" w:hAnsi="Times New Roman"/>
+          <w:sz w:val="24"/>
+          <w:szCs w:val="24"/>
+        </w:rPr>
+        <w:t xml:space="preserve">(2), 1-12.</w:t>
       </w:r>
     </w:p>
     <w:p>
@@ -2132,7 +2364,25 @@
           <w:sz w:val="24"/>
           <w:szCs w:val="24"/>
         </w:rPr>
-        <w:t xml:space="preserve">Estrada, F., Bäckman, O., &amp; Nilsson, A. (2016). The darker side of equality? The declining gender gap in crime: Historical trends and an enhanced analysis of staggered birth cohorts. British Journal of Criminology, 56(6), 1272-1290. https://doi.org/10.1093/bjc/azv114</w:t>
+        <w:t xml:space="preserve">Estrada, F., Bäckman, O., &amp; Nilsson, A. (2016). The darker side of equality? The declining gender gap in crime: Historical trends and an enhanced analysis of staggered birth cohorts. </w:t>
+      </w:r>
+      <w:r>
+        <w:rPr>
+          <w:rFonts w:ascii="Times New Roman" w:cs="Times New Roman" w:eastAsia="Times New Roman" w:hAnsi="Times New Roman"/>
+          <w:i/>
+          <w:iCs/>
+          <w:sz w:val="24"/>
+          <w:szCs w:val="24"/>
+        </w:rPr>
+        <w:t xml:space="preserve">British Journal of Criminology, 56</w:t>
+      </w:r>
+      <w:r>
+        <w:rPr>
+          <w:rFonts w:ascii="Times New Roman" w:cs="Times New Roman" w:eastAsia="Times New Roman" w:hAnsi="Times New Roman"/>
+          <w:sz w:val="24"/>
+          <w:szCs w:val="24"/>
+        </w:rPr>
+        <w:t xml:space="preserve">(6), 1272-1290. https://doi.org/10.1093/bjc/azv114</w:t>
       </w:r>
     </w:p>
     <w:p>
@@ -2148,7 +2398,25 @@
           <w:sz w:val="24"/>
           <w:szCs w:val="24"/>
         </w:rPr>
-        <w:t xml:space="preserve">Eytan, S., &amp; Ronel, N. (2023). From looking for reason to finding meaning: A spiritual journey of recovery from sexual trauma. Journal of Interpersonal Violence, 38(11-12), 7404-7425.</w:t>
+        <w:t xml:space="preserve">Eytan, S., &amp; Ronel, N. (2023). From looking for reason to finding meaning: A spiritual journey of recovery from sexual trauma. </w:t>
+      </w:r>
+      <w:r>
+        <w:rPr>
+          <w:rFonts w:ascii="Times New Roman" w:cs="Times New Roman" w:eastAsia="Times New Roman" w:hAnsi="Times New Roman"/>
+          <w:i/>
+          <w:iCs/>
+          <w:sz w:val="24"/>
+          <w:szCs w:val="24"/>
+        </w:rPr>
+        <w:t xml:space="preserve">Journal of Interpersonal Violence, 38</w:t>
+      </w:r>
+      <w:r>
+        <w:rPr>
+          <w:rFonts w:ascii="Times New Roman" w:cs="Times New Roman" w:eastAsia="Times New Roman" w:hAnsi="Times New Roman"/>
+          <w:sz w:val="24"/>
+          <w:szCs w:val="24"/>
+        </w:rPr>
+        <w:t xml:space="preserve">(11-12), 7404-7425.</w:t>
       </w:r>
     </w:p>
     <w:p>
@@ -2164,7 +2432,25 @@
           <w:sz w:val="24"/>
           <w:szCs w:val="24"/>
         </w:rPr>
-        <w:t xml:space="preserve">Naegler, L., &amp; Salman, S. (2016). Cultural criminology and gender consciousness: Moving feminist theory from margin to center. Feminist Criminology, 11(4), 354-374.</w:t>
+        <w:t xml:space="preserve">Naegler, L., &amp; Salman, S. (2016). Cultural criminology and gender consciousness: Moving feminist theory from margin to center. </w:t>
+      </w:r>
+      <w:r>
+        <w:rPr>
+          <w:rFonts w:ascii="Times New Roman" w:cs="Times New Roman" w:eastAsia="Times New Roman" w:hAnsi="Times New Roman"/>
+          <w:i/>
+          <w:iCs/>
+          <w:sz w:val="24"/>
+          <w:szCs w:val="24"/>
+        </w:rPr>
+        <w:t xml:space="preserve">Feminist Criminology, 11</w:t>
+      </w:r>
+      <w:r>
+        <w:rPr>
+          <w:rFonts w:ascii="Times New Roman" w:cs="Times New Roman" w:eastAsia="Times New Roman" w:hAnsi="Times New Roman"/>
+          <w:sz w:val="24"/>
+          <w:szCs w:val="24"/>
+        </w:rPr>
+        <w:t xml:space="preserve">(4), 354-374.</w:t>
       </w:r>
     </w:p>
     <w:p>
@@ -2180,7 +2466,25 @@
           <w:sz w:val="24"/>
           <w:szCs w:val="24"/>
         </w:rPr>
-        <w:t xml:space="preserve">Nilsson, E.-L. (2017). Analyzing gender differences in the relationship between family influences and adolescent offending among boys and girls. Child Indicators Research, 10(4), 1079-1094. https://doi.org/10.1007/s12187-016-9435-6</w:t>
+        <w:t xml:space="preserve">Nilsson, E.-L. (2017). Analyzing gender differences in the relationship between family influences and adolescent offending among boys and girls. </w:t>
+      </w:r>
+      <w:r>
+        <w:rPr>
+          <w:rFonts w:ascii="Times New Roman" w:cs="Times New Roman" w:eastAsia="Times New Roman" w:hAnsi="Times New Roman"/>
+          <w:i/>
+          <w:iCs/>
+          <w:sz w:val="24"/>
+          <w:szCs w:val="24"/>
+        </w:rPr>
+        <w:t xml:space="preserve">Child Indicators Research, 10</w:t>
+      </w:r>
+      <w:r>
+        <w:rPr>
+          <w:rFonts w:ascii="Times New Roman" w:cs="Times New Roman" w:eastAsia="Times New Roman" w:hAnsi="Times New Roman"/>
+          <w:sz w:val="24"/>
+          <w:szCs w:val="24"/>
+        </w:rPr>
+        <w:t xml:space="preserve">(4), 1079-1094. https://doi.org/10.1007/s12187-016-9435-6</w:t>
       </w:r>
     </w:p>
     <w:p>
@@ -2196,7 +2500,25 @@
           <w:sz w:val="24"/>
           <w:szCs w:val="24"/>
         </w:rPr>
-        <w:t xml:space="preserve">Savolainen, J., Applin, S., Messner, S. F., Hughes, L. A., Lytle, R., &amp; Kivivuori, J. (2017). Does the gender gap in delinquency vary by level of patriarchy? A cross-national comparative analysis. Criminology, 55(4), 726-753. https://doi.org/10.1111/1745-9125.12161</w:t>
+        <w:t xml:space="preserve">Savolainen, J., Applin, S., Messner, S. F., Hughes, L. A., Lytle, R., &amp; Kivivuori, J. (2017). Does the gender gap in delinquency vary by level of patriarchy? A cross-national comparative analysis. </w:t>
+      </w:r>
+      <w:r>
+        <w:rPr>
+          <w:rFonts w:ascii="Times New Roman" w:cs="Times New Roman" w:eastAsia="Times New Roman" w:hAnsi="Times New Roman"/>
+          <w:i/>
+          <w:iCs/>
+          <w:sz w:val="24"/>
+          <w:szCs w:val="24"/>
+        </w:rPr>
+        <w:t xml:space="preserve">Criminology, 55</w:t>
+      </w:r>
+      <w:r>
+        <w:rPr>
+          <w:rFonts w:ascii="Times New Roman" w:cs="Times New Roman" w:eastAsia="Times New Roman" w:hAnsi="Times New Roman"/>
+          <w:sz w:val="24"/>
+          <w:szCs w:val="24"/>
+        </w:rPr>
+        <w:t xml:space="preserve">(4), 726-753. https://doi.org/10.1111/1745-9125.12161</w:t>
       </w:r>
     </w:p>
     <w:p>
@@ -2212,7 +2534,25 @@
           <w:sz w:val="24"/>
           <w:szCs w:val="24"/>
         </w:rPr>
-        <w:t xml:space="preserve">Sela-Shayovitz, R. (2017). Where are the girls? Gender trends in juvenile crime. Journal of Social Science Studies, 4(2), 71-85.</w:t>
+        <w:t xml:space="preserve">Sela-Shayovitz, R. (2017). Where are the girls? Gender trends in juvenile crime. </w:t>
+      </w:r>
+      <w:r>
+        <w:rPr>
+          <w:rFonts w:ascii="Times New Roman" w:cs="Times New Roman" w:eastAsia="Times New Roman" w:hAnsi="Times New Roman"/>
+          <w:i/>
+          <w:iCs/>
+          <w:sz w:val="24"/>
+          <w:szCs w:val="24"/>
+        </w:rPr>
+        <w:t xml:space="preserve">Journal of Social Science Studies, 4</w:t>
+      </w:r>
+      <w:r>
+        <w:rPr>
+          <w:rFonts w:ascii="Times New Roman" w:cs="Times New Roman" w:eastAsia="Times New Roman" w:hAnsi="Times New Roman"/>
+          <w:sz w:val="24"/>
+          <w:szCs w:val="24"/>
+        </w:rPr>
+        <w:t xml:space="preserve">(2), 71-85.</w:t>
       </w:r>
     </w:p>
     <w:p>
@@ -2228,7 +2568,25 @@
           <w:sz w:val="24"/>
           <w:szCs w:val="24"/>
         </w:rPr>
-        <w:t xml:space="preserve">van der Heijden, M. (2024). Long-term trends in gender and crime. Crime and Justice, 53(1). https://doi.org/10.1086/733433</w:t>
+        <w:t xml:space="preserve">van der Heijden, M. (2024). Long-term trends in gender and crime. </w:t>
+      </w:r>
+      <w:r>
+        <w:rPr>
+          <w:rFonts w:ascii="Times New Roman" w:cs="Times New Roman" w:eastAsia="Times New Roman" w:hAnsi="Times New Roman"/>
+          <w:i/>
+          <w:iCs/>
+          <w:sz w:val="24"/>
+          <w:szCs w:val="24"/>
+        </w:rPr>
+        <w:t xml:space="preserve">Crime and Justice, 53</w:t>
+      </w:r>
+      <w:r>
+        <w:rPr>
+          <w:rFonts w:ascii="Times New Roman" w:cs="Times New Roman" w:eastAsia="Times New Roman" w:hAnsi="Times New Roman"/>
+          <w:sz w:val="24"/>
+          <w:szCs w:val="24"/>
+        </w:rPr>
+        <w:t xml:space="preserve">(1). https://doi.org/10.1086/733433</w:t>
       </w:r>
     </w:p>
     <w:p>

</xml_diff>

<commit_message>
Add female desistance subsection with Rodermond et al. 2016 and 2023
Co-Authored-By: Claude Fable 5 <noreply@anthropic.com>
Claude-Session: https://claude.ai/code/session_01YWm2c58o2zGAStwTniimJp
</commit_message>
<xml_diff>
--- a/seminar-paper/עבריינות נשים מהמקרא ועד ימינו - עבודה סמינריונית.docx
+++ b/seminar-paper/עבריינות נשים מהמקרא ועד ימינו - עבודה סמינריונית.docx
@@ -1571,6 +1571,58 @@
     </w:p>
     <w:p>
       <w:pPr>
+        <w:pStyle w:val="Heading2"/>
+        <w:bidi/>
+        <w:spacing w:after="120" w:before="240" w:line="360"/>
+        <w:jc w:val="right"/>
+      </w:pPr>
+      <w:r>
+        <w:rPr>
+          <w:rFonts w:ascii="David" w:cs="David" w:eastAsia="David" w:hAnsi="David"/>
+          <w:b/>
+          <w:bCs/>
+          <w:color w:val="000000"/>
+          <w:sz w:val="26"/>
+          <w:szCs w:val="26"/>
+          <w:rtl/>
+        </w:rPr>
+        <w:t xml:space="preserve">4.5 חדילה נשית מפשיעה</w:t>
+      </w:r>
+    </w:p>
+    <w:p>
+      <w:pPr>
+        <w:bidi/>
+        <w:spacing w:after="160" w:before="0" w:line="360"/>
+        <w:jc w:val="both"/>
+      </w:pPr>
+      <w:r>
+        <w:rPr>
+          <w:rFonts w:ascii="David" w:cs="David" w:eastAsia="David" w:hAnsi="David"/>
+          <w:sz w:val="24"/>
+          <w:szCs w:val="24"/>
+          <w:rtl/>
+        </w:rPr>
+        <w:t xml:space="preserve">ענף מחקר עדכני נוסף בוחן את הצד השני של המטבע: לא מדוע נשים נכנסות לעבריינות, אלא כיצד הן יוצאות ממנה. רודרמונד ועמיתיה (Rodermond et al., 2016) סקרו 44 מחקרים על חדילה נשית מפשיעה ומצאו כי התיאוריות שפותחו על גברים ישימות ברובן גם לנשים, אך משקלם של הגורמים שונה: אצל נשים בולטים במיוחד הילדים והקשרים התומכים, לצד עצמאות כלכלית, הימנעות מסמים ותחושת מסוגלות אישית. במילים אחרות, אותם גורמי קשר ומחויבות שממתנים את כניסתן של נשים לעבריינות הם גם המנוף המרכזי ליציאתן ממנה.</w:t>
+      </w:r>
+    </w:p>
+    <w:p>
+      <w:pPr>
+        <w:bidi/>
+        <w:spacing w:after="160" w:before="0" w:line="360"/>
+        <w:jc w:val="both"/>
+      </w:pPr>
+      <w:r>
+        <w:rPr>
+          <w:rFonts w:ascii="David" w:cs="David" w:eastAsia="David" w:hAnsi="David"/>
+          <w:sz w:val="24"/>
+          <w:szCs w:val="24"/>
+          <w:rtl/>
+        </w:rPr>
+        <w:t xml:space="preserve">מחקר המשך רחב היקף עקב אחר 1,478 נשים ששוחררו ממאסר בהולנד לאורך שבע שנים (Rodermond et al., 2023). ממצאיו מפכחים: תהליכי שינוי פנימיים והון חברתי אכן מקדמים חדילה, אולם מצוקת משאבים קשה לאחר השחרור, עוני, חוב והיעדר דיור, מערערת את התהליך גם אצל נשים שכבר החלו בו. ממצאים אלה מתכתבים במישרין עם שני צירים בעבודה זו: עם תפיסת התשובה שנדונה בפרק השני, הרואה בשיבה מן העבירה תהליך התלוי בקשר, בקהילה ובמשמעות, ועם ההמלצה היישומית שתפורט בפרק החמישי בדבר שיקום מגדרי-רגיש המלווה גם בתמיכה חומרית.</w:t>
+      </w:r>
+    </w:p>
+    <w:p>
+      <w:pPr>
         <w:pStyle w:val="Heading1"/>
         <w:pageBreakBefore/>
         <w:bidi/>
@@ -2485,6 +2537,74 @@
           <w:szCs w:val="24"/>
         </w:rPr>
         <w:t xml:space="preserve">(4), 1079-1094. https://doi.org/10.1007/s12187-016-9435-6</w:t>
+      </w:r>
+    </w:p>
+    <w:p>
+      <w:pPr>
+        <w:bidi w:val="false"/>
+        <w:spacing w:after="160" w:line="360"/>
+        <w:ind w:left="709" w:hanging="709"/>
+        <w:jc w:val="left"/>
+      </w:pPr>
+      <w:r>
+        <w:rPr>
+          <w:rFonts w:ascii="Times New Roman" w:cs="Times New Roman" w:eastAsia="Times New Roman" w:hAnsi="Times New Roman"/>
+          <w:sz w:val="24"/>
+          <w:szCs w:val="24"/>
+        </w:rPr>
+        <w:t xml:space="preserve">Rodermond, E., Kruttschnitt, C., Slotboom, A.-M., &amp; Bijleveld, C. C. J. H. (2016). Female desistance: A review of the literature. </w:t>
+      </w:r>
+      <w:r>
+        <w:rPr>
+          <w:rFonts w:ascii="Times New Roman" w:cs="Times New Roman" w:eastAsia="Times New Roman" w:hAnsi="Times New Roman"/>
+          <w:i/>
+          <w:iCs/>
+          <w:sz w:val="24"/>
+          <w:szCs w:val="24"/>
+        </w:rPr>
+        <w:t xml:space="preserve">European Journal of Criminology, 13</w:t>
+      </w:r>
+      <w:r>
+        <w:rPr>
+          <w:rFonts w:ascii="Times New Roman" w:cs="Times New Roman" w:eastAsia="Times New Roman" w:hAnsi="Times New Roman"/>
+          <w:sz w:val="24"/>
+          <w:szCs w:val="24"/>
+        </w:rPr>
+        <w:t xml:space="preserve">(1), 3-28. https://doi.org/10.1177/1477370815597251</w:t>
+      </w:r>
+    </w:p>
+    <w:p>
+      <w:pPr>
+        <w:bidi w:val="false"/>
+        <w:spacing w:after="160" w:line="360"/>
+        <w:ind w:left="709" w:hanging="709"/>
+        <w:jc w:val="left"/>
+      </w:pPr>
+      <w:r>
+        <w:rPr>
+          <w:rFonts w:ascii="Times New Roman" w:cs="Times New Roman" w:eastAsia="Times New Roman" w:hAnsi="Times New Roman"/>
+          <w:sz w:val="24"/>
+          <w:szCs w:val="24"/>
+        </w:rPr>
+        <w:t xml:space="preserve">Rodermond, E., Van de Weijer, S., Lindegaard, M. R., Bijleveld, C. C. J. H., Slotboom, A.-M., &amp; Kruttschnitt, C. (2023). Out of prison, out of crime? The complex interplay between the process of desistance and severe resource disadvantages in women's post-release lives. </w:t>
+      </w:r>
+      <w:r>
+        <w:rPr>
+          <w:rFonts w:ascii="Times New Roman" w:cs="Times New Roman" w:eastAsia="Times New Roman" w:hAnsi="Times New Roman"/>
+          <w:i/>
+          <w:iCs/>
+          <w:sz w:val="24"/>
+          <w:szCs w:val="24"/>
+        </w:rPr>
+        <w:t xml:space="preserve">European Journal of Criminology, 20</w:t>
+      </w:r>
+      <w:r>
+        <w:rPr>
+          <w:rFonts w:ascii="Times New Roman" w:cs="Times New Roman" w:eastAsia="Times New Roman" w:hAnsi="Times New Roman"/>
+          <w:sz w:val="24"/>
+          <w:szCs w:val="24"/>
+        </w:rPr>
+        <w:t xml:space="preserve">(6), 1852-1877. https://doi.org/10.1177/14773708221097667</w:t>
       </w:r>
     </w:p>
     <w:p>

</xml_diff>

<commit_message>
Correct source representations after full-text verification (Nilsson, Savolainen)
Co-Authored-By: Claude Fable 5 <noreply@anthropic.com>
Claude-Session: https://claude.ai/code/session_01YWm2c58o2zGAStwTniimJp
</commit_message>
<xml_diff>
--- a/seminar-paper/עבריינות נשים מהמקרא ועד ימינו - עבודה סמינריונית.docx
+++ b/seminar-paper/עבריינות נשים מהמקרא ועד ימינו - עבודה סמינריונית.docx
@@ -1205,7 +1205,7 @@
           <w:szCs w:val="24"/>
           <w:rtl/>
         </w:rPr>
-        <w:t xml:space="preserve">גם תיאוריות היסוד של הדיסציפלינה מקבלות משמעות חדשה כשבוחנים אותן במבחן המגדר. תיאוריית האנומיה של מרטון, הרואה בעבריינות תגובה לפער שבין המטרות התרבותיות לבין האמצעים הלגיטימיים להשגתן, נתקלת בקושי מגדרי מובנה: לאורך רוב ההיסטוריה חסמה החברה בפני נשים את האמצעים הלגיטימיים יותר משחסמה אותם בפני גברים, ולפי היגיון התיאוריה היה מקום לצפות דווקא לעבריינות נשית גבוהה יותר (לרנאו, 2023). תיאוריית הפעילות השגרתית, מבית הגישה הניאו-קלאסית, מציעה הסבר הפוך בפשטותו: עבירה מתרחשת במפגש בין עבריין בעל מוטיבציה, מטרה זמינה והיעדר שומר, ושגרת חייהן ההיסטורית של נשים, שהתרכזה בבית ובמשפחה, זימנה להן פחות הזדמנויות עבירה ויותר נוכחות של שומרים (לרנאו, 2023). ברוח דומה, עקרון ההתחברות הדיפרנציאלית מסביר את הפער בכך שבנות חשופות פחות לקבוצות עמיתים עברייניות, בין היתר בשל הפיקוח ההורי המוגבר עליהן (Nilsson, 2017).</w:t>
+        <w:t xml:space="preserve">גם תיאוריות היסוד של הדיסציפלינה מקבלות משמעות חדשה כשבוחנים אותן במבחן המגדר. תיאוריית האנומיה של מרטון, הרואה בעבריינות תגובה לפער שבין המטרות התרבותיות לבין האמצעים הלגיטימיים להשגתן, נתקלת בקושי מגדרי מובנה: לאורך רוב ההיסטוריה חסמה החברה בפני נשים את האמצעים הלגיטימיים יותר משחסמה אותם בפני גברים, ולפי היגיון התיאוריה היה מקום לצפות דווקא לעבריינות נשית גבוהה יותר (לרנאו, 2023). תיאוריית הפעילות השגרתית, מבית הגישה הניאו-קלאסית, מציעה הסבר הפוך בפשטותו: עבירה מתרחשת במפגש בין עבריין בעל מוטיבציה, מטרה זמינה והיעדר שומר, ושגרת חייהן ההיסטורית של נשים, שהתרכזה בבית ובמשפחה, זימנה להן פחות הזדמנויות עבירה ויותר נוכחות של שומרים (לרנאו, 2023). ברוח דומה, עקרון ההתחברות הדיפרנציאלית מסביר את הפער בכך שבנות חשופות פחות לקבוצות עמיתים עברייניות, בין היתר בשל הפיקוח ההורי המוגבר עליהן (לרנאו, 2023).</w:t>
       </w:r>
     </w:p>
     <w:p>
@@ -1362,7 +1362,7 @@
           <w:szCs w:val="24"/>
           <w:rtl/>
         </w:rPr>
-        <w:t xml:space="preserve">תמונה משלימה ברמה הבין-לאומית עולה ממחקרם של סבולאינן ועמיתיו (Savolainen et al., 2017), שקישרו נתוני עבריינות בדיווח עצמי של בני נוער משלושים מדינות (סקר ISRD-2) עם מדדים ערכיים ומבניים של פטריארכליות. ממצאם המרכזי: הפער המגדרי בעבריינות גדול יותר במדינות שבהן עמדות פטריארכליות חזקות ואי-שוויון מגדרי גבוה, וצר יותר במדינות שוויוניות, שבהן הבנות עוברות מעט יותר עבירות והבנים פחות. הממצא מדגים כיצד המבנה המגדרי של החברה מעצב את היקף הפער, והוא בעל חשיבות ישירה לדיון ההשוואתי שייערך בפרק החמישי.</w:t>
+        <w:t xml:space="preserve">תמונה משלימה ברמה הבין-לאומית עולה ממחקרם של סבולאינן ועמיתיו (Savolainen et al., 2017), שקישרו נתוני עבריינות בדיווח עצמי של בני נוער מ-27 מדינות (סקר ISRD-2) עם מדדים ערכיים ומבניים של פטריארכליות. ממצאם המרכזי: הפער המגדרי בעבריינות גדול יותר במדינות שבהן עמדות פטריארכליות חזקות ואי-שוויון מגדרי גבוה, וצר יותר במדינות שוויוניות, בעיקר משום שהבנות בהן עוברות מעט יותר עבירות, ובמידת מה גם משום שהבנים עוברים פחות. הממצא מדגים כיצד המבנה המגדרי של החברה מעצב את היקף הפער, והוא בעל חשיבות ישירה לדיון ההשוואתי שייערך בפרק החמישי.</w:t>
       </w:r>
     </w:p>
     <w:p>
@@ -1430,7 +1430,7 @@
           <w:szCs w:val="24"/>
           <w:rtl/>
         </w:rPr>
-        <w:t xml:space="preserve">נילסון (Nilsson, 2017) בחנה מנגנון מרכזי אחר על מדגם של 889 מתבגרים בעיר הלמסטד שבשוודיה: תפקידם של משתני המשפחה בהסבר הפער המגדרי בעבריינות נוער. ממצאיה עקביים עם תיאוריות הפיקוח: בנות דיווחו על רמות גבוהות יותר של קשר להורים ושל פיקוח הורי, משתנים אלה נמצאו קשורים לעבריינות אצל שני המינים, והם מסבירים חלק מן הפער המגדרי בהתנהגות העבריינית. ממצא זה מספק תמיכה אמפירית עדכנית לטענה המרכזית של עבודה זו, שלפיה הפער המגדרי מתווך במידה רבה על ידי פיקוח וקשר משפחתי, ולא על ידי נטיות מולדות.</w:t>
+        <w:t xml:space="preserve">נילסון (Nilsson, 2017) בחנה מנגנון מרכזי אחר על מדגם של 889 מתבגרים בעיר הלמסטד שבשוודיה: תפקידם של משתני המשפחה, ובראשם הקשר להורים והפיקוח ההורי, בהסבר הפער המגדרי בעבריינות נוער. ממצאיה מורכבים: בנים דיווחו על יותר עבריינות, ונמצאו הבדלים מגדריים ברורים הן ברמות משתני המשפחה הן בקשרים שבינם לבין עבריינות; ואולם, בניגוד לציפייה התיאורטית, משתני המשפחה לבדם לא הצליחו להסביר את הפער המגדרי. הממצא חשוב דווקא במורכבותו: הוא מלמד שהפיקוח המשפחתי הוא חלק מן התמונה אך אינו כולה, ושנדרש הסבר רב-ממדי המשלב גם נורמות מופנמות, הזדמנויות ותהליכים פנימיים, ברוח התיאוריות שהוצגו בפרק השלישי.</w:t>
       </w:r>
     </w:p>
     <w:p>
@@ -1466,7 +1466,7 @@
           <w:szCs w:val="24"/>
           <w:rtl/>
         </w:rPr>
-        <w:t xml:space="preserve">הספרות העדכנית מסכמת שלושה ממצאי ליבה: ראשית, הפער המגדרי נותר עמיד במיוחד בעבירות החמורות בכל שיטות המדידה (Campaniello, 2019); שנית, ההסברים הנתמכים ביותר הם חיברות מגדרי ופיקוח חברתי דיפרנציאלי, ולא הבדלים ביולוגיים (Nilsson, 2017; Savolainen et al., 2017); שלישית, מסלולי הכניסה של נשים לעבריינות שזורים בקורבנות קודמת, בעוני ובתלות בבני זוג, ומכאן שנדרשת מדיניות ענישה ושיקום מגדרית-רגישה (Gender-Responsive) (יוכט, 2019; פרישטוק, 2019). ממצאים אלה מקנים תוקף אמפירי עדכני לתיאוריות הפמיניסטיות שנסקרו בפרק הקודם.</w:t>
+        <w:t xml:space="preserve">הספרות העדכנית מסכמת שלושה ממצאי ליבה: ראשית, הפער המגדרי נותר עמיד במיוחד בעבירות החמורות בכל שיטות המדידה (Campaniello, 2019); שנית, ההסברים הנתמכים ביותר הם חיברות מגדרי ופיקוח חברתי דיפרנציאלי, ולא הבדלים ביולוגיים (Savolainen et al., 2017); שלישית, מסלולי הכניסה של נשים לעבריינות שזורים בקורבנות קודמת, בעוני ובתלות בבני זוג, ומכאן שנדרשת מדיניות ענישה ושיקום מגדרית-רגישה (Gender-Responsive) (יוכט, 2019; פרישטוק, 2019). ממצאים אלה מקנים תוקף אמפירי עדכני לתיאוריות הפמיניסטיות שנסקרו בפרק הקודם.</w:t>
       </w:r>
     </w:p>
     <w:p>
@@ -1899,7 +1899,7 @@
           <w:szCs w:val="24"/>
           <w:rtl/>
         </w:rPr>
-        <w:t xml:space="preserve">שאלת המחקר שהוצבה במבוא, מדוע נשים עוברות פחות עבירות מגברים וכיצד מוסבר הפער המגדרי בגישת היהדות לעומת הגישות בקרימינולוגיה, זכתה בעבודה זו לתשובה כפולה ומצטלבת. מצד הקרימינולוגיה, העבודה הראתה כי ההסברים העמידים ביותר אינם ביולוגיים אלא חברתיים: חיברות מגדרי המכוון בנות לריסון ולאחריות בין-אישית, פיקוח חברתי בלתי פורמלי דיפרנציאלי המצמצם את הזדמנויות העבירה שלהן, ועיבוד שונה של מצוקה, המופנה פנימה ולא החוצה. הממצאים העדכניים שנסקרו בפרק הרביעי חיזקו תמונה זו מכיוונים שונים: משתני משפחה מסבירים חלק מן הפער (Nilsson, 2017), הפער רחב יותר במדינות פטריארכליות ומתכווץ עם השוויון (Savolainen et al., 2017), והצטמצמותו במערב נובעת בעיקר מירידה בעבריינות גברים ומהרחבת רשת האכיפה, ולא משחרור הנשים (Estrada et al., 2016).</w:t>
+        <w:t xml:space="preserve">שאלת המחקר שהוצבה במבוא, מדוע נשים עוברות פחות עבירות מגברים וכיצד מוסבר הפער המגדרי בגישת היהדות לעומת הגישות בקרימינולוגיה, זכתה בעבודה זו לתשובה כפולה ומצטלבת. מצד הקרימינולוגיה, העבודה הראתה כי ההסברים העמידים ביותר אינם ביולוגיים אלא חברתיים: חיברות מגדרי המכוון בנות לריסון ולאחריות בין-אישית, פיקוח חברתי בלתי פורמלי דיפרנציאלי המצמצם את הזדמנויות העבירה שלהן, ועיבוד שונה של מצוקה, המופנה פנימה ולא החוצה. הממצאים העדכניים שנסקרו בפרק הרביעי חיזקו תמונה זו מכיוונים שונים: משתני המשפחה חשובים אך אינם מסבירים לבדם את הפער (Nilsson, 2017), הפער רחב יותר במדינות פטריארכליות ומתכווץ עם השוויון (Savolainen et al., 2017), והצטמצמותו במערב נובעת בעיקר מירידה בעבריינות גברים ומהרחבת רשת האכיפה, ולא משחרור הנשים (Estrada et al., 2016).</w:t>
       </w:r>
     </w:p>
     <w:p>
@@ -2706,7 +2706,7 @@
           <w:sz w:val="24"/>
           <w:szCs w:val="24"/>
         </w:rPr>
-        <w:t xml:space="preserve">(1). https://doi.org/10.1086/733433</w:t>
+        <w:t xml:space="preserve">. https://doi.org/10.1086/733433</w:t>
       </w:r>
     </w:p>
     <w:p>

</xml_diff>

<commit_message>
Expand chapter 2: sources framing and teshuvah subsection with anti-labeling principle
Co-Authored-By: Claude Fable 5 <noreply@anthropic.com>
Claude-Session: https://claude.ai/code/session_01YWm2c58o2zGAStwTniimJp
</commit_message>
<xml_diff>
--- a/seminar-paper/עבריינות נשים מהמקרא ועד ימינו - עבודה סמינריונית.docx
+++ b/seminar-paper/עבריינות נשים מהמקרא ועד ימינו - עבודה סמינריונית.docx
@@ -665,6 +665,22 @@
     </w:p>
     <w:p>
       <w:pPr>
+        <w:bidi/>
+        <w:spacing w:after="160" w:before="0" w:line="360"/>
+        <w:jc w:val="both"/>
+      </w:pPr>
+      <w:r>
+        <w:rPr>
+          <w:rFonts w:ascii="David" w:cs="David" w:eastAsia="David" w:hAnsi="David"/>
+          <w:sz w:val="24"/>
+          <w:szCs w:val="24"/>
+          <w:rtl/>
+        </w:rPr>
+        <w:t xml:space="preserve">קודם לדיון גופו נדרשת הערה על המקורות. "היהדות" הנדונה בפרק זה אינה מקשה אחת אלא שכבות של ספרות המשתרעות מן המקרא, דרך המשנה והתלמוד, ועד ספרות ההלכה והמחשבה של ימי הביניים ואילך. קריאה קרימינולוגית של מקורות אלה אינה מתיימרת לקבוע מה "אומרת היהדות" באופן אחיד, אלא לחלץ מן הרבדים השונים תפיסות עקביות של האישה, העבירה והתגובה לה, ברוח המתודה של הקרימינולוגיה הרוחנית היהודית (בן יאיר, 2021). הפרק נע אפוא מן העיקרון המשפטי אל התפיסה הנפשית, ממנה אל הסדר החברתי, ומשם אל הדמויות והמנגנונים הקונקרטיים.</w:t>
+      </w:r>
+    </w:p>
+    <w:p>
+      <w:pPr>
         <w:pStyle w:val="Heading2"/>
         <w:bidi/>
         <w:spacing w:after="120" w:before="240" w:line="360"/>
@@ -925,18 +941,70 @@
     </w:p>
     <w:p>
       <w:pPr>
-        <w:bidi/>
-        <w:spacing w:after="160" w:before="0" w:line="360"/>
-        <w:jc w:val="both"/>
-      </w:pPr>
-      <w:r>
-        <w:rPr>
-          <w:rFonts w:ascii="David" w:cs="David" w:eastAsia="David" w:hAnsi="David"/>
-          <w:sz w:val="24"/>
-          <w:szCs w:val="24"/>
-          <w:rtl/>
-        </w:rPr>
-        <w:t xml:space="preserve">לסיכום הפרק: היהדות מסבירה את מיעוט העבריינות הנשית לא בנחיתות או בחולשה של האישה, אלא במשולב: אחריות מוסרית מלאה, ייחוס כושר שיפוט מוסרי גבוה ("בינה יתרה"), ומבנה חיים חברתי-משפחתי המרחיק את האישה מזירות העבירה ועוטף אותה בפיקוח בלתי פורמלי צפוף. בה בעת שימרה המסורת מודעות לפגיעות מצבית וקבעה מנגנוני הגנה והרתעה ייחודיים. עמדה משולבת זו תשמש בסיס להשוואה עם הגישות הקרימינולוגיות שיוצגו כעת.</w:t>
+        <w:pStyle w:val="Heading2"/>
+        <w:bidi/>
+        <w:spacing w:after="120" w:before="240" w:line="360"/>
+        <w:jc w:val="right"/>
+      </w:pPr>
+      <w:r>
+        <w:rPr>
+          <w:rFonts w:ascii="David" w:cs="David" w:eastAsia="David" w:hAnsi="David"/>
+          <w:b/>
+          <w:bCs/>
+          <w:color w:val="000000"/>
+          <w:sz w:val="26"/>
+          <w:szCs w:val="26"/>
+          <w:rtl/>
+        </w:rPr>
+        <w:t xml:space="preserve">2.6 תשובה ותיקון: המענה ההלכתי לעבירה</w:t>
+      </w:r>
+    </w:p>
+    <w:p>
+      <w:pPr>
+        <w:bidi/>
+        <w:spacing w:after="160" w:before="0" w:line="360"/>
+        <w:jc w:val="both"/>
+      </w:pPr>
+      <w:r>
+        <w:rPr>
+          <w:rFonts w:ascii="David" w:cs="David" w:eastAsia="David" w:hAnsi="David"/>
+          <w:sz w:val="24"/>
+          <w:szCs w:val="24"/>
+          <w:rtl/>
+        </w:rPr>
+        <w:t xml:space="preserve">המענה ההלכתי לעבירה אינו מתמצה בענישה. במרכזו עומד מוסד התשובה, מסלול מובנה של שיבה מן החטא הכולל עזיבת החטא, חרטה, וידוי וקבלה לעתיד (רמב"ם, הלכות תשובה ב, ב), שבסופו זוכה השבה למעמד מוסרי מלא: "מקום שבעלי תשובה עומדין, צדיקים גמורים אינם עומדין" (ברכות לד ע"ב). בן יאיר (Ben Yair, 2021) מיפה את הכלים הללו, תשובה, וידוי, תיקון המידות, לימוד וקהילה, והראה את הלימתם לפרקטיקות שיקום מבוססות-ראיות בקרימינולוגיה בת-זמננו. לענייננו חשובה העובדה שהמסלול פתוח לנשים בדיוק כמו לגברים, כנגזרת ישירה של עקרון השוויון באחריות שנדון בפתח הפרק: האחריות המלאה על העבירה היא גם הזכות המלאה לתקנה.</w:t>
+      </w:r>
+    </w:p>
+    <w:p>
+      <w:pPr>
+        <w:bidi/>
+        <w:spacing w:after="160" w:before="0" w:line="360"/>
+        <w:jc w:val="both"/>
+      </w:pPr>
+      <w:r>
+        <w:rPr>
+          <w:rFonts w:ascii="David" w:cs="David" w:eastAsia="David" w:hAnsi="David"/>
+          <w:sz w:val="24"/>
+          <w:szCs w:val="24"/>
+          <w:rtl/>
+        </w:rPr>
+        <w:t xml:space="preserve">שני יסודות במוסד התשובה ראויים להדגשה קרימינולוגית. הראשון הוא איסור הזכרת העבר: "אם היה בעל תשובה, אל יאמר לו זכור מעשיך הראשונים" (בבא מציעא נח ע"ב). ההלכה זיהתה כאן, אלפי שנים לפני תיאוריית התיוג, כי הדבקת עברו של אדם בו לאחר שתיקן היא פגיעה האסורה כשלעצמה, וכי היא מסכלת את השיבה לחברה. השני הוא ההשתלבות מחדש כמעשה קהילתי: חז"ל דרשו את רחב, המוצגת במקרא כזונה ביריחו (יהושע ב), כמי שנתגיירה ונישאה בישראל (מגילה יד ע"ב), סיפור של קליטה מלאה של אישה מן השוליים אל לב הקהילה. שני היסודות הללו מקבילים במדויק לממצאי ספרות החדילה הנשית שיידונו בפרק הרביעי: יציאה מעבריינות נשענת על קשרים, על קהילה קולטת ועל זהות חדשה שאינה מוכתמת בעבר.</w:t>
+      </w:r>
+    </w:p>
+    <w:p>
+      <w:pPr>
+        <w:bidi/>
+        <w:spacing w:after="160" w:before="0" w:line="360"/>
+        <w:jc w:val="both"/>
+      </w:pPr>
+      <w:r>
+        <w:rPr>
+          <w:rFonts w:ascii="David" w:cs="David" w:eastAsia="David" w:hAnsi="David"/>
+          <w:sz w:val="24"/>
+          <w:szCs w:val="24"/>
+          <w:rtl/>
+        </w:rPr>
+        <w:t xml:space="preserve">לסיכום הפרק: היהדות מסבירה את מיעוט העבריינות הנשית לא בנחיתות או בחולשה של האישה, אלא במשולב: אחריות מוסרית מלאה, ייחוס כושר שיפוט מוסרי גבוה ("בינה יתרה"), ומבנה חיים חברתי-משפחתי המרחיק את האישה מזירות העבירה ועוטף אותה בפיקוח בלתי פורמלי צפוף. בה בעת שימרה המסורת מודעות לפגיעות מצבית, קבעה מנגנוני הגנה והרתעה ייחודיים, והעמידה לצד כל אלה מסלול תשובה ותיקון הפתוח לנשים ולגברים כאחד. עמדה משולבת זו תשמש בסיס להשוואה עם הגישות הקרימינולוגיות שיוצגו כעת.</w:t>
       </w:r>
     </w:p>
     <w:p>

</xml_diff>

<commit_message>
Align religion-crime claims with Adamczyk et al. full text (applied)
Co-Authored-By: Claude Fable 5 <noreply@anthropic.com>
Claude-Session: https://claude.ai/code/session_01YWm2c58o2zGAStwTniimJp
</commit_message>
<xml_diff>
--- a/seminar-paper/עבריינות נשים מהמקרא ועד ימינו - עבודה סמינריונית.docx
+++ b/seminar-paper/עבריינות נשים מהמקרא ועד ימינו - עבודה סמינריונית.docx
@@ -1341,7 +1341,7 @@
           <w:szCs w:val="24"/>
           <w:rtl/>
         </w:rPr>
-        <w:t xml:space="preserve">לבסוף, זרם מחקרי רלוונטי במיוחד לעבודה זו הוא חקר הקשר שבין דת לעבריינות. מאז "השערת אש הגיהינום" של הירשי וסטארק (Hirschi &amp; Stark, 1969, כפי שמצוטט אצל Adamczyk et al., 2017) הצטברו עדויות לכך שדתיות (אמונה, תפילה והשתייכות קהילתית) מתואמת עם רמות נמוכות של עבריינות ושימוש בסמים, בעיקר באמצעות חיזוק הפיקוח הבלתי פורמלי, הקשרים החברתיים והפנמת נורמות (Adamczyk et al., 2017). על בסיס זה צמחו הקרימינולוגיה החיובית, המדגישה גורמי חוסן, שילוב חברתי וחוויות מתקנות, והקרימינולוגיה הרוחנית היהודית של בן יאיר, המציעה מודל שבמרכזו המעבר מאגוצנטריות, שורש העבריינות, לאלטרצנטריות, חיים שמרכזם מחוץ לאני (בן יאיר, 2021; Ben Yair, 2021). מודלים אלה מספקים את הגשר התיאורטי שבין שני חלקי ההשוואה בעבודה זו.</w:t>
+        <w:t xml:space="preserve">לבסוף, זרם מחקרי רלוונטי במיוחד לעבודה זו הוא חקר הקשר שבין דת לעבריינות. מאז מחקר "השערת אש הגיהינום" של הירשי וסטארק, שבו דווקא לא נמצא קשר בין דתיות לעבריינות (Hirschi &amp; Stark, 1969, כפי שמצוטט אצל Adamczyk et al., 2017), הצטברו עדויות לכך שדתיות (אמונה, תפילה והשתייכות קהילתית) מתואמת עם רמות נמוכות של עבריינות ושימוש בסמים, בעיקר באמצעות חיזוק הפיקוח הבלתי פורמלי, הקשרים החברתיים והפנמת נורמות (Adamczyk et al., 2017). על בסיס זה צמחו הקרימינולוגיה החיובית, המדגישה גורמי חוסן, שילוב חברתי וחוויות מתקנות, והקרימינולוגיה הרוחנית היהודית של בן יאיר, המציעה מודל שבמרכזו המעבר מאגוצנטריות, שורש העבריינות, לאלטרצנטריות, חיים שמרכזם מחוץ לאני (בן יאיר, 2021; Ben Yair, 2021). מודלים אלה מספקים את הגשר התיאורטי שבין שני חלקי ההשוואה בעבודה זו.</w:t>
       </w:r>
     </w:p>
     <w:p>
@@ -1618,7 +1618,7 @@
           <w:szCs w:val="24"/>
           <w:rtl/>
         </w:rPr>
-        <w:t xml:space="preserve">אדמצ'יק ועמיתיה (Adamczyk et al., 2017) ערכו סקירה שיטתית של עשרות רבות של מחקרים על הקשר שבין דת לעבריינות. התמונה המצרפית עקבית: רובם המכריע של המחקרים מוצא קשר שלילי בין דתיות לבין עבריינות וסטייה, והאפקט בולט במיוחד בעבירות סמים ואלכוהול ובקרב בני נוער. המנגנונים המתועדים (פיקוח חברתי קהילתי, רשתות תמיכה, הפנמת נורמות ומשמעות קיומית) הם בדיוק המנגנונים שזוהו לעיל כמסבירי הפער המגדרי. במחקרים רבים נמצא האפקט המגן של דתיות חזק יותר אצל נשים, המדווחות בעקביות על רמות דתיות גבוהות משל גברים, ממצא שההשלכה התיאורטית שלו תידון בפרק הבא.</w:t>
+        <w:t xml:space="preserve">אדמצ'יק ועמיתיה (Adamczyk et al., 2017) ערכו סקירה שיטתית של עשרות רבות של מחקרים על הקשר שבין דת לעבריינות. התמונה המצרפית עקבית: רובם המכריע של המחקרים מוצא קשר שלילי בין דתיות לבין עבריינות וסטייה, והאפקט בולט במיוחד בעבירות סמים ואלכוהול ובקרב בני נוער. הפרספקטיבות התיאורטיות הרווחות בספרות זו, אפקט הקהילה המוסרית, הפיקוח החברתי והלמידה החברתית, הן בדיוק המנגנונים שזוהו לעיל כמסבירי הפער המגדרי. השלכתם של ממצאים אלה על ההשוואה שבין היהדות לקרימינולוגיה תידון בפרק החמישי.</w:t>
       </w:r>
     </w:p>
     <w:p>
@@ -1843,7 +1843,7 @@
           <w:szCs w:val="24"/>
           <w:rtl/>
         </w:rPr>
-        <w:t xml:space="preserve">המתח השלישי הוא אמפירי: אם צדקה הקריאה ההלכתית, היה מקום לצפות שבחברות דתיות הפער המגדרי יהיה גדול במיוחד, ואכן ממצאי הסקירה השיטתית של אדמצ'יק ועמיתיה (Adamczyk et al., 2017) תומכים בכיוון זה, וממצאיהם של סבולאינן ועמיתיו (Savolainen et al., 2017), שלפיהם הפער המגדרי רחב יותר במדינות פטריארכליות, מוסיפים לכך תמיכה ישירה ברמה הבין-לאומית. אולם ממצאי אסטרדה ועמיתיו (Estrada et al., 2016) מזכירים כי הצטמצמות הפער במערב אינה סיפור של שחרור אלא של שוליים חברתיים; ההשלכה המטרידה היא שגם היחלשות המסגרות המסורתיות אינה מבטיחה שוויון מיטיב, אלא עלולה להפקיר נשים מוחלשות לסיכונים כפולים, לקורבנות ולהפללה גם יחד.</w:t>
+        <w:t xml:space="preserve">המתח השלישי הוא אמפירי: אם צדקה הקריאה ההלכתית, היה מקום לצפות שבחברות דתיות העבריינות תהיה נמוכה יותר והפער המגדרי גדול יותר. ממצאי הסקירה השיטתית של אדמצ'יק ועמיתיה (Adamczyk et al., 2017) תומכים ביסוד הראשון, שכן רובם המכריע של המחקרים מוצא שדתיות מרסנת עבריינות; וממצאיהם של סבולאינן ועמיתיו (Savolainen et al., 2017), שלפיהם הפער המגדרי רחב יותר במדינות פטריארכליות ושמרניות, תומכים ביסוד השני ברמה הבין-לאומית. אולם ממצאי אסטרדה ועמיתיו (Estrada et al., 2016) מזכירים כי הצטמצמות הפער במערב אינה סיפור של שחרור אלא של שוליים חברתיים; ההשלכה המטרידה היא שגם היחלשות המסגרות המסורתיות אינה מבטיחה שוויון מיטיב, אלא עלולה להפקיר נשים מוחלשות לסיכונים כפולים, לקורבנות ולהפללה גם יחד.</w:t>
       </w:r>
     </w:p>
     <w:p>

</xml_diff>